<commit_message>
fixed branch and added report
</commit_message>
<xml_diff>
--- a/report/rapport.docx
+++ b/report/rapport.docx
@@ -15,7 +15,7 @@
         <w:pStyle w:val="Author"/>
       </w:pPr>
       <w:r>
-        <w:t xml:space="preserve">Grupp</w:t>
+        <w:t xml:space="preserve">Grupp 2</w:t>
       </w:r>
     </w:p>
     <w:p>
@@ -35,7 +35,4628 @@
         <w:t xml:space="preserve">Introduktion till datan</w:t>
       </w:r>
     </w:p>
+    <w:p>
+      <w:pPr>
+        <w:pStyle w:val="FirstParagraph"/>
+      </w:pPr>
+      <w:r>
+        <w:t xml:space="preserve">Målet med denna analys är att vägleda beslutsfattande utifrån försäljningsdata från orter runt om i Sverige.Datan bestod av 1000 unika beställningar från 255 kunder, inklusive privatpersoner, företag och småföretag.</w:t>
+      </w:r>
+    </w:p>
     <w:bookmarkEnd w:id="20"/>
+    <w:bookmarkStart w:id="21" w:name="vad-ni-kom-fram-till"/>
+    <w:p>
+      <w:pPr>
+        <w:pStyle w:val="Heading1"/>
+      </w:pPr>
+      <w:r>
+        <w:t xml:space="preserve">Vad ni kom fram till</w:t>
+      </w:r>
+    </w:p>
+    <w:tbl xmlns:w="http://schemas.openxmlformats.org/wordprocessingml/2006/main" xmlns:r="http://schemas.openxmlformats.org/officeDocument/2006/relationships" xmlns:w14="http://schemas.microsoft.com/office/word/2010/wordml" xmlns:wp="http://schemas.openxmlformats.org/drawingml/2006/wordprocessingDrawing" xmlns:a="http://schemas.openxmlformats.org/drawingml/2006/main" xmlns:pic="http://schemas.openxmlformats.org/drawingml/2006/picture">
+      <w:tblPr>
+        <w:tblLayout w:type="fixed"/>
+        <w:jc w:val="center"/>
+        <w:tblLook w:firstRow="1" w:lastRow="0" w:firstColumn="0" w:lastColumn="0" w:noHBand="0" w:noVBand="1"/>
+      </w:tblPr>
+      <w:tblGrid>
+        <w:gridCol w:w="2111"/>
+        <w:gridCol w:w="1451"/>
+        <w:gridCol w:w="1768"/>
+        <w:gridCol w:w="1512"/>
+        <w:gridCol w:w="1034"/>
+      </w:tblGrid>
+      <w:tr>
+        <w:trPr>
+          <w:trHeight w:val="614" w:hRule="auto"/>
+          <w:tblHeader/>
+        </w:trPr>
+        <w:tc>
+          <w:tcPr>
+            <w:tcBorders>
+              <w:bottom w:val="single" w:sz="12" w:space="0" w:color="666666"/>
+              <w:top w:val="single" w:sz="12" w:space="0" w:color="666666"/>
+              <w:left w:val="none" w:sz="0" w:space="0" w:color="000000"/>
+              <w:right w:val="none" w:sz="0" w:space="0" w:color="000000"/>
+            </w:tcBorders>
+            <w:shd w:val="clear" w:color="auto" w:fill="FFFFFF"/>
+            <w:tcMar>
+              <w:top w:w="0" w:type="dxa"/>
+              <w:bottom w:w="0" w:type="dxa"/>
+              <w:left w:w="0" w:type="dxa"/>
+              <w:right w:w="0" w:type="dxa"/>
+            </w:tcMar>
+            <w:vAlign w:val="center"/>
+          </w:tcPr>
+          <w:p>
+            <w:pPr>
+              <w:jc w:val="left"/>
+              <w:pBdr>
+                <w:bottom w:val="none" w:sz="0" w:space="0" w:color="000000"/>
+                <w:top w:val="none" w:sz="0" w:space="0" w:color="000000"/>
+                <w:left w:val="none" w:sz="0" w:space="0" w:color="000000"/>
+                <w:right w:val="none" w:sz="0" w:space="0" w:color="000000"/>
+              </w:pBdr>
+              <w:spacing w:after="100" w:before="100" w:line="240"/>
+              <w:ind w:left="100" w:right="100" w:firstLine="0" w:firstLineChars="0"/>
+              <w:rPr>
+                <w:rFonts w:ascii="Arial" w:hAnsi="Arial" w:eastAsia="Arial" w:cs="Arial"/>
+                <w:i w:val="false"/>
+                <w:b w:val="true"/>
+                <w:u w:val="none"/>
+                <w:strike w:val="false"/>
+                <w:sz w:val="22"/>
+                <w:szCs w:val="22"/>
+                <w:color w:val="000000"/>
+              </w:rPr>
+            </w:pPr>
+            <w:r xmlns:w="http://schemas.openxmlformats.org/wordprocessingml/2006/main" xmlns:wp="http://schemas.openxmlformats.org/drawingml/2006/wordprocessingDrawing" xmlns:r="http://schemas.openxmlformats.org/officeDocument/2006/relationships" xmlns:w14="http://schemas.microsoft.com/office/word/2010/wordml">
+              <w:rPr>
+                <w:rFonts w:ascii="Arial" w:hAnsi="Arial" w:eastAsia="Arial" w:cs="Arial"/>
+                <w:i w:val="false"/>
+                <w:b w:val="true"/>
+                <w:u w:val="none"/>
+                <w:strike w:val="false"/>
+                <w:sz w:val="22"/>
+                <w:szCs w:val="22"/>
+                <w:color w:val="000000"/>
+              </w:rPr>
+              <w:t xml:space="preserve">product_category</w:t>
+            </w:r>
+          </w:p>
+        </w:tc>
+        <w:tc>
+          <w:tcPr>
+            <w:tcBorders>
+              <w:bottom w:val="single" w:sz="12" w:space="0" w:color="666666"/>
+              <w:top w:val="single" w:sz="12" w:space="0" w:color="666666"/>
+              <w:left w:val="none" w:sz="0" w:space="0" w:color="000000"/>
+              <w:right w:val="none" w:sz="0" w:space="0" w:color="000000"/>
+            </w:tcBorders>
+            <w:shd w:val="clear" w:color="auto" w:fill="FFFFFF"/>
+            <w:tcMar>
+              <w:top w:w="0" w:type="dxa"/>
+              <w:bottom w:w="0" w:type="dxa"/>
+              <w:left w:w="0" w:type="dxa"/>
+              <w:right w:w="0" w:type="dxa"/>
+            </w:tcMar>
+            <w:vAlign w:val="center"/>
+          </w:tcPr>
+          <w:p>
+            <w:pPr>
+              <w:jc w:val="right"/>
+              <w:pBdr>
+                <w:bottom w:val="none" w:sz="0" w:space="0" w:color="000000"/>
+                <w:top w:val="none" w:sz="0" w:space="0" w:color="000000"/>
+                <w:left w:val="none" w:sz="0" w:space="0" w:color="000000"/>
+                <w:right w:val="none" w:sz="0" w:space="0" w:color="000000"/>
+              </w:pBdr>
+              <w:spacing w:after="100" w:before="100" w:line="240"/>
+              <w:ind w:left="100" w:right="100" w:firstLine="0" w:firstLineChars="0"/>
+              <w:rPr>
+                <w:rFonts w:ascii="Arial" w:hAnsi="Arial" w:eastAsia="Arial" w:cs="Arial"/>
+                <w:i w:val="false"/>
+                <w:b w:val="true"/>
+                <w:u w:val="none"/>
+                <w:strike w:val="false"/>
+                <w:sz w:val="22"/>
+                <w:szCs w:val="22"/>
+                <w:color w:val="000000"/>
+              </w:rPr>
+            </w:pPr>
+            <w:r xmlns:w="http://schemas.openxmlformats.org/wordprocessingml/2006/main" xmlns:wp="http://schemas.openxmlformats.org/drawingml/2006/wordprocessingDrawing" xmlns:r="http://schemas.openxmlformats.org/officeDocument/2006/relationships" xmlns:w14="http://schemas.microsoft.com/office/word/2010/wordml">
+              <w:rPr>
+                <w:rFonts w:ascii="Arial" w:hAnsi="Arial" w:eastAsia="Arial" w:cs="Arial"/>
+                <w:i w:val="false"/>
+                <w:b w:val="true"/>
+                <w:u w:val="none"/>
+                <w:strike w:val="false"/>
+                <w:sz w:val="22"/>
+                <w:szCs w:val="22"/>
+                <w:color w:val="000000"/>
+              </w:rPr>
+              <w:t xml:space="preserve">avg_order</w:t>
+            </w:r>
+          </w:p>
+        </w:tc>
+        <w:tc>
+          <w:tcPr>
+            <w:tcBorders>
+              <w:bottom w:val="single" w:sz="12" w:space="0" w:color="666666"/>
+              <w:top w:val="single" w:sz="12" w:space="0" w:color="666666"/>
+              <w:left w:val="none" w:sz="0" w:space="0" w:color="000000"/>
+              <w:right w:val="none" w:sz="0" w:space="0" w:color="000000"/>
+            </w:tcBorders>
+            <w:shd w:val="clear" w:color="auto" w:fill="FFFFFF"/>
+            <w:tcMar>
+              <w:top w:w="0" w:type="dxa"/>
+              <w:bottom w:w="0" w:type="dxa"/>
+              <w:left w:w="0" w:type="dxa"/>
+              <w:right w:w="0" w:type="dxa"/>
+            </w:tcMar>
+            <w:vAlign w:val="center"/>
+          </w:tcPr>
+          <w:p>
+            <w:pPr>
+              <w:jc w:val="right"/>
+              <w:pBdr>
+                <w:bottom w:val="none" w:sz="0" w:space="0" w:color="000000"/>
+                <w:top w:val="none" w:sz="0" w:space="0" w:color="000000"/>
+                <w:left w:val="none" w:sz="0" w:space="0" w:color="000000"/>
+                <w:right w:val="none" w:sz="0" w:space="0" w:color="000000"/>
+              </w:pBdr>
+              <w:spacing w:after="100" w:before="100" w:line="240"/>
+              <w:ind w:left="100" w:right="100" w:firstLine="0" w:firstLineChars="0"/>
+              <w:rPr>
+                <w:rFonts w:ascii="Arial" w:hAnsi="Arial" w:eastAsia="Arial" w:cs="Arial"/>
+                <w:i w:val="false"/>
+                <w:b w:val="true"/>
+                <w:u w:val="none"/>
+                <w:strike w:val="false"/>
+                <w:sz w:val="22"/>
+                <w:szCs w:val="22"/>
+                <w:color w:val="000000"/>
+              </w:rPr>
+            </w:pPr>
+            <w:r xmlns:w="http://schemas.openxmlformats.org/wordprocessingml/2006/main" xmlns:wp="http://schemas.openxmlformats.org/drawingml/2006/wordprocessingDrawing" xmlns:r="http://schemas.openxmlformats.org/officeDocument/2006/relationships" xmlns:w14="http://schemas.microsoft.com/office/word/2010/wordml">
+              <w:rPr>
+                <w:rFonts w:ascii="Arial" w:hAnsi="Arial" w:eastAsia="Arial" w:cs="Arial"/>
+                <w:i w:val="false"/>
+                <w:b w:val="true"/>
+                <w:u w:val="none"/>
+                <w:strike w:val="false"/>
+                <w:sz w:val="22"/>
+                <w:szCs w:val="22"/>
+                <w:color w:val="000000"/>
+              </w:rPr>
+              <w:t xml:space="preserve">median_order</w:t>
+            </w:r>
+          </w:p>
+        </w:tc>
+        <w:tc>
+          <w:tcPr>
+            <w:tcBorders>
+              <w:bottom w:val="single" w:sz="12" w:space="0" w:color="666666"/>
+              <w:top w:val="single" w:sz="12" w:space="0" w:color="666666"/>
+              <w:left w:val="none" w:sz="0" w:space="0" w:color="000000"/>
+              <w:right w:val="none" w:sz="0" w:space="0" w:color="000000"/>
+            </w:tcBorders>
+            <w:shd w:val="clear" w:color="auto" w:fill="FFFFFF"/>
+            <w:tcMar>
+              <w:top w:w="0" w:type="dxa"/>
+              <w:bottom w:w="0" w:type="dxa"/>
+              <w:left w:w="0" w:type="dxa"/>
+              <w:right w:w="0" w:type="dxa"/>
+            </w:tcMar>
+            <w:vAlign w:val="center"/>
+          </w:tcPr>
+          <w:p>
+            <w:pPr>
+              <w:jc w:val="right"/>
+              <w:pBdr>
+                <w:bottom w:val="none" w:sz="0" w:space="0" w:color="000000"/>
+                <w:top w:val="none" w:sz="0" w:space="0" w:color="000000"/>
+                <w:left w:val="none" w:sz="0" w:space="0" w:color="000000"/>
+                <w:right w:val="none" w:sz="0" w:space="0" w:color="000000"/>
+              </w:pBdr>
+              <w:spacing w:after="100" w:before="100" w:line="240"/>
+              <w:ind w:left="100" w:right="100" w:firstLine="0" w:firstLineChars="0"/>
+              <w:rPr>
+                <w:rFonts w:ascii="Arial" w:hAnsi="Arial" w:eastAsia="Arial" w:cs="Arial"/>
+                <w:i w:val="false"/>
+                <w:b w:val="true"/>
+                <w:u w:val="none"/>
+                <w:strike w:val="false"/>
+                <w:sz w:val="22"/>
+                <w:szCs w:val="22"/>
+                <w:color w:val="000000"/>
+              </w:rPr>
+            </w:pPr>
+            <w:r xmlns:w="http://schemas.openxmlformats.org/wordprocessingml/2006/main" xmlns:wp="http://schemas.openxmlformats.org/drawingml/2006/wordprocessingDrawing" xmlns:r="http://schemas.openxmlformats.org/officeDocument/2006/relationships" xmlns:w14="http://schemas.microsoft.com/office/word/2010/wordml">
+              <w:rPr>
+                <w:rFonts w:ascii="Arial" w:hAnsi="Arial" w:eastAsia="Arial" w:cs="Arial"/>
+                <w:i w:val="false"/>
+                <w:b w:val="true"/>
+                <w:u w:val="none"/>
+                <w:strike w:val="false"/>
+                <w:sz w:val="22"/>
+                <w:szCs w:val="22"/>
+                <w:color w:val="000000"/>
+              </w:rPr>
+              <w:t xml:space="preserve">total_sales</w:t>
+            </w:r>
+          </w:p>
+        </w:tc>
+        <w:tc>
+          <w:tcPr>
+            <w:tcBorders>
+              <w:bottom w:val="single" w:sz="12" w:space="0" w:color="666666"/>
+              <w:top w:val="single" w:sz="12" w:space="0" w:color="666666"/>
+              <w:left w:val="none" w:sz="0" w:space="0" w:color="000000"/>
+              <w:right w:val="none" w:sz="0" w:space="0" w:color="000000"/>
+            </w:tcBorders>
+            <w:shd w:val="clear" w:color="auto" w:fill="FFFFFF"/>
+            <w:tcMar>
+              <w:top w:w="0" w:type="dxa"/>
+              <w:bottom w:w="0" w:type="dxa"/>
+              <w:left w:w="0" w:type="dxa"/>
+              <w:right w:w="0" w:type="dxa"/>
+            </w:tcMar>
+            <w:vAlign w:val="center"/>
+          </w:tcPr>
+          <w:p>
+            <w:pPr>
+              <w:jc w:val="right"/>
+              <w:pBdr>
+                <w:bottom w:val="none" w:sz="0" w:space="0" w:color="000000"/>
+                <w:top w:val="none" w:sz="0" w:space="0" w:color="000000"/>
+                <w:left w:val="none" w:sz="0" w:space="0" w:color="000000"/>
+                <w:right w:val="none" w:sz="0" w:space="0" w:color="000000"/>
+              </w:pBdr>
+              <w:spacing w:after="100" w:before="100" w:line="240"/>
+              <w:ind w:left="100" w:right="100" w:firstLine="0" w:firstLineChars="0"/>
+              <w:rPr>
+                <w:rFonts w:ascii="Arial" w:hAnsi="Arial" w:eastAsia="Arial" w:cs="Arial"/>
+                <w:i w:val="false"/>
+                <w:b w:val="true"/>
+                <w:u w:val="none"/>
+                <w:strike w:val="false"/>
+                <w:sz w:val="22"/>
+                <w:szCs w:val="22"/>
+                <w:color w:val="000000"/>
+              </w:rPr>
+            </w:pPr>
+            <w:r xmlns:w="http://schemas.openxmlformats.org/wordprocessingml/2006/main" xmlns:wp="http://schemas.openxmlformats.org/drawingml/2006/wordprocessingDrawing" xmlns:r="http://schemas.openxmlformats.org/officeDocument/2006/relationships" xmlns:w14="http://schemas.microsoft.com/office/word/2010/wordml">
+              <w:rPr>
+                <w:rFonts w:ascii="Arial" w:hAnsi="Arial" w:eastAsia="Arial" w:cs="Arial"/>
+                <w:i w:val="false"/>
+                <w:b w:val="true"/>
+                <w:u w:val="none"/>
+                <w:strike w:val="false"/>
+                <w:sz w:val="22"/>
+                <w:szCs w:val="22"/>
+                <w:color w:val="000000"/>
+              </w:rPr>
+              <w:t xml:space="preserve">orders</w:t>
+            </w:r>
+          </w:p>
+        </w:tc>
+      </w:tr>
+      <w:tr>
+        <w:trPr>
+          <w:trHeight w:val="600" w:hRule="auto"/>
+        </w:trPr>
+        <w:tc>
+          <w:tcPr>
+            <w:tcBorders>
+              <w:bottom w:val="single" w:sz="6" w:space="0" w:color="666666"/>
+              <w:top w:val="single" w:sz="12" w:space="0" w:color="666666"/>
+              <w:left w:val="none" w:sz="0" w:space="0" w:color="000000"/>
+              <w:right w:val="none" w:sz="0" w:space="0" w:color="000000"/>
+            </w:tcBorders>
+            <w:shd w:val="clear" w:color="auto" w:fill="FFFFFF"/>
+            <w:tcMar>
+              <w:top w:w="0" w:type="dxa"/>
+              <w:bottom w:w="0" w:type="dxa"/>
+              <w:left w:w="0" w:type="dxa"/>
+              <w:right w:w="0" w:type="dxa"/>
+            </w:tcMar>
+            <w:vAlign w:val="center"/>
+          </w:tcPr>
+          <w:p>
+            <w:pPr>
+              <w:jc w:val="left"/>
+              <w:pBdr>
+                <w:bottom w:val="none" w:sz="0" w:space="0" w:color="000000"/>
+                <w:top w:val="none" w:sz="0" w:space="0" w:color="000000"/>
+                <w:left w:val="none" w:sz="0" w:space="0" w:color="000000"/>
+                <w:right w:val="none" w:sz="0" w:space="0" w:color="000000"/>
+              </w:pBdr>
+              <w:spacing w:after="100" w:before="100" w:line="240"/>
+              <w:ind w:left="100" w:right="100" w:firstLine="0" w:firstLineChars="0"/>
+              <w:rPr>
+                <w:rFonts w:ascii="Arial" w:hAnsi="Arial" w:eastAsia="Arial" w:cs="Arial"/>
+                <w:i w:val="false"/>
+                <w:b w:val="false"/>
+                <w:u w:val="none"/>
+                <w:strike w:val="false"/>
+                <w:sz w:val="22"/>
+                <w:szCs w:val="22"/>
+                <w:color w:val="000000"/>
+              </w:rPr>
+            </w:pPr>
+            <w:r xmlns:w="http://schemas.openxmlformats.org/wordprocessingml/2006/main" xmlns:wp="http://schemas.openxmlformats.org/drawingml/2006/wordprocessingDrawing" xmlns:r="http://schemas.openxmlformats.org/officeDocument/2006/relationships" xmlns:w14="http://schemas.microsoft.com/office/word/2010/wordml">
+              <w:rPr>
+                <w:rFonts w:ascii="Arial" w:hAnsi="Arial" w:eastAsia="Arial" w:cs="Arial"/>
+                <w:i w:val="false"/>
+                <w:b w:val="false"/>
+                <w:u w:val="none"/>
+                <w:strike w:val="false"/>
+                <w:sz w:val="22"/>
+                <w:szCs w:val="22"/>
+                <w:color w:val="000000"/>
+              </w:rPr>
+              <w:t xml:space="preserve">Electronics</w:t>
+            </w:r>
+          </w:p>
+        </w:tc>
+        <w:tc>
+          <w:tcPr>
+            <w:tcBorders>
+              <w:bottom w:val="single" w:sz="6" w:space="0" w:color="666666"/>
+              <w:top w:val="single" w:sz="12" w:space="0" w:color="666666"/>
+              <w:left w:val="none" w:sz="0" w:space="0" w:color="000000"/>
+              <w:right w:val="none" w:sz="0" w:space="0" w:color="000000"/>
+            </w:tcBorders>
+            <w:shd w:val="clear" w:color="auto" w:fill="FFFFFF"/>
+            <w:tcMar>
+              <w:top w:w="0" w:type="dxa"/>
+              <w:bottom w:w="0" w:type="dxa"/>
+              <w:left w:w="0" w:type="dxa"/>
+              <w:right w:w="0" w:type="dxa"/>
+            </w:tcMar>
+            <w:vAlign w:val="center"/>
+          </w:tcPr>
+          <w:p>
+            <w:pPr>
+              <w:jc w:val="right"/>
+              <w:pBdr>
+                <w:bottom w:val="none" w:sz="0" w:space="0" w:color="000000"/>
+                <w:top w:val="none" w:sz="0" w:space="0" w:color="000000"/>
+                <w:left w:val="none" w:sz="0" w:space="0" w:color="000000"/>
+                <w:right w:val="none" w:sz="0" w:space="0" w:color="000000"/>
+              </w:pBdr>
+              <w:spacing w:after="100" w:before="100" w:line="240"/>
+              <w:ind w:left="100" w:right="100" w:firstLine="0" w:firstLineChars="0"/>
+              <w:rPr>
+                <w:rFonts w:ascii="Arial" w:hAnsi="Arial" w:eastAsia="Arial" w:cs="Arial"/>
+                <w:i w:val="false"/>
+                <w:b w:val="false"/>
+                <w:u w:val="none"/>
+                <w:strike w:val="false"/>
+                <w:sz w:val="22"/>
+                <w:szCs w:val="22"/>
+                <w:color w:val="000000"/>
+              </w:rPr>
+            </w:pPr>
+            <w:r xmlns:w="http://schemas.openxmlformats.org/wordprocessingml/2006/main" xmlns:wp="http://schemas.openxmlformats.org/drawingml/2006/wordprocessingDrawing" xmlns:r="http://schemas.openxmlformats.org/officeDocument/2006/relationships" xmlns:w14="http://schemas.microsoft.com/office/word/2010/wordml">
+              <w:rPr>
+                <w:rFonts w:ascii="Arial" w:hAnsi="Arial" w:eastAsia="Arial" w:cs="Arial"/>
+                <w:i w:val="false"/>
+                <w:b w:val="false"/>
+                <w:u w:val="none"/>
+                <w:strike w:val="false"/>
+                <w:sz w:val="22"/>
+                <w:szCs w:val="22"/>
+                <w:color w:val="000000"/>
+              </w:rPr>
+              <w:t xml:space="preserve">639.91842</w:t>
+            </w:r>
+          </w:p>
+        </w:tc>
+        <w:tc>
+          <w:tcPr>
+            <w:tcBorders>
+              <w:bottom w:val="single" w:sz="6" w:space="0" w:color="666666"/>
+              <w:top w:val="single" w:sz="12" w:space="0" w:color="666666"/>
+              <w:left w:val="none" w:sz="0" w:space="0" w:color="000000"/>
+              <w:right w:val="none" w:sz="0" w:space="0" w:color="000000"/>
+            </w:tcBorders>
+            <w:shd w:val="clear" w:color="auto" w:fill="FFFFFF"/>
+            <w:tcMar>
+              <w:top w:w="0" w:type="dxa"/>
+              <w:bottom w:w="0" w:type="dxa"/>
+              <w:left w:w="0" w:type="dxa"/>
+              <w:right w:w="0" w:type="dxa"/>
+            </w:tcMar>
+            <w:vAlign w:val="center"/>
+          </w:tcPr>
+          <w:p>
+            <w:pPr>
+              <w:jc w:val="right"/>
+              <w:pBdr>
+                <w:bottom w:val="none" w:sz="0" w:space="0" w:color="000000"/>
+                <w:top w:val="none" w:sz="0" w:space="0" w:color="000000"/>
+                <w:left w:val="none" w:sz="0" w:space="0" w:color="000000"/>
+                <w:right w:val="none" w:sz="0" w:space="0" w:color="000000"/>
+              </w:pBdr>
+              <w:spacing w:after="100" w:before="100" w:line="240"/>
+              <w:ind w:left="100" w:right="100" w:firstLine="0" w:firstLineChars="0"/>
+              <w:rPr>
+                <w:rFonts w:ascii="Arial" w:hAnsi="Arial" w:eastAsia="Arial" w:cs="Arial"/>
+                <w:i w:val="false"/>
+                <w:b w:val="false"/>
+                <w:u w:val="none"/>
+                <w:strike w:val="false"/>
+                <w:sz w:val="22"/>
+                <w:szCs w:val="22"/>
+                <w:color w:val="000000"/>
+              </w:rPr>
+            </w:pPr>
+            <w:r xmlns:w="http://schemas.openxmlformats.org/wordprocessingml/2006/main" xmlns:wp="http://schemas.openxmlformats.org/drawingml/2006/wordprocessingDrawing" xmlns:r="http://schemas.openxmlformats.org/officeDocument/2006/relationships" xmlns:w14="http://schemas.microsoft.com/office/word/2010/wordml">
+              <w:rPr>
+                <w:rFonts w:ascii="Arial" w:hAnsi="Arial" w:eastAsia="Arial" w:cs="Arial"/>
+                <w:i w:val="false"/>
+                <w:b w:val="false"/>
+                <w:u w:val="none"/>
+                <w:strike w:val="false"/>
+                <w:sz w:val="22"/>
+                <w:szCs w:val="22"/>
+                <w:color w:val="000000"/>
+              </w:rPr>
+              <w:t xml:space="preserve">449.4110</w:t>
+            </w:r>
+          </w:p>
+        </w:tc>
+        <w:tc>
+          <w:tcPr>
+            <w:tcBorders>
+              <w:bottom w:val="single" w:sz="6" w:space="0" w:color="666666"/>
+              <w:top w:val="single" w:sz="12" w:space="0" w:color="666666"/>
+              <w:left w:val="none" w:sz="0" w:space="0" w:color="000000"/>
+              <w:right w:val="none" w:sz="0" w:space="0" w:color="000000"/>
+            </w:tcBorders>
+            <w:shd w:val="clear" w:color="auto" w:fill="FFFFFF"/>
+            <w:tcMar>
+              <w:top w:w="0" w:type="dxa"/>
+              <w:bottom w:w="0" w:type="dxa"/>
+              <w:left w:w="0" w:type="dxa"/>
+              <w:right w:w="0" w:type="dxa"/>
+            </w:tcMar>
+            <w:vAlign w:val="center"/>
+          </w:tcPr>
+          <w:p>
+            <w:pPr>
+              <w:jc w:val="right"/>
+              <w:pBdr>
+                <w:bottom w:val="none" w:sz="0" w:space="0" w:color="000000"/>
+                <w:top w:val="none" w:sz="0" w:space="0" w:color="000000"/>
+                <w:left w:val="none" w:sz="0" w:space="0" w:color="000000"/>
+                <w:right w:val="none" w:sz="0" w:space="0" w:color="000000"/>
+              </w:pBdr>
+              <w:spacing w:after="100" w:before="100" w:line="240"/>
+              <w:ind w:left="100" w:right="100" w:firstLine="0" w:firstLineChars="0"/>
+              <w:rPr>
+                <w:rFonts w:ascii="Arial" w:hAnsi="Arial" w:eastAsia="Arial" w:cs="Arial"/>
+                <w:i w:val="false"/>
+                <w:b w:val="false"/>
+                <w:u w:val="none"/>
+                <w:strike w:val="false"/>
+                <w:sz w:val="22"/>
+                <w:szCs w:val="22"/>
+                <w:color w:val="000000"/>
+              </w:rPr>
+            </w:pPr>
+            <w:r xmlns:w="http://schemas.openxmlformats.org/wordprocessingml/2006/main" xmlns:wp="http://schemas.openxmlformats.org/drawingml/2006/wordprocessingDrawing" xmlns:r="http://schemas.openxmlformats.org/officeDocument/2006/relationships" xmlns:w14="http://schemas.microsoft.com/office/word/2010/wordml">
+              <w:rPr>
+                <w:rFonts w:ascii="Arial" w:hAnsi="Arial" w:eastAsia="Arial" w:cs="Arial"/>
+                <w:i w:val="false"/>
+                <w:b w:val="false"/>
+                <w:u w:val="none"/>
+                <w:strike w:val="false"/>
+                <w:sz w:val="22"/>
+                <w:szCs w:val="22"/>
+                <w:color w:val="000000"/>
+              </w:rPr>
+              <w:t xml:space="preserve">155,500.18</w:t>
+            </w:r>
+          </w:p>
+        </w:tc>
+        <w:tc>
+          <w:tcPr>
+            <w:tcBorders>
+              <w:bottom w:val="single" w:sz="6" w:space="0" w:color="666666"/>
+              <w:top w:val="single" w:sz="12" w:space="0" w:color="666666"/>
+              <w:left w:val="none" w:sz="0" w:space="0" w:color="000000"/>
+              <w:right w:val="none" w:sz="0" w:space="0" w:color="000000"/>
+            </w:tcBorders>
+            <w:shd w:val="clear" w:color="auto" w:fill="FFFFFF"/>
+            <w:tcMar>
+              <w:top w:w="0" w:type="dxa"/>
+              <w:bottom w:w="0" w:type="dxa"/>
+              <w:left w:w="0" w:type="dxa"/>
+              <w:right w:w="0" w:type="dxa"/>
+            </w:tcMar>
+            <w:vAlign w:val="center"/>
+          </w:tcPr>
+          <w:p>
+            <w:pPr>
+              <w:jc w:val="right"/>
+              <w:pBdr>
+                <w:bottom w:val="none" w:sz="0" w:space="0" w:color="000000"/>
+                <w:top w:val="none" w:sz="0" w:space="0" w:color="000000"/>
+                <w:left w:val="none" w:sz="0" w:space="0" w:color="000000"/>
+                <w:right w:val="none" w:sz="0" w:space="0" w:color="000000"/>
+              </w:pBdr>
+              <w:spacing w:after="100" w:before="100" w:line="240"/>
+              <w:ind w:left="100" w:right="100" w:firstLine="0" w:firstLineChars="0"/>
+              <w:rPr>
+                <w:rFonts w:ascii="Arial" w:hAnsi="Arial" w:eastAsia="Arial" w:cs="Arial"/>
+                <w:i w:val="false"/>
+                <w:b w:val="false"/>
+                <w:u w:val="none"/>
+                <w:strike w:val="false"/>
+                <w:sz w:val="22"/>
+                <w:szCs w:val="22"/>
+                <w:color w:val="000000"/>
+              </w:rPr>
+            </w:pPr>
+            <w:r xmlns:w="http://schemas.openxmlformats.org/wordprocessingml/2006/main" xmlns:wp="http://schemas.openxmlformats.org/drawingml/2006/wordprocessingDrawing" xmlns:r="http://schemas.openxmlformats.org/officeDocument/2006/relationships" xmlns:w14="http://schemas.microsoft.com/office/word/2010/wordml">
+              <w:rPr>
+                <w:rFonts w:ascii="Arial" w:hAnsi="Arial" w:eastAsia="Arial" w:cs="Arial"/>
+                <w:i w:val="false"/>
+                <w:b w:val="false"/>
+                <w:u w:val="none"/>
+                <w:strike w:val="false"/>
+                <w:sz w:val="22"/>
+                <w:szCs w:val="22"/>
+                <w:color w:val="000000"/>
+              </w:rPr>
+              <w:t xml:space="preserve">243</w:t>
+            </w:r>
+          </w:p>
+        </w:tc>
+      </w:tr>
+      <w:tr>
+        <w:trPr>
+          <w:trHeight w:val="600" w:hRule="auto"/>
+        </w:trPr>
+        <w:tc>
+          <w:tcPr>
+            <w:tcBorders>
+              <w:bottom w:val="single" w:sz="6" w:space="0" w:color="666666"/>
+              <w:top w:val="single" w:sz="6" w:space="0" w:color="666666"/>
+              <w:left w:val="none" w:sz="0" w:space="0" w:color="000000"/>
+              <w:right w:val="none" w:sz="0" w:space="0" w:color="000000"/>
+            </w:tcBorders>
+            <w:shd w:val="clear" w:color="auto" w:fill="FFFFFF"/>
+            <w:tcMar>
+              <w:top w:w="0" w:type="dxa"/>
+              <w:bottom w:w="0" w:type="dxa"/>
+              <w:left w:w="0" w:type="dxa"/>
+              <w:right w:w="0" w:type="dxa"/>
+            </w:tcMar>
+            <w:vAlign w:val="center"/>
+          </w:tcPr>
+          <w:p>
+            <w:pPr>
+              <w:jc w:val="left"/>
+              <w:pBdr>
+                <w:bottom w:val="none" w:sz="0" w:space="0" w:color="000000"/>
+                <w:top w:val="none" w:sz="0" w:space="0" w:color="000000"/>
+                <w:left w:val="none" w:sz="0" w:space="0" w:color="000000"/>
+                <w:right w:val="none" w:sz="0" w:space="0" w:color="000000"/>
+              </w:pBdr>
+              <w:spacing w:after="100" w:before="100" w:line="240"/>
+              <w:ind w:left="100" w:right="100" w:firstLine="0" w:firstLineChars="0"/>
+              <w:rPr>
+                <w:rFonts w:ascii="Arial" w:hAnsi="Arial" w:eastAsia="Arial" w:cs="Arial"/>
+                <w:i w:val="false"/>
+                <w:b w:val="false"/>
+                <w:u w:val="none"/>
+                <w:strike w:val="false"/>
+                <w:sz w:val="22"/>
+                <w:szCs w:val="22"/>
+                <w:color w:val="000000"/>
+              </w:rPr>
+            </w:pPr>
+            <w:r xmlns:w="http://schemas.openxmlformats.org/wordprocessingml/2006/main" xmlns:wp="http://schemas.openxmlformats.org/drawingml/2006/wordprocessingDrawing" xmlns:r="http://schemas.openxmlformats.org/officeDocument/2006/relationships" xmlns:w14="http://schemas.microsoft.com/office/word/2010/wordml">
+              <w:rPr>
+                <w:rFonts w:ascii="Arial" w:hAnsi="Arial" w:eastAsia="Arial" w:cs="Arial"/>
+                <w:i w:val="false"/>
+                <w:b w:val="false"/>
+                <w:u w:val="none"/>
+                <w:strike w:val="false"/>
+                <w:sz w:val="22"/>
+                <w:szCs w:val="22"/>
+                <w:color w:val="000000"/>
+              </w:rPr>
+              <w:t xml:space="preserve">Home</w:t>
+            </w:r>
+          </w:p>
+        </w:tc>
+        <w:tc>
+          <w:tcPr>
+            <w:tcBorders>
+              <w:bottom w:val="single" w:sz="6" w:space="0" w:color="666666"/>
+              <w:top w:val="single" w:sz="6" w:space="0" w:color="666666"/>
+              <w:left w:val="none" w:sz="0" w:space="0" w:color="000000"/>
+              <w:right w:val="none" w:sz="0" w:space="0" w:color="000000"/>
+            </w:tcBorders>
+            <w:shd w:val="clear" w:color="auto" w:fill="FFFFFF"/>
+            <w:tcMar>
+              <w:top w:w="0" w:type="dxa"/>
+              <w:bottom w:w="0" w:type="dxa"/>
+              <w:left w:w="0" w:type="dxa"/>
+              <w:right w:w="0" w:type="dxa"/>
+            </w:tcMar>
+            <w:vAlign w:val="center"/>
+          </w:tcPr>
+          <w:p>
+            <w:pPr>
+              <w:jc w:val="right"/>
+              <w:pBdr>
+                <w:bottom w:val="none" w:sz="0" w:space="0" w:color="000000"/>
+                <w:top w:val="none" w:sz="0" w:space="0" w:color="000000"/>
+                <w:left w:val="none" w:sz="0" w:space="0" w:color="000000"/>
+                <w:right w:val="none" w:sz="0" w:space="0" w:color="000000"/>
+              </w:pBdr>
+              <w:spacing w:after="100" w:before="100" w:line="240"/>
+              <w:ind w:left="100" w:right="100" w:firstLine="0" w:firstLineChars="0"/>
+              <w:rPr>
+                <w:rFonts w:ascii="Arial" w:hAnsi="Arial" w:eastAsia="Arial" w:cs="Arial"/>
+                <w:i w:val="false"/>
+                <w:b w:val="false"/>
+                <w:u w:val="none"/>
+                <w:strike w:val="false"/>
+                <w:sz w:val="22"/>
+                <w:szCs w:val="22"/>
+                <w:color w:val="000000"/>
+              </w:rPr>
+            </w:pPr>
+            <w:r xmlns:w="http://schemas.openxmlformats.org/wordprocessingml/2006/main" xmlns:wp="http://schemas.openxmlformats.org/drawingml/2006/wordprocessingDrawing" xmlns:r="http://schemas.openxmlformats.org/officeDocument/2006/relationships" xmlns:w14="http://schemas.microsoft.com/office/word/2010/wordml">
+              <w:rPr>
+                <w:rFonts w:ascii="Arial" w:hAnsi="Arial" w:eastAsia="Arial" w:cs="Arial"/>
+                <w:i w:val="false"/>
+                <w:b w:val="false"/>
+                <w:u w:val="none"/>
+                <w:strike w:val="false"/>
+                <w:sz w:val="22"/>
+                <w:szCs w:val="22"/>
+                <w:color w:val="000000"/>
+              </w:rPr>
+              <w:t xml:space="preserve">291.95564</w:t>
+            </w:r>
+          </w:p>
+        </w:tc>
+        <w:tc>
+          <w:tcPr>
+            <w:tcBorders>
+              <w:bottom w:val="single" w:sz="6" w:space="0" w:color="666666"/>
+              <w:top w:val="single" w:sz="6" w:space="0" w:color="666666"/>
+              <w:left w:val="none" w:sz="0" w:space="0" w:color="000000"/>
+              <w:right w:val="none" w:sz="0" w:space="0" w:color="000000"/>
+            </w:tcBorders>
+            <w:shd w:val="clear" w:color="auto" w:fill="FFFFFF"/>
+            <w:tcMar>
+              <w:top w:w="0" w:type="dxa"/>
+              <w:bottom w:w="0" w:type="dxa"/>
+              <w:left w:w="0" w:type="dxa"/>
+              <w:right w:w="0" w:type="dxa"/>
+            </w:tcMar>
+            <w:vAlign w:val="center"/>
+          </w:tcPr>
+          <w:p>
+            <w:pPr>
+              <w:jc w:val="right"/>
+              <w:pBdr>
+                <w:bottom w:val="none" w:sz="0" w:space="0" w:color="000000"/>
+                <w:top w:val="none" w:sz="0" w:space="0" w:color="000000"/>
+                <w:left w:val="none" w:sz="0" w:space="0" w:color="000000"/>
+                <w:right w:val="none" w:sz="0" w:space="0" w:color="000000"/>
+              </w:pBdr>
+              <w:spacing w:after="100" w:before="100" w:line="240"/>
+              <w:ind w:left="100" w:right="100" w:firstLine="0" w:firstLineChars="0"/>
+              <w:rPr>
+                <w:rFonts w:ascii="Arial" w:hAnsi="Arial" w:eastAsia="Arial" w:cs="Arial"/>
+                <w:i w:val="false"/>
+                <w:b w:val="false"/>
+                <w:u w:val="none"/>
+                <w:strike w:val="false"/>
+                <w:sz w:val="22"/>
+                <w:szCs w:val="22"/>
+                <w:color w:val="000000"/>
+              </w:rPr>
+            </w:pPr>
+            <w:r xmlns:w="http://schemas.openxmlformats.org/wordprocessingml/2006/main" xmlns:wp="http://schemas.openxmlformats.org/drawingml/2006/wordprocessingDrawing" xmlns:r="http://schemas.openxmlformats.org/officeDocument/2006/relationships" xmlns:w14="http://schemas.microsoft.com/office/word/2010/wordml">
+              <w:rPr>
+                <w:rFonts w:ascii="Arial" w:hAnsi="Arial" w:eastAsia="Arial" w:cs="Arial"/>
+                <w:i w:val="false"/>
+                <w:b w:val="false"/>
+                <w:u w:val="none"/>
+                <w:strike w:val="false"/>
+                <w:sz w:val="22"/>
+                <w:szCs w:val="22"/>
+                <w:color w:val="000000"/>
+              </w:rPr>
+              <w:t xml:space="preserve">141.8091</w:t>
+            </w:r>
+          </w:p>
+        </w:tc>
+        <w:tc>
+          <w:tcPr>
+            <w:tcBorders>
+              <w:bottom w:val="single" w:sz="6" w:space="0" w:color="666666"/>
+              <w:top w:val="single" w:sz="6" w:space="0" w:color="666666"/>
+              <w:left w:val="none" w:sz="0" w:space="0" w:color="000000"/>
+              <w:right w:val="none" w:sz="0" w:space="0" w:color="000000"/>
+            </w:tcBorders>
+            <w:shd w:val="clear" w:color="auto" w:fill="FFFFFF"/>
+            <w:tcMar>
+              <w:top w:w="0" w:type="dxa"/>
+              <w:bottom w:w="0" w:type="dxa"/>
+              <w:left w:w="0" w:type="dxa"/>
+              <w:right w:w="0" w:type="dxa"/>
+            </w:tcMar>
+            <w:vAlign w:val="center"/>
+          </w:tcPr>
+          <w:p>
+            <w:pPr>
+              <w:jc w:val="right"/>
+              <w:pBdr>
+                <w:bottom w:val="none" w:sz="0" w:space="0" w:color="000000"/>
+                <w:top w:val="none" w:sz="0" w:space="0" w:color="000000"/>
+                <w:left w:val="none" w:sz="0" w:space="0" w:color="000000"/>
+                <w:right w:val="none" w:sz="0" w:space="0" w:color="000000"/>
+              </w:pBdr>
+              <w:spacing w:after="100" w:before="100" w:line="240"/>
+              <w:ind w:left="100" w:right="100" w:firstLine="0" w:firstLineChars="0"/>
+              <w:rPr>
+                <w:rFonts w:ascii="Arial" w:hAnsi="Arial" w:eastAsia="Arial" w:cs="Arial"/>
+                <w:i w:val="false"/>
+                <w:b w:val="false"/>
+                <w:u w:val="none"/>
+                <w:strike w:val="false"/>
+                <w:sz w:val="22"/>
+                <w:szCs w:val="22"/>
+                <w:color w:val="000000"/>
+              </w:rPr>
+            </w:pPr>
+            <w:r xmlns:w="http://schemas.openxmlformats.org/wordprocessingml/2006/main" xmlns:wp="http://schemas.openxmlformats.org/drawingml/2006/wordprocessingDrawing" xmlns:r="http://schemas.openxmlformats.org/officeDocument/2006/relationships" xmlns:w14="http://schemas.microsoft.com/office/word/2010/wordml">
+              <w:rPr>
+                <w:rFonts w:ascii="Arial" w:hAnsi="Arial" w:eastAsia="Arial" w:cs="Arial"/>
+                <w:i w:val="false"/>
+                <w:b w:val="false"/>
+                <w:u w:val="none"/>
+                <w:strike w:val="false"/>
+                <w:sz w:val="22"/>
+                <w:szCs w:val="22"/>
+                <w:color w:val="000000"/>
+              </w:rPr>
+              <w:t xml:space="preserve">60,434.82</w:t>
+            </w:r>
+          </w:p>
+        </w:tc>
+        <w:tc>
+          <w:tcPr>
+            <w:tcBorders>
+              <w:bottom w:val="single" w:sz="6" w:space="0" w:color="666666"/>
+              <w:top w:val="single" w:sz="6" w:space="0" w:color="666666"/>
+              <w:left w:val="none" w:sz="0" w:space="0" w:color="000000"/>
+              <w:right w:val="none" w:sz="0" w:space="0" w:color="000000"/>
+            </w:tcBorders>
+            <w:shd w:val="clear" w:color="auto" w:fill="FFFFFF"/>
+            <w:tcMar>
+              <w:top w:w="0" w:type="dxa"/>
+              <w:bottom w:w="0" w:type="dxa"/>
+              <w:left w:w="0" w:type="dxa"/>
+              <w:right w:w="0" w:type="dxa"/>
+            </w:tcMar>
+            <w:vAlign w:val="center"/>
+          </w:tcPr>
+          <w:p>
+            <w:pPr>
+              <w:jc w:val="right"/>
+              <w:pBdr>
+                <w:bottom w:val="none" w:sz="0" w:space="0" w:color="000000"/>
+                <w:top w:val="none" w:sz="0" w:space="0" w:color="000000"/>
+                <w:left w:val="none" w:sz="0" w:space="0" w:color="000000"/>
+                <w:right w:val="none" w:sz="0" w:space="0" w:color="000000"/>
+              </w:pBdr>
+              <w:spacing w:after="100" w:before="100" w:line="240"/>
+              <w:ind w:left="100" w:right="100" w:firstLine="0" w:firstLineChars="0"/>
+              <w:rPr>
+                <w:rFonts w:ascii="Arial" w:hAnsi="Arial" w:eastAsia="Arial" w:cs="Arial"/>
+                <w:i w:val="false"/>
+                <w:b w:val="false"/>
+                <w:u w:val="none"/>
+                <w:strike w:val="false"/>
+                <w:sz w:val="22"/>
+                <w:szCs w:val="22"/>
+                <w:color w:val="000000"/>
+              </w:rPr>
+            </w:pPr>
+            <w:r xmlns:w="http://schemas.openxmlformats.org/wordprocessingml/2006/main" xmlns:wp="http://schemas.openxmlformats.org/drawingml/2006/wordprocessingDrawing" xmlns:r="http://schemas.openxmlformats.org/officeDocument/2006/relationships" xmlns:w14="http://schemas.microsoft.com/office/word/2010/wordml">
+              <w:rPr>
+                <w:rFonts w:ascii="Arial" w:hAnsi="Arial" w:eastAsia="Arial" w:cs="Arial"/>
+                <w:i w:val="false"/>
+                <w:b w:val="false"/>
+                <w:u w:val="none"/>
+                <w:strike w:val="false"/>
+                <w:sz w:val="22"/>
+                <w:szCs w:val="22"/>
+                <w:color w:val="000000"/>
+              </w:rPr>
+              <w:t xml:space="preserve">207</w:t>
+            </w:r>
+          </w:p>
+        </w:tc>
+      </w:tr>
+      <w:tr>
+        <w:trPr>
+          <w:trHeight w:val="615" w:hRule="auto"/>
+        </w:trPr>
+        <w:tc>
+          <w:tcPr>
+            <w:tcBorders>
+              <w:bottom w:val="single" w:sz="6" w:space="0" w:color="666666"/>
+              <w:top w:val="single" w:sz="6" w:space="0" w:color="666666"/>
+              <w:left w:val="none" w:sz="0" w:space="0" w:color="000000"/>
+              <w:right w:val="none" w:sz="0" w:space="0" w:color="000000"/>
+            </w:tcBorders>
+            <w:shd w:val="clear" w:color="auto" w:fill="FFFFFF"/>
+            <w:tcMar>
+              <w:top w:w="0" w:type="dxa"/>
+              <w:bottom w:w="0" w:type="dxa"/>
+              <w:left w:w="0" w:type="dxa"/>
+              <w:right w:w="0" w:type="dxa"/>
+            </w:tcMar>
+            <w:vAlign w:val="center"/>
+          </w:tcPr>
+          <w:p>
+            <w:pPr>
+              <w:jc w:val="left"/>
+              <w:pBdr>
+                <w:bottom w:val="none" w:sz="0" w:space="0" w:color="000000"/>
+                <w:top w:val="none" w:sz="0" w:space="0" w:color="000000"/>
+                <w:left w:val="none" w:sz="0" w:space="0" w:color="000000"/>
+                <w:right w:val="none" w:sz="0" w:space="0" w:color="000000"/>
+              </w:pBdr>
+              <w:spacing w:after="100" w:before="100" w:line="240"/>
+              <w:ind w:left="100" w:right="100" w:firstLine="0" w:firstLineChars="0"/>
+              <w:rPr>
+                <w:rFonts w:ascii="Arial" w:hAnsi="Arial" w:eastAsia="Arial" w:cs="Arial"/>
+                <w:i w:val="false"/>
+                <w:b w:val="false"/>
+                <w:u w:val="none"/>
+                <w:strike w:val="false"/>
+                <w:sz w:val="22"/>
+                <w:szCs w:val="22"/>
+                <w:color w:val="000000"/>
+              </w:rPr>
+            </w:pPr>
+            <w:r xmlns:w="http://schemas.openxmlformats.org/wordprocessingml/2006/main" xmlns:wp="http://schemas.openxmlformats.org/drawingml/2006/wordprocessingDrawing" xmlns:r="http://schemas.openxmlformats.org/officeDocument/2006/relationships" xmlns:w14="http://schemas.microsoft.com/office/word/2010/wordml">
+              <w:rPr>
+                <w:rFonts w:ascii="Arial" w:hAnsi="Arial" w:eastAsia="Arial" w:cs="Arial"/>
+                <w:i w:val="false"/>
+                <w:b w:val="false"/>
+                <w:u w:val="none"/>
+                <w:strike w:val="false"/>
+                <w:sz w:val="22"/>
+                <w:szCs w:val="22"/>
+                <w:color w:val="000000"/>
+              </w:rPr>
+              <w:t xml:space="preserve">Sports</w:t>
+            </w:r>
+          </w:p>
+        </w:tc>
+        <w:tc>
+          <w:tcPr>
+            <w:tcBorders>
+              <w:bottom w:val="single" w:sz="6" w:space="0" w:color="666666"/>
+              <w:top w:val="single" w:sz="6" w:space="0" w:color="666666"/>
+              <w:left w:val="none" w:sz="0" w:space="0" w:color="000000"/>
+              <w:right w:val="none" w:sz="0" w:space="0" w:color="000000"/>
+            </w:tcBorders>
+            <w:shd w:val="clear" w:color="auto" w:fill="FFFFFF"/>
+            <w:tcMar>
+              <w:top w:w="0" w:type="dxa"/>
+              <w:bottom w:w="0" w:type="dxa"/>
+              <w:left w:w="0" w:type="dxa"/>
+              <w:right w:w="0" w:type="dxa"/>
+            </w:tcMar>
+            <w:vAlign w:val="center"/>
+          </w:tcPr>
+          <w:p>
+            <w:pPr>
+              <w:jc w:val="right"/>
+              <w:pBdr>
+                <w:bottom w:val="none" w:sz="0" w:space="0" w:color="000000"/>
+                <w:top w:val="none" w:sz="0" w:space="0" w:color="000000"/>
+                <w:left w:val="none" w:sz="0" w:space="0" w:color="000000"/>
+                <w:right w:val="none" w:sz="0" w:space="0" w:color="000000"/>
+              </w:pBdr>
+              <w:spacing w:after="100" w:before="100" w:line="240"/>
+              <w:ind w:left="100" w:right="100" w:firstLine="0" w:firstLineChars="0"/>
+              <w:rPr>
+                <w:rFonts w:ascii="Arial" w:hAnsi="Arial" w:eastAsia="Arial" w:cs="Arial"/>
+                <w:i w:val="false"/>
+                <w:b w:val="false"/>
+                <w:u w:val="none"/>
+                <w:strike w:val="false"/>
+                <w:sz w:val="22"/>
+                <w:szCs w:val="22"/>
+                <w:color w:val="000000"/>
+              </w:rPr>
+            </w:pPr>
+            <w:r xmlns:w="http://schemas.openxmlformats.org/wordprocessingml/2006/main" xmlns:wp="http://schemas.openxmlformats.org/drawingml/2006/wordprocessingDrawing" xmlns:r="http://schemas.openxmlformats.org/officeDocument/2006/relationships" xmlns:w14="http://schemas.microsoft.com/office/word/2010/wordml">
+              <w:rPr>
+                <w:rFonts w:ascii="Arial" w:hAnsi="Arial" w:eastAsia="Arial" w:cs="Arial"/>
+                <w:i w:val="false"/>
+                <w:b w:val="false"/>
+                <w:u w:val="none"/>
+                <w:strike w:val="false"/>
+                <w:sz w:val="22"/>
+                <w:szCs w:val="22"/>
+                <w:color w:val="000000"/>
+              </w:rPr>
+              <w:t xml:space="preserve">347.87120</w:t>
+            </w:r>
+          </w:p>
+        </w:tc>
+        <w:tc>
+          <w:tcPr>
+            <w:tcBorders>
+              <w:bottom w:val="single" w:sz="6" w:space="0" w:color="666666"/>
+              <w:top w:val="single" w:sz="6" w:space="0" w:color="666666"/>
+              <w:left w:val="none" w:sz="0" w:space="0" w:color="000000"/>
+              <w:right w:val="none" w:sz="0" w:space="0" w:color="000000"/>
+            </w:tcBorders>
+            <w:shd w:val="clear" w:color="auto" w:fill="FFFFFF"/>
+            <w:tcMar>
+              <w:top w:w="0" w:type="dxa"/>
+              <w:bottom w:w="0" w:type="dxa"/>
+              <w:left w:w="0" w:type="dxa"/>
+              <w:right w:w="0" w:type="dxa"/>
+            </w:tcMar>
+            <w:vAlign w:val="center"/>
+          </w:tcPr>
+          <w:p>
+            <w:pPr>
+              <w:jc w:val="right"/>
+              <w:pBdr>
+                <w:bottom w:val="none" w:sz="0" w:space="0" w:color="000000"/>
+                <w:top w:val="none" w:sz="0" w:space="0" w:color="000000"/>
+                <w:left w:val="none" w:sz="0" w:space="0" w:color="000000"/>
+                <w:right w:val="none" w:sz="0" w:space="0" w:color="000000"/>
+              </w:pBdr>
+              <w:spacing w:after="100" w:before="100" w:line="240"/>
+              <w:ind w:left="100" w:right="100" w:firstLine="0" w:firstLineChars="0"/>
+              <w:rPr>
+                <w:rFonts w:ascii="Arial" w:hAnsi="Arial" w:eastAsia="Arial" w:cs="Arial"/>
+                <w:i w:val="false"/>
+                <w:b w:val="false"/>
+                <w:u w:val="none"/>
+                <w:strike w:val="false"/>
+                <w:sz w:val="22"/>
+                <w:szCs w:val="22"/>
+                <w:color w:val="000000"/>
+              </w:rPr>
+            </w:pPr>
+            <w:r xmlns:w="http://schemas.openxmlformats.org/wordprocessingml/2006/main" xmlns:wp="http://schemas.openxmlformats.org/drawingml/2006/wordprocessingDrawing" xmlns:r="http://schemas.openxmlformats.org/officeDocument/2006/relationships" xmlns:w14="http://schemas.microsoft.com/office/word/2010/wordml">
+              <w:rPr>
+                <w:rFonts w:ascii="Arial" w:hAnsi="Arial" w:eastAsia="Arial" w:cs="Arial"/>
+                <w:i w:val="false"/>
+                <w:b w:val="false"/>
+                <w:u w:val="none"/>
+                <w:strike w:val="false"/>
+                <w:sz w:val="22"/>
+                <w:szCs w:val="22"/>
+                <w:color w:val="000000"/>
+              </w:rPr>
+              <w:t xml:space="preserve">219.2148</w:t>
+            </w:r>
+          </w:p>
+        </w:tc>
+        <w:tc>
+          <w:tcPr>
+            <w:tcBorders>
+              <w:bottom w:val="single" w:sz="6" w:space="0" w:color="666666"/>
+              <w:top w:val="single" w:sz="6" w:space="0" w:color="666666"/>
+              <w:left w:val="none" w:sz="0" w:space="0" w:color="000000"/>
+              <w:right w:val="none" w:sz="0" w:space="0" w:color="000000"/>
+            </w:tcBorders>
+            <w:shd w:val="clear" w:color="auto" w:fill="FFFFFF"/>
+            <w:tcMar>
+              <w:top w:w="0" w:type="dxa"/>
+              <w:bottom w:w="0" w:type="dxa"/>
+              <w:left w:w="0" w:type="dxa"/>
+              <w:right w:w="0" w:type="dxa"/>
+            </w:tcMar>
+            <w:vAlign w:val="center"/>
+          </w:tcPr>
+          <w:p>
+            <w:pPr>
+              <w:jc w:val="right"/>
+              <w:pBdr>
+                <w:bottom w:val="none" w:sz="0" w:space="0" w:color="000000"/>
+                <w:top w:val="none" w:sz="0" w:space="0" w:color="000000"/>
+                <w:left w:val="none" w:sz="0" w:space="0" w:color="000000"/>
+                <w:right w:val="none" w:sz="0" w:space="0" w:color="000000"/>
+              </w:pBdr>
+              <w:spacing w:after="100" w:before="100" w:line="240"/>
+              <w:ind w:left="100" w:right="100" w:firstLine="0" w:firstLineChars="0"/>
+              <w:rPr>
+                <w:rFonts w:ascii="Arial" w:hAnsi="Arial" w:eastAsia="Arial" w:cs="Arial"/>
+                <w:i w:val="false"/>
+                <w:b w:val="false"/>
+                <w:u w:val="none"/>
+                <w:strike w:val="false"/>
+                <w:sz w:val="22"/>
+                <w:szCs w:val="22"/>
+                <w:color w:val="000000"/>
+              </w:rPr>
+            </w:pPr>
+            <w:r xmlns:w="http://schemas.openxmlformats.org/wordprocessingml/2006/main" xmlns:wp="http://schemas.openxmlformats.org/drawingml/2006/wordprocessingDrawing" xmlns:r="http://schemas.openxmlformats.org/officeDocument/2006/relationships" xmlns:w14="http://schemas.microsoft.com/office/word/2010/wordml">
+              <w:rPr>
+                <w:rFonts w:ascii="Arial" w:hAnsi="Arial" w:eastAsia="Arial" w:cs="Arial"/>
+                <w:i w:val="false"/>
+                <w:b w:val="false"/>
+                <w:u w:val="none"/>
+                <w:strike w:val="false"/>
+                <w:sz w:val="22"/>
+                <w:szCs w:val="22"/>
+                <w:color w:val="000000"/>
+              </w:rPr>
+              <w:t xml:space="preserve">54,267.91</w:t>
+            </w:r>
+          </w:p>
+        </w:tc>
+        <w:tc>
+          <w:tcPr>
+            <w:tcBorders>
+              <w:bottom w:val="single" w:sz="6" w:space="0" w:color="666666"/>
+              <w:top w:val="single" w:sz="6" w:space="0" w:color="666666"/>
+              <w:left w:val="none" w:sz="0" w:space="0" w:color="000000"/>
+              <w:right w:val="none" w:sz="0" w:space="0" w:color="000000"/>
+            </w:tcBorders>
+            <w:shd w:val="clear" w:color="auto" w:fill="FFFFFF"/>
+            <w:tcMar>
+              <w:top w:w="0" w:type="dxa"/>
+              <w:bottom w:w="0" w:type="dxa"/>
+              <w:left w:w="0" w:type="dxa"/>
+              <w:right w:w="0" w:type="dxa"/>
+            </w:tcMar>
+            <w:vAlign w:val="center"/>
+          </w:tcPr>
+          <w:p>
+            <w:pPr>
+              <w:jc w:val="right"/>
+              <w:pBdr>
+                <w:bottom w:val="none" w:sz="0" w:space="0" w:color="000000"/>
+                <w:top w:val="none" w:sz="0" w:space="0" w:color="000000"/>
+                <w:left w:val="none" w:sz="0" w:space="0" w:color="000000"/>
+                <w:right w:val="none" w:sz="0" w:space="0" w:color="000000"/>
+              </w:pBdr>
+              <w:spacing w:after="100" w:before="100" w:line="240"/>
+              <w:ind w:left="100" w:right="100" w:firstLine="0" w:firstLineChars="0"/>
+              <w:rPr>
+                <w:rFonts w:ascii="Arial" w:hAnsi="Arial" w:eastAsia="Arial" w:cs="Arial"/>
+                <w:i w:val="false"/>
+                <w:b w:val="false"/>
+                <w:u w:val="none"/>
+                <w:strike w:val="false"/>
+                <w:sz w:val="22"/>
+                <w:szCs w:val="22"/>
+                <w:color w:val="000000"/>
+              </w:rPr>
+            </w:pPr>
+            <w:r xmlns:w="http://schemas.openxmlformats.org/wordprocessingml/2006/main" xmlns:wp="http://schemas.openxmlformats.org/drawingml/2006/wordprocessingDrawing" xmlns:r="http://schemas.openxmlformats.org/officeDocument/2006/relationships" xmlns:w14="http://schemas.microsoft.com/office/word/2010/wordml">
+              <w:rPr>
+                <w:rFonts w:ascii="Arial" w:hAnsi="Arial" w:eastAsia="Arial" w:cs="Arial"/>
+                <w:i w:val="false"/>
+                <w:b w:val="false"/>
+                <w:u w:val="none"/>
+                <w:strike w:val="false"/>
+                <w:sz w:val="22"/>
+                <w:szCs w:val="22"/>
+                <w:color w:val="000000"/>
+              </w:rPr>
+              <w:t xml:space="preserve">156</w:t>
+            </w:r>
+          </w:p>
+        </w:tc>
+      </w:tr>
+      <w:tr>
+        <w:trPr>
+          <w:trHeight w:val="600" w:hRule="auto"/>
+        </w:trPr>
+        <w:tc>
+          <w:tcPr>
+            <w:tcBorders>
+              <w:bottom w:val="single" w:sz="6" w:space="0" w:color="666666"/>
+              <w:top w:val="single" w:sz="6" w:space="0" w:color="666666"/>
+              <w:left w:val="none" w:sz="0" w:space="0" w:color="000000"/>
+              <w:right w:val="none" w:sz="0" w:space="0" w:color="000000"/>
+            </w:tcBorders>
+            <w:shd w:val="clear" w:color="auto" w:fill="FFFFFF"/>
+            <w:tcMar>
+              <w:top w:w="0" w:type="dxa"/>
+              <w:bottom w:w="0" w:type="dxa"/>
+              <w:left w:w="0" w:type="dxa"/>
+              <w:right w:w="0" w:type="dxa"/>
+            </w:tcMar>
+            <w:vAlign w:val="center"/>
+          </w:tcPr>
+          <w:p>
+            <w:pPr>
+              <w:jc w:val="left"/>
+              <w:pBdr>
+                <w:bottom w:val="none" w:sz="0" w:space="0" w:color="000000"/>
+                <w:top w:val="none" w:sz="0" w:space="0" w:color="000000"/>
+                <w:left w:val="none" w:sz="0" w:space="0" w:color="000000"/>
+                <w:right w:val="none" w:sz="0" w:space="0" w:color="000000"/>
+              </w:pBdr>
+              <w:spacing w:after="100" w:before="100" w:line="240"/>
+              <w:ind w:left="100" w:right="100" w:firstLine="0" w:firstLineChars="0"/>
+              <w:rPr>
+                <w:rFonts w:ascii="Arial" w:hAnsi="Arial" w:eastAsia="Arial" w:cs="Arial"/>
+                <w:i w:val="false"/>
+                <w:b w:val="false"/>
+                <w:u w:val="none"/>
+                <w:strike w:val="false"/>
+                <w:sz w:val="22"/>
+                <w:szCs w:val="22"/>
+                <w:color w:val="000000"/>
+              </w:rPr>
+            </w:pPr>
+            <w:r xmlns:w="http://schemas.openxmlformats.org/wordprocessingml/2006/main" xmlns:wp="http://schemas.openxmlformats.org/drawingml/2006/wordprocessingDrawing" xmlns:r="http://schemas.openxmlformats.org/officeDocument/2006/relationships" xmlns:w14="http://schemas.microsoft.com/office/word/2010/wordml">
+              <w:rPr>
+                <w:rFonts w:ascii="Arial" w:hAnsi="Arial" w:eastAsia="Arial" w:cs="Arial"/>
+                <w:i w:val="false"/>
+                <w:b w:val="false"/>
+                <w:u w:val="none"/>
+                <w:strike w:val="false"/>
+                <w:sz w:val="22"/>
+                <w:szCs w:val="22"/>
+                <w:color w:val="000000"/>
+              </w:rPr>
+              <w:t xml:space="preserve">Fashion</w:t>
+            </w:r>
+          </w:p>
+        </w:tc>
+        <w:tc>
+          <w:tcPr>
+            <w:tcBorders>
+              <w:bottom w:val="single" w:sz="6" w:space="0" w:color="666666"/>
+              <w:top w:val="single" w:sz="6" w:space="0" w:color="666666"/>
+              <w:left w:val="none" w:sz="0" w:space="0" w:color="000000"/>
+              <w:right w:val="none" w:sz="0" w:space="0" w:color="000000"/>
+            </w:tcBorders>
+            <w:shd w:val="clear" w:color="auto" w:fill="FFFFFF"/>
+            <w:tcMar>
+              <w:top w:w="0" w:type="dxa"/>
+              <w:bottom w:w="0" w:type="dxa"/>
+              <w:left w:w="0" w:type="dxa"/>
+              <w:right w:w="0" w:type="dxa"/>
+            </w:tcMar>
+            <w:vAlign w:val="center"/>
+          </w:tcPr>
+          <w:p>
+            <w:pPr>
+              <w:jc w:val="right"/>
+              <w:pBdr>
+                <w:bottom w:val="none" w:sz="0" w:space="0" w:color="000000"/>
+                <w:top w:val="none" w:sz="0" w:space="0" w:color="000000"/>
+                <w:left w:val="none" w:sz="0" w:space="0" w:color="000000"/>
+                <w:right w:val="none" w:sz="0" w:space="0" w:color="000000"/>
+              </w:pBdr>
+              <w:spacing w:after="100" w:before="100" w:line="240"/>
+              <w:ind w:left="100" w:right="100" w:firstLine="0" w:firstLineChars="0"/>
+              <w:rPr>
+                <w:rFonts w:ascii="Arial" w:hAnsi="Arial" w:eastAsia="Arial" w:cs="Arial"/>
+                <w:i w:val="false"/>
+                <w:b w:val="false"/>
+                <w:u w:val="none"/>
+                <w:strike w:val="false"/>
+                <w:sz w:val="22"/>
+                <w:szCs w:val="22"/>
+                <w:color w:val="000000"/>
+              </w:rPr>
+            </w:pPr>
+            <w:r xmlns:w="http://schemas.openxmlformats.org/wordprocessingml/2006/main" xmlns:wp="http://schemas.openxmlformats.org/drawingml/2006/wordprocessingDrawing" xmlns:r="http://schemas.openxmlformats.org/officeDocument/2006/relationships" xmlns:w14="http://schemas.microsoft.com/office/word/2010/wordml">
+              <w:rPr>
+                <w:rFonts w:ascii="Arial" w:hAnsi="Arial" w:eastAsia="Arial" w:cs="Arial"/>
+                <w:i w:val="false"/>
+                <w:b w:val="false"/>
+                <w:u w:val="none"/>
+                <w:strike w:val="false"/>
+                <w:sz w:val="22"/>
+                <w:szCs w:val="22"/>
+                <w:color w:val="000000"/>
+              </w:rPr>
+              <w:t xml:space="preserve">136.78539</w:t>
+            </w:r>
+          </w:p>
+        </w:tc>
+        <w:tc>
+          <w:tcPr>
+            <w:tcBorders>
+              <w:bottom w:val="single" w:sz="6" w:space="0" w:color="666666"/>
+              <w:top w:val="single" w:sz="6" w:space="0" w:color="666666"/>
+              <w:left w:val="none" w:sz="0" w:space="0" w:color="000000"/>
+              <w:right w:val="none" w:sz="0" w:space="0" w:color="000000"/>
+            </w:tcBorders>
+            <w:shd w:val="clear" w:color="auto" w:fill="FFFFFF"/>
+            <w:tcMar>
+              <w:top w:w="0" w:type="dxa"/>
+              <w:bottom w:w="0" w:type="dxa"/>
+              <w:left w:w="0" w:type="dxa"/>
+              <w:right w:w="0" w:type="dxa"/>
+            </w:tcMar>
+            <w:vAlign w:val="center"/>
+          </w:tcPr>
+          <w:p>
+            <w:pPr>
+              <w:jc w:val="right"/>
+              <w:pBdr>
+                <w:bottom w:val="none" w:sz="0" w:space="0" w:color="000000"/>
+                <w:top w:val="none" w:sz="0" w:space="0" w:color="000000"/>
+                <w:left w:val="none" w:sz="0" w:space="0" w:color="000000"/>
+                <w:right w:val="none" w:sz="0" w:space="0" w:color="000000"/>
+              </w:pBdr>
+              <w:spacing w:after="100" w:before="100" w:line="240"/>
+              <w:ind w:left="100" w:right="100" w:firstLine="0" w:firstLineChars="0"/>
+              <w:rPr>
+                <w:rFonts w:ascii="Arial" w:hAnsi="Arial" w:eastAsia="Arial" w:cs="Arial"/>
+                <w:i w:val="false"/>
+                <w:b w:val="false"/>
+                <w:u w:val="none"/>
+                <w:strike w:val="false"/>
+                <w:sz w:val="22"/>
+                <w:szCs w:val="22"/>
+                <w:color w:val="000000"/>
+              </w:rPr>
+            </w:pPr>
+            <w:r xmlns:w="http://schemas.openxmlformats.org/wordprocessingml/2006/main" xmlns:wp="http://schemas.openxmlformats.org/drawingml/2006/wordprocessingDrawing" xmlns:r="http://schemas.openxmlformats.org/officeDocument/2006/relationships" xmlns:w14="http://schemas.microsoft.com/office/word/2010/wordml">
+              <w:rPr>
+                <w:rFonts w:ascii="Arial" w:hAnsi="Arial" w:eastAsia="Arial" w:cs="Arial"/>
+                <w:i w:val="false"/>
+                <w:b w:val="false"/>
+                <w:u w:val="none"/>
+                <w:strike w:val="false"/>
+                <w:sz w:val="22"/>
+                <w:szCs w:val="22"/>
+                <w:color w:val="000000"/>
+              </w:rPr>
+              <w:t xml:space="preserve">102.1157</w:t>
+            </w:r>
+          </w:p>
+        </w:tc>
+        <w:tc>
+          <w:tcPr>
+            <w:tcBorders>
+              <w:bottom w:val="single" w:sz="6" w:space="0" w:color="666666"/>
+              <w:top w:val="single" w:sz="6" w:space="0" w:color="666666"/>
+              <w:left w:val="none" w:sz="0" w:space="0" w:color="000000"/>
+              <w:right w:val="none" w:sz="0" w:space="0" w:color="000000"/>
+            </w:tcBorders>
+            <w:shd w:val="clear" w:color="auto" w:fill="FFFFFF"/>
+            <w:tcMar>
+              <w:top w:w="0" w:type="dxa"/>
+              <w:bottom w:w="0" w:type="dxa"/>
+              <w:left w:w="0" w:type="dxa"/>
+              <w:right w:w="0" w:type="dxa"/>
+            </w:tcMar>
+            <w:vAlign w:val="center"/>
+          </w:tcPr>
+          <w:p>
+            <w:pPr>
+              <w:jc w:val="right"/>
+              <w:pBdr>
+                <w:bottom w:val="none" w:sz="0" w:space="0" w:color="000000"/>
+                <w:top w:val="none" w:sz="0" w:space="0" w:color="000000"/>
+                <w:left w:val="none" w:sz="0" w:space="0" w:color="000000"/>
+                <w:right w:val="none" w:sz="0" w:space="0" w:color="000000"/>
+              </w:pBdr>
+              <w:spacing w:after="100" w:before="100" w:line="240"/>
+              <w:ind w:left="100" w:right="100" w:firstLine="0" w:firstLineChars="0"/>
+              <w:rPr>
+                <w:rFonts w:ascii="Arial" w:hAnsi="Arial" w:eastAsia="Arial" w:cs="Arial"/>
+                <w:i w:val="false"/>
+                <w:b w:val="false"/>
+                <w:u w:val="none"/>
+                <w:strike w:val="false"/>
+                <w:sz w:val="22"/>
+                <w:szCs w:val="22"/>
+                <w:color w:val="000000"/>
+              </w:rPr>
+            </w:pPr>
+            <w:r xmlns:w="http://schemas.openxmlformats.org/wordprocessingml/2006/main" xmlns:wp="http://schemas.openxmlformats.org/drawingml/2006/wordprocessingDrawing" xmlns:r="http://schemas.openxmlformats.org/officeDocument/2006/relationships" xmlns:w14="http://schemas.microsoft.com/office/word/2010/wordml">
+              <w:rPr>
+                <w:rFonts w:ascii="Arial" w:hAnsi="Arial" w:eastAsia="Arial" w:cs="Arial"/>
+                <w:i w:val="false"/>
+                <w:b w:val="false"/>
+                <w:u w:val="none"/>
+                <w:strike w:val="false"/>
+                <w:sz w:val="22"/>
+                <w:szCs w:val="22"/>
+                <w:color w:val="000000"/>
+              </w:rPr>
+              <w:t xml:space="preserve">32,144.57</w:t>
+            </w:r>
+          </w:p>
+        </w:tc>
+        <w:tc>
+          <w:tcPr>
+            <w:tcBorders>
+              <w:bottom w:val="single" w:sz="6" w:space="0" w:color="666666"/>
+              <w:top w:val="single" w:sz="6" w:space="0" w:color="666666"/>
+              <w:left w:val="none" w:sz="0" w:space="0" w:color="000000"/>
+              <w:right w:val="none" w:sz="0" w:space="0" w:color="000000"/>
+            </w:tcBorders>
+            <w:shd w:val="clear" w:color="auto" w:fill="FFFFFF"/>
+            <w:tcMar>
+              <w:top w:w="0" w:type="dxa"/>
+              <w:bottom w:w="0" w:type="dxa"/>
+              <w:left w:w="0" w:type="dxa"/>
+              <w:right w:w="0" w:type="dxa"/>
+            </w:tcMar>
+            <w:vAlign w:val="center"/>
+          </w:tcPr>
+          <w:p>
+            <w:pPr>
+              <w:jc w:val="right"/>
+              <w:pBdr>
+                <w:bottom w:val="none" w:sz="0" w:space="0" w:color="000000"/>
+                <w:top w:val="none" w:sz="0" w:space="0" w:color="000000"/>
+                <w:left w:val="none" w:sz="0" w:space="0" w:color="000000"/>
+                <w:right w:val="none" w:sz="0" w:space="0" w:color="000000"/>
+              </w:pBdr>
+              <w:spacing w:after="100" w:before="100" w:line="240"/>
+              <w:ind w:left="100" w:right="100" w:firstLine="0" w:firstLineChars="0"/>
+              <w:rPr>
+                <w:rFonts w:ascii="Arial" w:hAnsi="Arial" w:eastAsia="Arial" w:cs="Arial"/>
+                <w:i w:val="false"/>
+                <w:b w:val="false"/>
+                <w:u w:val="none"/>
+                <w:strike w:val="false"/>
+                <w:sz w:val="22"/>
+                <w:szCs w:val="22"/>
+                <w:color w:val="000000"/>
+              </w:rPr>
+            </w:pPr>
+            <w:r xmlns:w="http://schemas.openxmlformats.org/wordprocessingml/2006/main" xmlns:wp="http://schemas.openxmlformats.org/drawingml/2006/wordprocessingDrawing" xmlns:r="http://schemas.openxmlformats.org/officeDocument/2006/relationships" xmlns:w14="http://schemas.microsoft.com/office/word/2010/wordml">
+              <w:rPr>
+                <w:rFonts w:ascii="Arial" w:hAnsi="Arial" w:eastAsia="Arial" w:cs="Arial"/>
+                <w:i w:val="false"/>
+                <w:b w:val="false"/>
+                <w:u w:val="none"/>
+                <w:strike w:val="false"/>
+                <w:sz w:val="22"/>
+                <w:szCs w:val="22"/>
+                <w:color w:val="000000"/>
+              </w:rPr>
+              <w:t xml:space="preserve">235</w:t>
+            </w:r>
+          </w:p>
+        </w:tc>
+      </w:tr>
+      <w:tr>
+        <w:trPr>
+          <w:trHeight w:val="614" w:hRule="auto"/>
+        </w:trPr>
+        <w:tc>
+          <w:tcPr>
+            <w:tcBorders>
+              <w:bottom w:val="single" w:sz="12" w:space="0" w:color="666666"/>
+              <w:top w:val="single" w:sz="6" w:space="0" w:color="666666"/>
+              <w:left w:val="none" w:sz="0" w:space="0" w:color="000000"/>
+              <w:right w:val="none" w:sz="0" w:space="0" w:color="000000"/>
+            </w:tcBorders>
+            <w:shd w:val="clear" w:color="auto" w:fill="FFFFFF"/>
+            <w:tcMar>
+              <w:top w:w="0" w:type="dxa"/>
+              <w:bottom w:w="0" w:type="dxa"/>
+              <w:left w:w="0" w:type="dxa"/>
+              <w:right w:w="0" w:type="dxa"/>
+            </w:tcMar>
+            <w:vAlign w:val="center"/>
+          </w:tcPr>
+          <w:p>
+            <w:pPr>
+              <w:jc w:val="left"/>
+              <w:pBdr>
+                <w:bottom w:val="none" w:sz="0" w:space="0" w:color="000000"/>
+                <w:top w:val="none" w:sz="0" w:space="0" w:color="000000"/>
+                <w:left w:val="none" w:sz="0" w:space="0" w:color="000000"/>
+                <w:right w:val="none" w:sz="0" w:space="0" w:color="000000"/>
+              </w:pBdr>
+              <w:spacing w:after="100" w:before="100" w:line="240"/>
+              <w:ind w:left="100" w:right="100" w:firstLine="0" w:firstLineChars="0"/>
+              <w:rPr>
+                <w:rFonts w:ascii="Arial" w:hAnsi="Arial" w:eastAsia="Arial" w:cs="Arial"/>
+                <w:i w:val="false"/>
+                <w:b w:val="false"/>
+                <w:u w:val="none"/>
+                <w:strike w:val="false"/>
+                <w:sz w:val="22"/>
+                <w:szCs w:val="22"/>
+                <w:color w:val="000000"/>
+              </w:rPr>
+            </w:pPr>
+            <w:r xmlns:w="http://schemas.openxmlformats.org/wordprocessingml/2006/main" xmlns:wp="http://schemas.openxmlformats.org/drawingml/2006/wordprocessingDrawing" xmlns:r="http://schemas.openxmlformats.org/officeDocument/2006/relationships" xmlns:w14="http://schemas.microsoft.com/office/word/2010/wordml">
+              <w:rPr>
+                <w:rFonts w:ascii="Arial" w:hAnsi="Arial" w:eastAsia="Arial" w:cs="Arial"/>
+                <w:i w:val="false"/>
+                <w:b w:val="false"/>
+                <w:u w:val="none"/>
+                <w:strike w:val="false"/>
+                <w:sz w:val="22"/>
+                <w:szCs w:val="22"/>
+                <w:color w:val="000000"/>
+              </w:rPr>
+              <w:t xml:space="preserve">Beauty</w:t>
+            </w:r>
+          </w:p>
+        </w:tc>
+        <w:tc>
+          <w:tcPr>
+            <w:tcBorders>
+              <w:bottom w:val="single" w:sz="12" w:space="0" w:color="666666"/>
+              <w:top w:val="single" w:sz="6" w:space="0" w:color="666666"/>
+              <w:left w:val="none" w:sz="0" w:space="0" w:color="000000"/>
+              <w:right w:val="none" w:sz="0" w:space="0" w:color="000000"/>
+            </w:tcBorders>
+            <w:shd w:val="clear" w:color="auto" w:fill="FFFFFF"/>
+            <w:tcMar>
+              <w:top w:w="0" w:type="dxa"/>
+              <w:bottom w:w="0" w:type="dxa"/>
+              <w:left w:w="0" w:type="dxa"/>
+              <w:right w:w="0" w:type="dxa"/>
+            </w:tcMar>
+            <w:vAlign w:val="center"/>
+          </w:tcPr>
+          <w:p>
+            <w:pPr>
+              <w:jc w:val="right"/>
+              <w:pBdr>
+                <w:bottom w:val="none" w:sz="0" w:space="0" w:color="000000"/>
+                <w:top w:val="none" w:sz="0" w:space="0" w:color="000000"/>
+                <w:left w:val="none" w:sz="0" w:space="0" w:color="000000"/>
+                <w:right w:val="none" w:sz="0" w:space="0" w:color="000000"/>
+              </w:pBdr>
+              <w:spacing w:after="100" w:before="100" w:line="240"/>
+              <w:ind w:left="100" w:right="100" w:firstLine="0" w:firstLineChars="0"/>
+              <w:rPr>
+                <w:rFonts w:ascii="Arial" w:hAnsi="Arial" w:eastAsia="Arial" w:cs="Arial"/>
+                <w:i w:val="false"/>
+                <w:b w:val="false"/>
+                <w:u w:val="none"/>
+                <w:strike w:val="false"/>
+                <w:sz w:val="22"/>
+                <w:szCs w:val="22"/>
+                <w:color w:val="000000"/>
+              </w:rPr>
+            </w:pPr>
+            <w:r xmlns:w="http://schemas.openxmlformats.org/wordprocessingml/2006/main" xmlns:wp="http://schemas.openxmlformats.org/drawingml/2006/wordprocessingDrawing" xmlns:r="http://schemas.openxmlformats.org/officeDocument/2006/relationships" xmlns:w14="http://schemas.microsoft.com/office/word/2010/wordml">
+              <w:rPr>
+                <w:rFonts w:ascii="Arial" w:hAnsi="Arial" w:eastAsia="Arial" w:cs="Arial"/>
+                <w:i w:val="false"/>
+                <w:b w:val="false"/>
+                <w:u w:val="none"/>
+                <w:strike w:val="false"/>
+                <w:sz w:val="22"/>
+                <w:szCs w:val="22"/>
+                <w:color w:val="000000"/>
+              </w:rPr>
+              <w:t xml:space="preserve">76.03661</w:t>
+            </w:r>
+          </w:p>
+        </w:tc>
+        <w:tc>
+          <w:tcPr>
+            <w:tcBorders>
+              <w:bottom w:val="single" w:sz="12" w:space="0" w:color="666666"/>
+              <w:top w:val="single" w:sz="6" w:space="0" w:color="666666"/>
+              <w:left w:val="none" w:sz="0" w:space="0" w:color="000000"/>
+              <w:right w:val="none" w:sz="0" w:space="0" w:color="000000"/>
+            </w:tcBorders>
+            <w:shd w:val="clear" w:color="auto" w:fill="FFFFFF"/>
+            <w:tcMar>
+              <w:top w:w="0" w:type="dxa"/>
+              <w:bottom w:w="0" w:type="dxa"/>
+              <w:left w:w="0" w:type="dxa"/>
+              <w:right w:w="0" w:type="dxa"/>
+            </w:tcMar>
+            <w:vAlign w:val="center"/>
+          </w:tcPr>
+          <w:p>
+            <w:pPr>
+              <w:jc w:val="right"/>
+              <w:pBdr>
+                <w:bottom w:val="none" w:sz="0" w:space="0" w:color="000000"/>
+                <w:top w:val="none" w:sz="0" w:space="0" w:color="000000"/>
+                <w:left w:val="none" w:sz="0" w:space="0" w:color="000000"/>
+                <w:right w:val="none" w:sz="0" w:space="0" w:color="000000"/>
+              </w:pBdr>
+              <w:spacing w:after="100" w:before="100" w:line="240"/>
+              <w:ind w:left="100" w:right="100" w:firstLine="0" w:firstLineChars="0"/>
+              <w:rPr>
+                <w:rFonts w:ascii="Arial" w:hAnsi="Arial" w:eastAsia="Arial" w:cs="Arial"/>
+                <w:i w:val="false"/>
+                <w:b w:val="false"/>
+                <w:u w:val="none"/>
+                <w:strike w:val="false"/>
+                <w:sz w:val="22"/>
+                <w:szCs w:val="22"/>
+                <w:color w:val="000000"/>
+              </w:rPr>
+            </w:pPr>
+            <w:r xmlns:w="http://schemas.openxmlformats.org/wordprocessingml/2006/main" xmlns:wp="http://schemas.openxmlformats.org/drawingml/2006/wordprocessingDrawing" xmlns:r="http://schemas.openxmlformats.org/officeDocument/2006/relationships" xmlns:w14="http://schemas.microsoft.com/office/word/2010/wordml">
+              <w:rPr>
+                <w:rFonts w:ascii="Arial" w:hAnsi="Arial" w:eastAsia="Arial" w:cs="Arial"/>
+                <w:i w:val="false"/>
+                <w:b w:val="false"/>
+                <w:u w:val="none"/>
+                <w:strike w:val="false"/>
+                <w:sz w:val="22"/>
+                <w:szCs w:val="22"/>
+                <w:color w:val="000000"/>
+              </w:rPr>
+              <w:t xml:space="preserve">62.9497</w:t>
+            </w:r>
+          </w:p>
+        </w:tc>
+        <w:tc>
+          <w:tcPr>
+            <w:tcBorders>
+              <w:bottom w:val="single" w:sz="12" w:space="0" w:color="666666"/>
+              <w:top w:val="single" w:sz="6" w:space="0" w:color="666666"/>
+              <w:left w:val="none" w:sz="0" w:space="0" w:color="000000"/>
+              <w:right w:val="none" w:sz="0" w:space="0" w:color="000000"/>
+            </w:tcBorders>
+            <w:shd w:val="clear" w:color="auto" w:fill="FFFFFF"/>
+            <w:tcMar>
+              <w:top w:w="0" w:type="dxa"/>
+              <w:bottom w:w="0" w:type="dxa"/>
+              <w:left w:w="0" w:type="dxa"/>
+              <w:right w:w="0" w:type="dxa"/>
+            </w:tcMar>
+            <w:vAlign w:val="center"/>
+          </w:tcPr>
+          <w:p>
+            <w:pPr>
+              <w:jc w:val="right"/>
+              <w:pBdr>
+                <w:bottom w:val="none" w:sz="0" w:space="0" w:color="000000"/>
+                <w:top w:val="none" w:sz="0" w:space="0" w:color="000000"/>
+                <w:left w:val="none" w:sz="0" w:space="0" w:color="000000"/>
+                <w:right w:val="none" w:sz="0" w:space="0" w:color="000000"/>
+              </w:pBdr>
+              <w:spacing w:after="100" w:before="100" w:line="240"/>
+              <w:ind w:left="100" w:right="100" w:firstLine="0" w:firstLineChars="0"/>
+              <w:rPr>
+                <w:rFonts w:ascii="Arial" w:hAnsi="Arial" w:eastAsia="Arial" w:cs="Arial"/>
+                <w:i w:val="false"/>
+                <w:b w:val="false"/>
+                <w:u w:val="none"/>
+                <w:strike w:val="false"/>
+                <w:sz w:val="22"/>
+                <w:szCs w:val="22"/>
+                <w:color w:val="000000"/>
+              </w:rPr>
+            </w:pPr>
+            <w:r xmlns:w="http://schemas.openxmlformats.org/wordprocessingml/2006/main" xmlns:wp="http://schemas.openxmlformats.org/drawingml/2006/wordprocessingDrawing" xmlns:r="http://schemas.openxmlformats.org/officeDocument/2006/relationships" xmlns:w14="http://schemas.microsoft.com/office/word/2010/wordml">
+              <w:rPr>
+                <w:rFonts w:ascii="Arial" w:hAnsi="Arial" w:eastAsia="Arial" w:cs="Arial"/>
+                <w:i w:val="false"/>
+                <w:b w:val="false"/>
+                <w:u w:val="none"/>
+                <w:strike w:val="false"/>
+                <w:sz w:val="22"/>
+                <w:szCs w:val="22"/>
+                <w:color w:val="000000"/>
+              </w:rPr>
+              <w:t xml:space="preserve">12,089.82</w:t>
+            </w:r>
+          </w:p>
+        </w:tc>
+        <w:tc>
+          <w:tcPr>
+            <w:tcBorders>
+              <w:bottom w:val="single" w:sz="12" w:space="0" w:color="666666"/>
+              <w:top w:val="single" w:sz="6" w:space="0" w:color="666666"/>
+              <w:left w:val="none" w:sz="0" w:space="0" w:color="000000"/>
+              <w:right w:val="none" w:sz="0" w:space="0" w:color="000000"/>
+            </w:tcBorders>
+            <w:shd w:val="clear" w:color="auto" w:fill="FFFFFF"/>
+            <w:tcMar>
+              <w:top w:w="0" w:type="dxa"/>
+              <w:bottom w:w="0" w:type="dxa"/>
+              <w:left w:w="0" w:type="dxa"/>
+              <w:right w:w="0" w:type="dxa"/>
+            </w:tcMar>
+            <w:vAlign w:val="center"/>
+          </w:tcPr>
+          <w:p>
+            <w:pPr>
+              <w:jc w:val="right"/>
+              <w:pBdr>
+                <w:bottom w:val="none" w:sz="0" w:space="0" w:color="000000"/>
+                <w:top w:val="none" w:sz="0" w:space="0" w:color="000000"/>
+                <w:left w:val="none" w:sz="0" w:space="0" w:color="000000"/>
+                <w:right w:val="none" w:sz="0" w:space="0" w:color="000000"/>
+              </w:pBdr>
+              <w:spacing w:after="100" w:before="100" w:line="240"/>
+              <w:ind w:left="100" w:right="100" w:firstLine="0" w:firstLineChars="0"/>
+              <w:rPr>
+                <w:rFonts w:ascii="Arial" w:hAnsi="Arial" w:eastAsia="Arial" w:cs="Arial"/>
+                <w:i w:val="false"/>
+                <w:b w:val="false"/>
+                <w:u w:val="none"/>
+                <w:strike w:val="false"/>
+                <w:sz w:val="22"/>
+                <w:szCs w:val="22"/>
+                <w:color w:val="000000"/>
+              </w:rPr>
+            </w:pPr>
+            <w:r xmlns:w="http://schemas.openxmlformats.org/wordprocessingml/2006/main" xmlns:wp="http://schemas.openxmlformats.org/drawingml/2006/wordprocessingDrawing" xmlns:r="http://schemas.openxmlformats.org/officeDocument/2006/relationships" xmlns:w14="http://schemas.microsoft.com/office/word/2010/wordml">
+              <w:rPr>
+                <w:rFonts w:ascii="Arial" w:hAnsi="Arial" w:eastAsia="Arial" w:cs="Arial"/>
+                <w:i w:val="false"/>
+                <w:b w:val="false"/>
+                <w:u w:val="none"/>
+                <w:strike w:val="false"/>
+                <w:sz w:val="22"/>
+                <w:szCs w:val="22"/>
+                <w:color w:val="000000"/>
+              </w:rPr>
+              <w:t xml:space="preserve">159</w:t>
+            </w:r>
+          </w:p>
+        </w:tc>
+      </w:tr>
+    </w:tbl>
+    <w:p>
+      <w:pPr>
+        <w:pStyle w:val="FirstParagraph"/>
+      </w:pPr>
+      <w:r>
+        <w:t xml:space="preserve">Electronics har högst total försäljning (155500), följt av Home och Sports.</w:t>
+      </w:r>
+    </w:p>
+    <w:tbl xmlns:w="http://schemas.openxmlformats.org/wordprocessingml/2006/main" xmlns:r="http://schemas.openxmlformats.org/officeDocument/2006/relationships" xmlns:w14="http://schemas.microsoft.com/office/word/2010/wordml" xmlns:wp="http://schemas.openxmlformats.org/drawingml/2006/wordprocessingDrawing" xmlns:a="http://schemas.openxmlformats.org/drawingml/2006/main" xmlns:pic="http://schemas.openxmlformats.org/drawingml/2006/picture">
+      <w:tblPr>
+        <w:tblLayout w:type="fixed"/>
+        <w:jc w:val="center"/>
+        <w:tblLook w:firstRow="1" w:lastRow="0" w:firstColumn="0" w:lastColumn="0" w:noHBand="0" w:noVBand="1"/>
+      </w:tblPr>
+      <w:tblGrid>
+        <w:gridCol w:w="2282"/>
+        <w:gridCol w:w="1401"/>
+        <w:gridCol w:w="1768"/>
+        <w:gridCol w:w="1512"/>
+        <w:gridCol w:w="1034"/>
+      </w:tblGrid>
+      <w:tr>
+        <w:trPr>
+          <w:trHeight w:val="614" w:hRule="auto"/>
+          <w:tblHeader/>
+        </w:trPr>
+        <w:tc>
+          <w:tcPr>
+            <w:tcBorders>
+              <w:bottom w:val="single" w:sz="12" w:space="0" w:color="666666"/>
+              <w:top w:val="single" w:sz="12" w:space="0" w:color="666666"/>
+              <w:left w:val="none" w:sz="0" w:space="0" w:color="000000"/>
+              <w:right w:val="none" w:sz="0" w:space="0" w:color="000000"/>
+            </w:tcBorders>
+            <w:shd w:val="clear" w:color="auto" w:fill="FFFFFF"/>
+            <w:tcMar>
+              <w:top w:w="0" w:type="dxa"/>
+              <w:bottom w:w="0" w:type="dxa"/>
+              <w:left w:w="0" w:type="dxa"/>
+              <w:right w:w="0" w:type="dxa"/>
+            </w:tcMar>
+            <w:vAlign w:val="center"/>
+          </w:tcPr>
+          <w:p>
+            <w:pPr>
+              <w:jc w:val="left"/>
+              <w:pBdr>
+                <w:bottom w:val="none" w:sz="0" w:space="0" w:color="000000"/>
+                <w:top w:val="none" w:sz="0" w:space="0" w:color="000000"/>
+                <w:left w:val="none" w:sz="0" w:space="0" w:color="000000"/>
+                <w:right w:val="none" w:sz="0" w:space="0" w:color="000000"/>
+              </w:pBdr>
+              <w:spacing w:after="100" w:before="100" w:line="240"/>
+              <w:ind w:left="100" w:right="100" w:firstLine="0" w:firstLineChars="0"/>
+              <w:rPr>
+                <w:rFonts w:ascii="Arial" w:hAnsi="Arial" w:eastAsia="Arial" w:cs="Arial"/>
+                <w:i w:val="false"/>
+                <w:b w:val="true"/>
+                <w:u w:val="none"/>
+                <w:strike w:val="false"/>
+                <w:sz w:val="22"/>
+                <w:szCs w:val="22"/>
+                <w:color w:val="000000"/>
+              </w:rPr>
+            </w:pPr>
+            <w:r xmlns:w="http://schemas.openxmlformats.org/wordprocessingml/2006/main" xmlns:wp="http://schemas.openxmlformats.org/drawingml/2006/wordprocessingDrawing" xmlns:r="http://schemas.openxmlformats.org/officeDocument/2006/relationships" xmlns:w14="http://schemas.microsoft.com/office/word/2010/wordml">
+              <w:rPr>
+                <w:rFonts w:ascii="Arial" w:hAnsi="Arial" w:eastAsia="Arial" w:cs="Arial"/>
+                <w:i w:val="false"/>
+                <w:b w:val="true"/>
+                <w:u w:val="none"/>
+                <w:strike w:val="false"/>
+                <w:sz w:val="22"/>
+                <w:szCs w:val="22"/>
+                <w:color w:val="000000"/>
+              </w:rPr>
+              <w:t xml:space="preserve">customer_segment</w:t>
+            </w:r>
+          </w:p>
+        </w:tc>
+        <w:tc>
+          <w:tcPr>
+            <w:tcBorders>
+              <w:bottom w:val="single" w:sz="12" w:space="0" w:color="666666"/>
+              <w:top w:val="single" w:sz="12" w:space="0" w:color="666666"/>
+              <w:left w:val="none" w:sz="0" w:space="0" w:color="000000"/>
+              <w:right w:val="none" w:sz="0" w:space="0" w:color="000000"/>
+            </w:tcBorders>
+            <w:shd w:val="clear" w:color="auto" w:fill="FFFFFF"/>
+            <w:tcMar>
+              <w:top w:w="0" w:type="dxa"/>
+              <w:bottom w:w="0" w:type="dxa"/>
+              <w:left w:w="0" w:type="dxa"/>
+              <w:right w:w="0" w:type="dxa"/>
+            </w:tcMar>
+            <w:vAlign w:val="center"/>
+          </w:tcPr>
+          <w:p>
+            <w:pPr>
+              <w:jc w:val="right"/>
+              <w:pBdr>
+                <w:bottom w:val="none" w:sz="0" w:space="0" w:color="000000"/>
+                <w:top w:val="none" w:sz="0" w:space="0" w:color="000000"/>
+                <w:left w:val="none" w:sz="0" w:space="0" w:color="000000"/>
+                <w:right w:val="none" w:sz="0" w:space="0" w:color="000000"/>
+              </w:pBdr>
+              <w:spacing w:after="100" w:before="100" w:line="240"/>
+              <w:ind w:left="100" w:right="100" w:firstLine="0" w:firstLineChars="0"/>
+              <w:rPr>
+                <w:rFonts w:ascii="Arial" w:hAnsi="Arial" w:eastAsia="Arial" w:cs="Arial"/>
+                <w:i w:val="false"/>
+                <w:b w:val="true"/>
+                <w:u w:val="none"/>
+                <w:strike w:val="false"/>
+                <w:sz w:val="22"/>
+                <w:szCs w:val="22"/>
+                <w:color w:val="000000"/>
+              </w:rPr>
+            </w:pPr>
+            <w:r xmlns:w="http://schemas.openxmlformats.org/wordprocessingml/2006/main" xmlns:wp="http://schemas.openxmlformats.org/drawingml/2006/wordprocessingDrawing" xmlns:r="http://schemas.openxmlformats.org/officeDocument/2006/relationships" xmlns:w14="http://schemas.microsoft.com/office/word/2010/wordml">
+              <w:rPr>
+                <w:rFonts w:ascii="Arial" w:hAnsi="Arial" w:eastAsia="Arial" w:cs="Arial"/>
+                <w:i w:val="false"/>
+                <w:b w:val="true"/>
+                <w:u w:val="none"/>
+                <w:strike w:val="false"/>
+                <w:sz w:val="22"/>
+                <w:szCs w:val="22"/>
+                <w:color w:val="000000"/>
+              </w:rPr>
+              <w:t xml:space="preserve">avg_order</w:t>
+            </w:r>
+          </w:p>
+        </w:tc>
+        <w:tc>
+          <w:tcPr>
+            <w:tcBorders>
+              <w:bottom w:val="single" w:sz="12" w:space="0" w:color="666666"/>
+              <w:top w:val="single" w:sz="12" w:space="0" w:color="666666"/>
+              <w:left w:val="none" w:sz="0" w:space="0" w:color="000000"/>
+              <w:right w:val="none" w:sz="0" w:space="0" w:color="000000"/>
+            </w:tcBorders>
+            <w:shd w:val="clear" w:color="auto" w:fill="FFFFFF"/>
+            <w:tcMar>
+              <w:top w:w="0" w:type="dxa"/>
+              <w:bottom w:w="0" w:type="dxa"/>
+              <w:left w:w="0" w:type="dxa"/>
+              <w:right w:w="0" w:type="dxa"/>
+            </w:tcMar>
+            <w:vAlign w:val="center"/>
+          </w:tcPr>
+          <w:p>
+            <w:pPr>
+              <w:jc w:val="right"/>
+              <w:pBdr>
+                <w:bottom w:val="none" w:sz="0" w:space="0" w:color="000000"/>
+                <w:top w:val="none" w:sz="0" w:space="0" w:color="000000"/>
+                <w:left w:val="none" w:sz="0" w:space="0" w:color="000000"/>
+                <w:right w:val="none" w:sz="0" w:space="0" w:color="000000"/>
+              </w:pBdr>
+              <w:spacing w:after="100" w:before="100" w:line="240"/>
+              <w:ind w:left="100" w:right="100" w:firstLine="0" w:firstLineChars="0"/>
+              <w:rPr>
+                <w:rFonts w:ascii="Arial" w:hAnsi="Arial" w:eastAsia="Arial" w:cs="Arial"/>
+                <w:i w:val="false"/>
+                <w:b w:val="true"/>
+                <w:u w:val="none"/>
+                <w:strike w:val="false"/>
+                <w:sz w:val="22"/>
+                <w:szCs w:val="22"/>
+                <w:color w:val="000000"/>
+              </w:rPr>
+            </w:pPr>
+            <w:r xmlns:w="http://schemas.openxmlformats.org/wordprocessingml/2006/main" xmlns:wp="http://schemas.openxmlformats.org/drawingml/2006/wordprocessingDrawing" xmlns:r="http://schemas.openxmlformats.org/officeDocument/2006/relationships" xmlns:w14="http://schemas.microsoft.com/office/word/2010/wordml">
+              <w:rPr>
+                <w:rFonts w:ascii="Arial" w:hAnsi="Arial" w:eastAsia="Arial" w:cs="Arial"/>
+                <w:i w:val="false"/>
+                <w:b w:val="true"/>
+                <w:u w:val="none"/>
+                <w:strike w:val="false"/>
+                <w:sz w:val="22"/>
+                <w:szCs w:val="22"/>
+                <w:color w:val="000000"/>
+              </w:rPr>
+              <w:t xml:space="preserve">median_order</w:t>
+            </w:r>
+          </w:p>
+        </w:tc>
+        <w:tc>
+          <w:tcPr>
+            <w:tcBorders>
+              <w:bottom w:val="single" w:sz="12" w:space="0" w:color="666666"/>
+              <w:top w:val="single" w:sz="12" w:space="0" w:color="666666"/>
+              <w:left w:val="none" w:sz="0" w:space="0" w:color="000000"/>
+              <w:right w:val="none" w:sz="0" w:space="0" w:color="000000"/>
+            </w:tcBorders>
+            <w:shd w:val="clear" w:color="auto" w:fill="FFFFFF"/>
+            <w:tcMar>
+              <w:top w:w="0" w:type="dxa"/>
+              <w:bottom w:w="0" w:type="dxa"/>
+              <w:left w:w="0" w:type="dxa"/>
+              <w:right w:w="0" w:type="dxa"/>
+            </w:tcMar>
+            <w:vAlign w:val="center"/>
+          </w:tcPr>
+          <w:p>
+            <w:pPr>
+              <w:jc w:val="right"/>
+              <w:pBdr>
+                <w:bottom w:val="none" w:sz="0" w:space="0" w:color="000000"/>
+                <w:top w:val="none" w:sz="0" w:space="0" w:color="000000"/>
+                <w:left w:val="none" w:sz="0" w:space="0" w:color="000000"/>
+                <w:right w:val="none" w:sz="0" w:space="0" w:color="000000"/>
+              </w:pBdr>
+              <w:spacing w:after="100" w:before="100" w:line="240"/>
+              <w:ind w:left="100" w:right="100" w:firstLine="0" w:firstLineChars="0"/>
+              <w:rPr>
+                <w:rFonts w:ascii="Arial" w:hAnsi="Arial" w:eastAsia="Arial" w:cs="Arial"/>
+                <w:i w:val="false"/>
+                <w:b w:val="true"/>
+                <w:u w:val="none"/>
+                <w:strike w:val="false"/>
+                <w:sz w:val="22"/>
+                <w:szCs w:val="22"/>
+                <w:color w:val="000000"/>
+              </w:rPr>
+            </w:pPr>
+            <w:r xmlns:w="http://schemas.openxmlformats.org/wordprocessingml/2006/main" xmlns:wp="http://schemas.openxmlformats.org/drawingml/2006/wordprocessingDrawing" xmlns:r="http://schemas.openxmlformats.org/officeDocument/2006/relationships" xmlns:w14="http://schemas.microsoft.com/office/word/2010/wordml">
+              <w:rPr>
+                <w:rFonts w:ascii="Arial" w:hAnsi="Arial" w:eastAsia="Arial" w:cs="Arial"/>
+                <w:i w:val="false"/>
+                <w:b w:val="true"/>
+                <w:u w:val="none"/>
+                <w:strike w:val="false"/>
+                <w:sz w:val="22"/>
+                <w:szCs w:val="22"/>
+                <w:color w:val="000000"/>
+              </w:rPr>
+              <w:t xml:space="preserve">total_sales</w:t>
+            </w:r>
+          </w:p>
+        </w:tc>
+        <w:tc>
+          <w:tcPr>
+            <w:tcBorders>
+              <w:bottom w:val="single" w:sz="12" w:space="0" w:color="666666"/>
+              <w:top w:val="single" w:sz="12" w:space="0" w:color="666666"/>
+              <w:left w:val="none" w:sz="0" w:space="0" w:color="000000"/>
+              <w:right w:val="none" w:sz="0" w:space="0" w:color="000000"/>
+            </w:tcBorders>
+            <w:shd w:val="clear" w:color="auto" w:fill="FFFFFF"/>
+            <w:tcMar>
+              <w:top w:w="0" w:type="dxa"/>
+              <w:bottom w:w="0" w:type="dxa"/>
+              <w:left w:w="0" w:type="dxa"/>
+              <w:right w:w="0" w:type="dxa"/>
+            </w:tcMar>
+            <w:vAlign w:val="center"/>
+          </w:tcPr>
+          <w:p>
+            <w:pPr>
+              <w:jc w:val="right"/>
+              <w:pBdr>
+                <w:bottom w:val="none" w:sz="0" w:space="0" w:color="000000"/>
+                <w:top w:val="none" w:sz="0" w:space="0" w:color="000000"/>
+                <w:left w:val="none" w:sz="0" w:space="0" w:color="000000"/>
+                <w:right w:val="none" w:sz="0" w:space="0" w:color="000000"/>
+              </w:pBdr>
+              <w:spacing w:after="100" w:before="100" w:line="240"/>
+              <w:ind w:left="100" w:right="100" w:firstLine="0" w:firstLineChars="0"/>
+              <w:rPr>
+                <w:rFonts w:ascii="Arial" w:hAnsi="Arial" w:eastAsia="Arial" w:cs="Arial"/>
+                <w:i w:val="false"/>
+                <w:b w:val="true"/>
+                <w:u w:val="none"/>
+                <w:strike w:val="false"/>
+                <w:sz w:val="22"/>
+                <w:szCs w:val="22"/>
+                <w:color w:val="000000"/>
+              </w:rPr>
+            </w:pPr>
+            <w:r xmlns:w="http://schemas.openxmlformats.org/wordprocessingml/2006/main" xmlns:wp="http://schemas.openxmlformats.org/drawingml/2006/wordprocessingDrawing" xmlns:r="http://schemas.openxmlformats.org/officeDocument/2006/relationships" xmlns:w14="http://schemas.microsoft.com/office/word/2010/wordml">
+              <w:rPr>
+                <w:rFonts w:ascii="Arial" w:hAnsi="Arial" w:eastAsia="Arial" w:cs="Arial"/>
+                <w:i w:val="false"/>
+                <w:b w:val="true"/>
+                <w:u w:val="none"/>
+                <w:strike w:val="false"/>
+                <w:sz w:val="22"/>
+                <w:szCs w:val="22"/>
+                <w:color w:val="000000"/>
+              </w:rPr>
+              <w:t xml:space="preserve">orders</w:t>
+            </w:r>
+          </w:p>
+        </w:tc>
+      </w:tr>
+      <w:tr>
+        <w:trPr>
+          <w:trHeight w:val="600" w:hRule="auto"/>
+        </w:trPr>
+        <w:tc>
+          <w:tcPr>
+            <w:tcBorders>
+              <w:bottom w:val="single" w:sz="6" w:space="0" w:color="666666"/>
+              <w:top w:val="single" w:sz="12" w:space="0" w:color="666666"/>
+              <w:left w:val="none" w:sz="0" w:space="0" w:color="000000"/>
+              <w:right w:val="none" w:sz="0" w:space="0" w:color="000000"/>
+            </w:tcBorders>
+            <w:shd w:val="clear" w:color="auto" w:fill="FFFFFF"/>
+            <w:tcMar>
+              <w:top w:w="0" w:type="dxa"/>
+              <w:bottom w:w="0" w:type="dxa"/>
+              <w:left w:w="0" w:type="dxa"/>
+              <w:right w:w="0" w:type="dxa"/>
+            </w:tcMar>
+            <w:vAlign w:val="center"/>
+          </w:tcPr>
+          <w:p>
+            <w:pPr>
+              <w:jc w:val="left"/>
+              <w:pBdr>
+                <w:bottom w:val="none" w:sz="0" w:space="0" w:color="000000"/>
+                <w:top w:val="none" w:sz="0" w:space="0" w:color="000000"/>
+                <w:left w:val="none" w:sz="0" w:space="0" w:color="000000"/>
+                <w:right w:val="none" w:sz="0" w:space="0" w:color="000000"/>
+              </w:pBdr>
+              <w:spacing w:after="100" w:before="100" w:line="240"/>
+              <w:ind w:left="100" w:right="100" w:firstLine="0" w:firstLineChars="0"/>
+              <w:rPr>
+                <w:rFonts w:ascii="Arial" w:hAnsi="Arial" w:eastAsia="Arial" w:cs="Arial"/>
+                <w:i w:val="false"/>
+                <w:b w:val="false"/>
+                <w:u w:val="none"/>
+                <w:strike w:val="false"/>
+                <w:sz w:val="22"/>
+                <w:szCs w:val="22"/>
+                <w:color w:val="000000"/>
+              </w:rPr>
+            </w:pPr>
+            <w:r xmlns:w="http://schemas.openxmlformats.org/wordprocessingml/2006/main" xmlns:wp="http://schemas.openxmlformats.org/drawingml/2006/wordprocessingDrawing" xmlns:r="http://schemas.openxmlformats.org/officeDocument/2006/relationships" xmlns:w14="http://schemas.microsoft.com/office/word/2010/wordml">
+              <w:rPr>
+                <w:rFonts w:ascii="Arial" w:hAnsi="Arial" w:eastAsia="Arial" w:cs="Arial"/>
+                <w:i w:val="false"/>
+                <w:b w:val="false"/>
+                <w:u w:val="none"/>
+                <w:strike w:val="false"/>
+                <w:sz w:val="22"/>
+                <w:szCs w:val="22"/>
+                <w:color w:val="000000"/>
+              </w:rPr>
+              <w:t xml:space="preserve">Consumer</w:t>
+            </w:r>
+          </w:p>
+        </w:tc>
+        <w:tc>
+          <w:tcPr>
+            <w:tcBorders>
+              <w:bottom w:val="single" w:sz="6" w:space="0" w:color="666666"/>
+              <w:top w:val="single" w:sz="12" w:space="0" w:color="666666"/>
+              <w:left w:val="none" w:sz="0" w:space="0" w:color="000000"/>
+              <w:right w:val="none" w:sz="0" w:space="0" w:color="000000"/>
+            </w:tcBorders>
+            <w:shd w:val="clear" w:color="auto" w:fill="FFFFFF"/>
+            <w:tcMar>
+              <w:top w:w="0" w:type="dxa"/>
+              <w:bottom w:w="0" w:type="dxa"/>
+              <w:left w:w="0" w:type="dxa"/>
+              <w:right w:w="0" w:type="dxa"/>
+            </w:tcMar>
+            <w:vAlign w:val="center"/>
+          </w:tcPr>
+          <w:p>
+            <w:pPr>
+              <w:jc w:val="right"/>
+              <w:pBdr>
+                <w:bottom w:val="none" w:sz="0" w:space="0" w:color="000000"/>
+                <w:top w:val="none" w:sz="0" w:space="0" w:color="000000"/>
+                <w:left w:val="none" w:sz="0" w:space="0" w:color="000000"/>
+                <w:right w:val="none" w:sz="0" w:space="0" w:color="000000"/>
+              </w:pBdr>
+              <w:spacing w:after="100" w:before="100" w:line="240"/>
+              <w:ind w:left="100" w:right="100" w:firstLine="0" w:firstLineChars="0"/>
+              <w:rPr>
+                <w:rFonts w:ascii="Arial" w:hAnsi="Arial" w:eastAsia="Arial" w:cs="Arial"/>
+                <w:i w:val="false"/>
+                <w:b w:val="false"/>
+                <w:u w:val="none"/>
+                <w:strike w:val="false"/>
+                <w:sz w:val="22"/>
+                <w:szCs w:val="22"/>
+                <w:color w:val="000000"/>
+              </w:rPr>
+            </w:pPr>
+            <w:r xmlns:w="http://schemas.openxmlformats.org/wordprocessingml/2006/main" xmlns:wp="http://schemas.openxmlformats.org/drawingml/2006/wordprocessingDrawing" xmlns:r="http://schemas.openxmlformats.org/officeDocument/2006/relationships" xmlns:w14="http://schemas.microsoft.com/office/word/2010/wordml">
+              <w:rPr>
+                <w:rFonts w:ascii="Arial" w:hAnsi="Arial" w:eastAsia="Arial" w:cs="Arial"/>
+                <w:i w:val="false"/>
+                <w:b w:val="false"/>
+                <w:u w:val="none"/>
+                <w:strike w:val="false"/>
+                <w:sz w:val="22"/>
+                <w:szCs w:val="22"/>
+                <w:color w:val="000000"/>
+              </w:rPr>
+              <w:t xml:space="preserve">322.0004</w:t>
+            </w:r>
+          </w:p>
+        </w:tc>
+        <w:tc>
+          <w:tcPr>
+            <w:tcBorders>
+              <w:bottom w:val="single" w:sz="6" w:space="0" w:color="666666"/>
+              <w:top w:val="single" w:sz="12" w:space="0" w:color="666666"/>
+              <w:left w:val="none" w:sz="0" w:space="0" w:color="000000"/>
+              <w:right w:val="none" w:sz="0" w:space="0" w:color="000000"/>
+            </w:tcBorders>
+            <w:shd w:val="clear" w:color="auto" w:fill="FFFFFF"/>
+            <w:tcMar>
+              <w:top w:w="0" w:type="dxa"/>
+              <w:bottom w:w="0" w:type="dxa"/>
+              <w:left w:w="0" w:type="dxa"/>
+              <w:right w:w="0" w:type="dxa"/>
+            </w:tcMar>
+            <w:vAlign w:val="center"/>
+          </w:tcPr>
+          <w:p>
+            <w:pPr>
+              <w:jc w:val="right"/>
+              <w:pBdr>
+                <w:bottom w:val="none" w:sz="0" w:space="0" w:color="000000"/>
+                <w:top w:val="none" w:sz="0" w:space="0" w:color="000000"/>
+                <w:left w:val="none" w:sz="0" w:space="0" w:color="000000"/>
+                <w:right w:val="none" w:sz="0" w:space="0" w:color="000000"/>
+              </w:pBdr>
+              <w:spacing w:after="100" w:before="100" w:line="240"/>
+              <w:ind w:left="100" w:right="100" w:firstLine="0" w:firstLineChars="0"/>
+              <w:rPr>
+                <w:rFonts w:ascii="Arial" w:hAnsi="Arial" w:eastAsia="Arial" w:cs="Arial"/>
+                <w:i w:val="false"/>
+                <w:b w:val="false"/>
+                <w:u w:val="none"/>
+                <w:strike w:val="false"/>
+                <w:sz w:val="22"/>
+                <w:szCs w:val="22"/>
+                <w:color w:val="000000"/>
+              </w:rPr>
+            </w:pPr>
+            <w:r xmlns:w="http://schemas.openxmlformats.org/wordprocessingml/2006/main" xmlns:wp="http://schemas.openxmlformats.org/drawingml/2006/wordprocessingDrawing" xmlns:r="http://schemas.openxmlformats.org/officeDocument/2006/relationships" xmlns:w14="http://schemas.microsoft.com/office/word/2010/wordml">
+              <w:rPr>
+                <w:rFonts w:ascii="Arial" w:hAnsi="Arial" w:eastAsia="Arial" w:cs="Arial"/>
+                <w:i w:val="false"/>
+                <w:b w:val="false"/>
+                <w:u w:val="none"/>
+                <w:strike w:val="false"/>
+                <w:sz w:val="22"/>
+                <w:szCs w:val="22"/>
+                <w:color w:val="000000"/>
+              </w:rPr>
+              <w:t xml:space="preserve">160.5861</w:t>
+            </w:r>
+          </w:p>
+        </w:tc>
+        <w:tc>
+          <w:tcPr>
+            <w:tcBorders>
+              <w:bottom w:val="single" w:sz="6" w:space="0" w:color="666666"/>
+              <w:top w:val="single" w:sz="12" w:space="0" w:color="666666"/>
+              <w:left w:val="none" w:sz="0" w:space="0" w:color="000000"/>
+              <w:right w:val="none" w:sz="0" w:space="0" w:color="000000"/>
+            </w:tcBorders>
+            <w:shd w:val="clear" w:color="auto" w:fill="FFFFFF"/>
+            <w:tcMar>
+              <w:top w:w="0" w:type="dxa"/>
+              <w:bottom w:w="0" w:type="dxa"/>
+              <w:left w:w="0" w:type="dxa"/>
+              <w:right w:w="0" w:type="dxa"/>
+            </w:tcMar>
+            <w:vAlign w:val="center"/>
+          </w:tcPr>
+          <w:p>
+            <w:pPr>
+              <w:jc w:val="right"/>
+              <w:pBdr>
+                <w:bottom w:val="none" w:sz="0" w:space="0" w:color="000000"/>
+                <w:top w:val="none" w:sz="0" w:space="0" w:color="000000"/>
+                <w:left w:val="none" w:sz="0" w:space="0" w:color="000000"/>
+                <w:right w:val="none" w:sz="0" w:space="0" w:color="000000"/>
+              </w:pBdr>
+              <w:spacing w:after="100" w:before="100" w:line="240"/>
+              <w:ind w:left="100" w:right="100" w:firstLine="0" w:firstLineChars="0"/>
+              <w:rPr>
+                <w:rFonts w:ascii="Arial" w:hAnsi="Arial" w:eastAsia="Arial" w:cs="Arial"/>
+                <w:i w:val="false"/>
+                <w:b w:val="false"/>
+                <w:u w:val="none"/>
+                <w:strike w:val="false"/>
+                <w:sz w:val="22"/>
+                <w:szCs w:val="22"/>
+                <w:color w:val="000000"/>
+              </w:rPr>
+            </w:pPr>
+            <w:r xmlns:w="http://schemas.openxmlformats.org/wordprocessingml/2006/main" xmlns:wp="http://schemas.openxmlformats.org/drawingml/2006/wordprocessingDrawing" xmlns:r="http://schemas.openxmlformats.org/officeDocument/2006/relationships" xmlns:w14="http://schemas.microsoft.com/office/word/2010/wordml">
+              <w:rPr>
+                <w:rFonts w:ascii="Arial" w:hAnsi="Arial" w:eastAsia="Arial" w:cs="Arial"/>
+                <w:i w:val="false"/>
+                <w:b w:val="false"/>
+                <w:u w:val="none"/>
+                <w:strike w:val="false"/>
+                <w:sz w:val="22"/>
+                <w:szCs w:val="22"/>
+                <w:color w:val="000000"/>
+              </w:rPr>
+              <w:t xml:space="preserve">170,338.19</w:t>
+            </w:r>
+          </w:p>
+        </w:tc>
+        <w:tc>
+          <w:tcPr>
+            <w:tcBorders>
+              <w:bottom w:val="single" w:sz="6" w:space="0" w:color="666666"/>
+              <w:top w:val="single" w:sz="12" w:space="0" w:color="666666"/>
+              <w:left w:val="none" w:sz="0" w:space="0" w:color="000000"/>
+              <w:right w:val="none" w:sz="0" w:space="0" w:color="000000"/>
+            </w:tcBorders>
+            <w:shd w:val="clear" w:color="auto" w:fill="FFFFFF"/>
+            <w:tcMar>
+              <w:top w:w="0" w:type="dxa"/>
+              <w:bottom w:w="0" w:type="dxa"/>
+              <w:left w:w="0" w:type="dxa"/>
+              <w:right w:w="0" w:type="dxa"/>
+            </w:tcMar>
+            <w:vAlign w:val="center"/>
+          </w:tcPr>
+          <w:p>
+            <w:pPr>
+              <w:jc w:val="right"/>
+              <w:pBdr>
+                <w:bottom w:val="none" w:sz="0" w:space="0" w:color="000000"/>
+                <w:top w:val="none" w:sz="0" w:space="0" w:color="000000"/>
+                <w:left w:val="none" w:sz="0" w:space="0" w:color="000000"/>
+                <w:right w:val="none" w:sz="0" w:space="0" w:color="000000"/>
+              </w:pBdr>
+              <w:spacing w:after="100" w:before="100" w:line="240"/>
+              <w:ind w:left="100" w:right="100" w:firstLine="0" w:firstLineChars="0"/>
+              <w:rPr>
+                <w:rFonts w:ascii="Arial" w:hAnsi="Arial" w:eastAsia="Arial" w:cs="Arial"/>
+                <w:i w:val="false"/>
+                <w:b w:val="false"/>
+                <w:u w:val="none"/>
+                <w:strike w:val="false"/>
+                <w:sz w:val="22"/>
+                <w:szCs w:val="22"/>
+                <w:color w:val="000000"/>
+              </w:rPr>
+            </w:pPr>
+            <w:r xmlns:w="http://schemas.openxmlformats.org/wordprocessingml/2006/main" xmlns:wp="http://schemas.openxmlformats.org/drawingml/2006/wordprocessingDrawing" xmlns:r="http://schemas.openxmlformats.org/officeDocument/2006/relationships" xmlns:w14="http://schemas.microsoft.com/office/word/2010/wordml">
+              <w:rPr>
+                <w:rFonts w:ascii="Arial" w:hAnsi="Arial" w:eastAsia="Arial" w:cs="Arial"/>
+                <w:i w:val="false"/>
+                <w:b w:val="false"/>
+                <w:u w:val="none"/>
+                <w:strike w:val="false"/>
+                <w:sz w:val="22"/>
+                <w:szCs w:val="22"/>
+                <w:color w:val="000000"/>
+              </w:rPr>
+              <w:t xml:space="preserve">529</w:t>
+            </w:r>
+          </w:p>
+        </w:tc>
+      </w:tr>
+      <w:tr>
+        <w:trPr>
+          <w:trHeight w:val="600" w:hRule="auto"/>
+        </w:trPr>
+        <w:tc>
+          <w:tcPr>
+            <w:tcBorders>
+              <w:bottom w:val="single" w:sz="6" w:space="0" w:color="666666"/>
+              <w:top w:val="single" w:sz="6" w:space="0" w:color="666666"/>
+              <w:left w:val="none" w:sz="0" w:space="0" w:color="000000"/>
+              <w:right w:val="none" w:sz="0" w:space="0" w:color="000000"/>
+            </w:tcBorders>
+            <w:shd w:val="clear" w:color="auto" w:fill="FFFFFF"/>
+            <w:tcMar>
+              <w:top w:w="0" w:type="dxa"/>
+              <w:bottom w:w="0" w:type="dxa"/>
+              <w:left w:w="0" w:type="dxa"/>
+              <w:right w:w="0" w:type="dxa"/>
+            </w:tcMar>
+            <w:vAlign w:val="center"/>
+          </w:tcPr>
+          <w:p>
+            <w:pPr>
+              <w:jc w:val="left"/>
+              <w:pBdr>
+                <w:bottom w:val="none" w:sz="0" w:space="0" w:color="000000"/>
+                <w:top w:val="none" w:sz="0" w:space="0" w:color="000000"/>
+                <w:left w:val="none" w:sz="0" w:space="0" w:color="000000"/>
+                <w:right w:val="none" w:sz="0" w:space="0" w:color="000000"/>
+              </w:pBdr>
+              <w:spacing w:after="100" w:before="100" w:line="240"/>
+              <w:ind w:left="100" w:right="100" w:firstLine="0" w:firstLineChars="0"/>
+              <w:rPr>
+                <w:rFonts w:ascii="Arial" w:hAnsi="Arial" w:eastAsia="Arial" w:cs="Arial"/>
+                <w:i w:val="false"/>
+                <w:b w:val="false"/>
+                <w:u w:val="none"/>
+                <w:strike w:val="false"/>
+                <w:sz w:val="22"/>
+                <w:szCs w:val="22"/>
+                <w:color w:val="000000"/>
+              </w:rPr>
+            </w:pPr>
+            <w:r xmlns:w="http://schemas.openxmlformats.org/wordprocessingml/2006/main" xmlns:wp="http://schemas.openxmlformats.org/drawingml/2006/wordprocessingDrawing" xmlns:r="http://schemas.openxmlformats.org/officeDocument/2006/relationships" xmlns:w14="http://schemas.microsoft.com/office/word/2010/wordml">
+              <w:rPr>
+                <w:rFonts w:ascii="Arial" w:hAnsi="Arial" w:eastAsia="Arial" w:cs="Arial"/>
+                <w:i w:val="false"/>
+                <w:b w:val="false"/>
+                <w:u w:val="none"/>
+                <w:strike w:val="false"/>
+                <w:sz w:val="22"/>
+                <w:szCs w:val="22"/>
+                <w:color w:val="000000"/>
+              </w:rPr>
+              <w:t xml:space="preserve">Small Business</w:t>
+            </w:r>
+          </w:p>
+        </w:tc>
+        <w:tc>
+          <w:tcPr>
+            <w:tcBorders>
+              <w:bottom w:val="single" w:sz="6" w:space="0" w:color="666666"/>
+              <w:top w:val="single" w:sz="6" w:space="0" w:color="666666"/>
+              <w:left w:val="none" w:sz="0" w:space="0" w:color="000000"/>
+              <w:right w:val="none" w:sz="0" w:space="0" w:color="000000"/>
+            </w:tcBorders>
+            <w:shd w:val="clear" w:color="auto" w:fill="FFFFFF"/>
+            <w:tcMar>
+              <w:top w:w="0" w:type="dxa"/>
+              <w:bottom w:w="0" w:type="dxa"/>
+              <w:left w:w="0" w:type="dxa"/>
+              <w:right w:w="0" w:type="dxa"/>
+            </w:tcMar>
+            <w:vAlign w:val="center"/>
+          </w:tcPr>
+          <w:p>
+            <w:pPr>
+              <w:jc w:val="right"/>
+              <w:pBdr>
+                <w:bottom w:val="none" w:sz="0" w:space="0" w:color="000000"/>
+                <w:top w:val="none" w:sz="0" w:space="0" w:color="000000"/>
+                <w:left w:val="none" w:sz="0" w:space="0" w:color="000000"/>
+                <w:right w:val="none" w:sz="0" w:space="0" w:color="000000"/>
+              </w:pBdr>
+              <w:spacing w:after="100" w:before="100" w:line="240"/>
+              <w:ind w:left="100" w:right="100" w:firstLine="0" w:firstLineChars="0"/>
+              <w:rPr>
+                <w:rFonts w:ascii="Arial" w:hAnsi="Arial" w:eastAsia="Arial" w:cs="Arial"/>
+                <w:i w:val="false"/>
+                <w:b w:val="false"/>
+                <w:u w:val="none"/>
+                <w:strike w:val="false"/>
+                <w:sz w:val="22"/>
+                <w:szCs w:val="22"/>
+                <w:color w:val="000000"/>
+              </w:rPr>
+            </w:pPr>
+            <w:r xmlns:w="http://schemas.openxmlformats.org/wordprocessingml/2006/main" xmlns:wp="http://schemas.openxmlformats.org/drawingml/2006/wordprocessingDrawing" xmlns:r="http://schemas.openxmlformats.org/officeDocument/2006/relationships" xmlns:w14="http://schemas.microsoft.com/office/word/2010/wordml">
+              <w:rPr>
+                <w:rFonts w:ascii="Arial" w:hAnsi="Arial" w:eastAsia="Arial" w:cs="Arial"/>
+                <w:i w:val="false"/>
+                <w:b w:val="false"/>
+                <w:u w:val="none"/>
+                <w:strike w:val="false"/>
+                <w:sz w:val="22"/>
+                <w:szCs w:val="22"/>
+                <w:color w:val="000000"/>
+              </w:rPr>
+              <w:t xml:space="preserve">345.5468</w:t>
+            </w:r>
+          </w:p>
+        </w:tc>
+        <w:tc>
+          <w:tcPr>
+            <w:tcBorders>
+              <w:bottom w:val="single" w:sz="6" w:space="0" w:color="666666"/>
+              <w:top w:val="single" w:sz="6" w:space="0" w:color="666666"/>
+              <w:left w:val="none" w:sz="0" w:space="0" w:color="000000"/>
+              <w:right w:val="none" w:sz="0" w:space="0" w:color="000000"/>
+            </w:tcBorders>
+            <w:shd w:val="clear" w:color="auto" w:fill="FFFFFF"/>
+            <w:tcMar>
+              <w:top w:w="0" w:type="dxa"/>
+              <w:bottom w:w="0" w:type="dxa"/>
+              <w:left w:w="0" w:type="dxa"/>
+              <w:right w:w="0" w:type="dxa"/>
+            </w:tcMar>
+            <w:vAlign w:val="center"/>
+          </w:tcPr>
+          <w:p>
+            <w:pPr>
+              <w:jc w:val="right"/>
+              <w:pBdr>
+                <w:bottom w:val="none" w:sz="0" w:space="0" w:color="000000"/>
+                <w:top w:val="none" w:sz="0" w:space="0" w:color="000000"/>
+                <w:left w:val="none" w:sz="0" w:space="0" w:color="000000"/>
+                <w:right w:val="none" w:sz="0" w:space="0" w:color="000000"/>
+              </w:pBdr>
+              <w:spacing w:after="100" w:before="100" w:line="240"/>
+              <w:ind w:left="100" w:right="100" w:firstLine="0" w:firstLineChars="0"/>
+              <w:rPr>
+                <w:rFonts w:ascii="Arial" w:hAnsi="Arial" w:eastAsia="Arial" w:cs="Arial"/>
+                <w:i w:val="false"/>
+                <w:b w:val="false"/>
+                <w:u w:val="none"/>
+                <w:strike w:val="false"/>
+                <w:sz w:val="22"/>
+                <w:szCs w:val="22"/>
+                <w:color w:val="000000"/>
+              </w:rPr>
+            </w:pPr>
+            <w:r xmlns:w="http://schemas.openxmlformats.org/wordprocessingml/2006/main" xmlns:wp="http://schemas.openxmlformats.org/drawingml/2006/wordprocessingDrawing" xmlns:r="http://schemas.openxmlformats.org/officeDocument/2006/relationships" xmlns:w14="http://schemas.microsoft.com/office/word/2010/wordml">
+              <w:rPr>
+                <w:rFonts w:ascii="Arial" w:hAnsi="Arial" w:eastAsia="Arial" w:cs="Arial"/>
+                <w:i w:val="false"/>
+                <w:b w:val="false"/>
+                <w:u w:val="none"/>
+                <w:strike w:val="false"/>
+                <w:sz w:val="22"/>
+                <w:szCs w:val="22"/>
+                <w:color w:val="000000"/>
+              </w:rPr>
+              <w:t xml:space="preserve">161.9966</w:t>
+            </w:r>
+          </w:p>
+        </w:tc>
+        <w:tc>
+          <w:tcPr>
+            <w:tcBorders>
+              <w:bottom w:val="single" w:sz="6" w:space="0" w:color="666666"/>
+              <w:top w:val="single" w:sz="6" w:space="0" w:color="666666"/>
+              <w:left w:val="none" w:sz="0" w:space="0" w:color="000000"/>
+              <w:right w:val="none" w:sz="0" w:space="0" w:color="000000"/>
+            </w:tcBorders>
+            <w:shd w:val="clear" w:color="auto" w:fill="FFFFFF"/>
+            <w:tcMar>
+              <w:top w:w="0" w:type="dxa"/>
+              <w:bottom w:w="0" w:type="dxa"/>
+              <w:left w:w="0" w:type="dxa"/>
+              <w:right w:w="0" w:type="dxa"/>
+            </w:tcMar>
+            <w:vAlign w:val="center"/>
+          </w:tcPr>
+          <w:p>
+            <w:pPr>
+              <w:jc w:val="right"/>
+              <w:pBdr>
+                <w:bottom w:val="none" w:sz="0" w:space="0" w:color="000000"/>
+                <w:top w:val="none" w:sz="0" w:space="0" w:color="000000"/>
+                <w:left w:val="none" w:sz="0" w:space="0" w:color="000000"/>
+                <w:right w:val="none" w:sz="0" w:space="0" w:color="000000"/>
+              </w:pBdr>
+              <w:spacing w:after="100" w:before="100" w:line="240"/>
+              <w:ind w:left="100" w:right="100" w:firstLine="0" w:firstLineChars="0"/>
+              <w:rPr>
+                <w:rFonts w:ascii="Arial" w:hAnsi="Arial" w:eastAsia="Arial" w:cs="Arial"/>
+                <w:i w:val="false"/>
+                <w:b w:val="false"/>
+                <w:u w:val="none"/>
+                <w:strike w:val="false"/>
+                <w:sz w:val="22"/>
+                <w:szCs w:val="22"/>
+                <w:color w:val="000000"/>
+              </w:rPr>
+            </w:pPr>
+            <w:r xmlns:w="http://schemas.openxmlformats.org/wordprocessingml/2006/main" xmlns:wp="http://schemas.openxmlformats.org/drawingml/2006/wordprocessingDrawing" xmlns:r="http://schemas.openxmlformats.org/officeDocument/2006/relationships" xmlns:w14="http://schemas.microsoft.com/office/word/2010/wordml">
+              <w:rPr>
+                <w:rFonts w:ascii="Arial" w:hAnsi="Arial" w:eastAsia="Arial" w:cs="Arial"/>
+                <w:i w:val="false"/>
+                <w:b w:val="false"/>
+                <w:u w:val="none"/>
+                <w:strike w:val="false"/>
+                <w:sz w:val="22"/>
+                <w:szCs w:val="22"/>
+                <w:color w:val="000000"/>
+              </w:rPr>
+              <w:t xml:space="preserve">104,355.14</w:t>
+            </w:r>
+          </w:p>
+        </w:tc>
+        <w:tc>
+          <w:tcPr>
+            <w:tcBorders>
+              <w:bottom w:val="single" w:sz="6" w:space="0" w:color="666666"/>
+              <w:top w:val="single" w:sz="6" w:space="0" w:color="666666"/>
+              <w:left w:val="none" w:sz="0" w:space="0" w:color="000000"/>
+              <w:right w:val="none" w:sz="0" w:space="0" w:color="000000"/>
+            </w:tcBorders>
+            <w:shd w:val="clear" w:color="auto" w:fill="FFFFFF"/>
+            <w:tcMar>
+              <w:top w:w="0" w:type="dxa"/>
+              <w:bottom w:w="0" w:type="dxa"/>
+              <w:left w:w="0" w:type="dxa"/>
+              <w:right w:w="0" w:type="dxa"/>
+            </w:tcMar>
+            <w:vAlign w:val="center"/>
+          </w:tcPr>
+          <w:p>
+            <w:pPr>
+              <w:jc w:val="right"/>
+              <w:pBdr>
+                <w:bottom w:val="none" w:sz="0" w:space="0" w:color="000000"/>
+                <w:top w:val="none" w:sz="0" w:space="0" w:color="000000"/>
+                <w:left w:val="none" w:sz="0" w:space="0" w:color="000000"/>
+                <w:right w:val="none" w:sz="0" w:space="0" w:color="000000"/>
+              </w:pBdr>
+              <w:spacing w:after="100" w:before="100" w:line="240"/>
+              <w:ind w:left="100" w:right="100" w:firstLine="0" w:firstLineChars="0"/>
+              <w:rPr>
+                <w:rFonts w:ascii="Arial" w:hAnsi="Arial" w:eastAsia="Arial" w:cs="Arial"/>
+                <w:i w:val="false"/>
+                <w:b w:val="false"/>
+                <w:u w:val="none"/>
+                <w:strike w:val="false"/>
+                <w:sz w:val="22"/>
+                <w:szCs w:val="22"/>
+                <w:color w:val="000000"/>
+              </w:rPr>
+            </w:pPr>
+            <w:r xmlns:w="http://schemas.openxmlformats.org/wordprocessingml/2006/main" xmlns:wp="http://schemas.openxmlformats.org/drawingml/2006/wordprocessingDrawing" xmlns:r="http://schemas.openxmlformats.org/officeDocument/2006/relationships" xmlns:w14="http://schemas.microsoft.com/office/word/2010/wordml">
+              <w:rPr>
+                <w:rFonts w:ascii="Arial" w:hAnsi="Arial" w:eastAsia="Arial" w:cs="Arial"/>
+                <w:i w:val="false"/>
+                <w:b w:val="false"/>
+                <w:u w:val="none"/>
+                <w:strike w:val="false"/>
+                <w:sz w:val="22"/>
+                <w:szCs w:val="22"/>
+                <w:color w:val="000000"/>
+              </w:rPr>
+              <w:t xml:space="preserve">302</w:t>
+            </w:r>
+          </w:p>
+        </w:tc>
+      </w:tr>
+      <w:tr>
+        <w:trPr>
+          <w:trHeight w:val="615" w:hRule="auto"/>
+        </w:trPr>
+        <w:tc>
+          <w:tcPr>
+            <w:tcBorders>
+              <w:bottom w:val="single" w:sz="12" w:space="0" w:color="666666"/>
+              <w:top w:val="single" w:sz="6" w:space="0" w:color="666666"/>
+              <w:left w:val="none" w:sz="0" w:space="0" w:color="000000"/>
+              <w:right w:val="none" w:sz="0" w:space="0" w:color="000000"/>
+            </w:tcBorders>
+            <w:shd w:val="clear" w:color="auto" w:fill="FFFFFF"/>
+            <w:tcMar>
+              <w:top w:w="0" w:type="dxa"/>
+              <w:bottom w:w="0" w:type="dxa"/>
+              <w:left w:w="0" w:type="dxa"/>
+              <w:right w:w="0" w:type="dxa"/>
+            </w:tcMar>
+            <w:vAlign w:val="center"/>
+          </w:tcPr>
+          <w:p>
+            <w:pPr>
+              <w:jc w:val="left"/>
+              <w:pBdr>
+                <w:bottom w:val="none" w:sz="0" w:space="0" w:color="000000"/>
+                <w:top w:val="none" w:sz="0" w:space="0" w:color="000000"/>
+                <w:left w:val="none" w:sz="0" w:space="0" w:color="000000"/>
+                <w:right w:val="none" w:sz="0" w:space="0" w:color="000000"/>
+              </w:pBdr>
+              <w:spacing w:after="100" w:before="100" w:line="240"/>
+              <w:ind w:left="100" w:right="100" w:firstLine="0" w:firstLineChars="0"/>
+              <w:rPr>
+                <w:rFonts w:ascii="Arial" w:hAnsi="Arial" w:eastAsia="Arial" w:cs="Arial"/>
+                <w:i w:val="false"/>
+                <w:b w:val="false"/>
+                <w:u w:val="none"/>
+                <w:strike w:val="false"/>
+                <w:sz w:val="22"/>
+                <w:szCs w:val="22"/>
+                <w:color w:val="000000"/>
+              </w:rPr>
+            </w:pPr>
+            <w:r xmlns:w="http://schemas.openxmlformats.org/wordprocessingml/2006/main" xmlns:wp="http://schemas.openxmlformats.org/drawingml/2006/wordprocessingDrawing" xmlns:r="http://schemas.openxmlformats.org/officeDocument/2006/relationships" xmlns:w14="http://schemas.microsoft.com/office/word/2010/wordml">
+              <w:rPr>
+                <w:rFonts w:ascii="Arial" w:hAnsi="Arial" w:eastAsia="Arial" w:cs="Arial"/>
+                <w:i w:val="false"/>
+                <w:b w:val="false"/>
+                <w:u w:val="none"/>
+                <w:strike w:val="false"/>
+                <w:sz w:val="22"/>
+                <w:szCs w:val="22"/>
+                <w:color w:val="000000"/>
+              </w:rPr>
+              <w:t xml:space="preserve">Corporate</w:t>
+            </w:r>
+          </w:p>
+        </w:tc>
+        <w:tc>
+          <w:tcPr>
+            <w:tcBorders>
+              <w:bottom w:val="single" w:sz="12" w:space="0" w:color="666666"/>
+              <w:top w:val="single" w:sz="6" w:space="0" w:color="666666"/>
+              <w:left w:val="none" w:sz="0" w:space="0" w:color="000000"/>
+              <w:right w:val="none" w:sz="0" w:space="0" w:color="000000"/>
+            </w:tcBorders>
+            <w:shd w:val="clear" w:color="auto" w:fill="FFFFFF"/>
+            <w:tcMar>
+              <w:top w:w="0" w:type="dxa"/>
+              <w:bottom w:w="0" w:type="dxa"/>
+              <w:left w:w="0" w:type="dxa"/>
+              <w:right w:w="0" w:type="dxa"/>
+            </w:tcMar>
+            <w:vAlign w:val="center"/>
+          </w:tcPr>
+          <w:p>
+            <w:pPr>
+              <w:jc w:val="right"/>
+              <w:pBdr>
+                <w:bottom w:val="none" w:sz="0" w:space="0" w:color="000000"/>
+                <w:top w:val="none" w:sz="0" w:space="0" w:color="000000"/>
+                <w:left w:val="none" w:sz="0" w:space="0" w:color="000000"/>
+                <w:right w:val="none" w:sz="0" w:space="0" w:color="000000"/>
+              </w:pBdr>
+              <w:spacing w:after="100" w:before="100" w:line="240"/>
+              <w:ind w:left="100" w:right="100" w:firstLine="0" w:firstLineChars="0"/>
+              <w:rPr>
+                <w:rFonts w:ascii="Arial" w:hAnsi="Arial" w:eastAsia="Arial" w:cs="Arial"/>
+                <w:i w:val="false"/>
+                <w:b w:val="false"/>
+                <w:u w:val="none"/>
+                <w:strike w:val="false"/>
+                <w:sz w:val="22"/>
+                <w:szCs w:val="22"/>
+                <w:color w:val="000000"/>
+              </w:rPr>
+            </w:pPr>
+            <w:r xmlns:w="http://schemas.openxmlformats.org/wordprocessingml/2006/main" xmlns:wp="http://schemas.openxmlformats.org/drawingml/2006/wordprocessingDrawing" xmlns:r="http://schemas.openxmlformats.org/officeDocument/2006/relationships" xmlns:w14="http://schemas.microsoft.com/office/word/2010/wordml">
+              <w:rPr>
+                <w:rFonts w:ascii="Arial" w:hAnsi="Arial" w:eastAsia="Arial" w:cs="Arial"/>
+                <w:i w:val="false"/>
+                <w:b w:val="false"/>
+                <w:u w:val="none"/>
+                <w:strike w:val="false"/>
+                <w:sz w:val="22"/>
+                <w:szCs w:val="22"/>
+                <w:color w:val="000000"/>
+              </w:rPr>
+              <w:t xml:space="preserve">235.1714</w:t>
+            </w:r>
+          </w:p>
+        </w:tc>
+        <w:tc>
+          <w:tcPr>
+            <w:tcBorders>
+              <w:bottom w:val="single" w:sz="12" w:space="0" w:color="666666"/>
+              <w:top w:val="single" w:sz="6" w:space="0" w:color="666666"/>
+              <w:left w:val="none" w:sz="0" w:space="0" w:color="000000"/>
+              <w:right w:val="none" w:sz="0" w:space="0" w:color="000000"/>
+            </w:tcBorders>
+            <w:shd w:val="clear" w:color="auto" w:fill="FFFFFF"/>
+            <w:tcMar>
+              <w:top w:w="0" w:type="dxa"/>
+              <w:bottom w:w="0" w:type="dxa"/>
+              <w:left w:w="0" w:type="dxa"/>
+              <w:right w:w="0" w:type="dxa"/>
+            </w:tcMar>
+            <w:vAlign w:val="center"/>
+          </w:tcPr>
+          <w:p>
+            <w:pPr>
+              <w:jc w:val="right"/>
+              <w:pBdr>
+                <w:bottom w:val="none" w:sz="0" w:space="0" w:color="000000"/>
+                <w:top w:val="none" w:sz="0" w:space="0" w:color="000000"/>
+                <w:left w:val="none" w:sz="0" w:space="0" w:color="000000"/>
+                <w:right w:val="none" w:sz="0" w:space="0" w:color="000000"/>
+              </w:pBdr>
+              <w:spacing w:after="100" w:before="100" w:line="240"/>
+              <w:ind w:left="100" w:right="100" w:firstLine="0" w:firstLineChars="0"/>
+              <w:rPr>
+                <w:rFonts w:ascii="Arial" w:hAnsi="Arial" w:eastAsia="Arial" w:cs="Arial"/>
+                <w:i w:val="false"/>
+                <w:b w:val="false"/>
+                <w:u w:val="none"/>
+                <w:strike w:val="false"/>
+                <w:sz w:val="22"/>
+                <w:szCs w:val="22"/>
+                <w:color w:val="000000"/>
+              </w:rPr>
+            </w:pPr>
+            <w:r xmlns:w="http://schemas.openxmlformats.org/wordprocessingml/2006/main" xmlns:wp="http://schemas.openxmlformats.org/drawingml/2006/wordprocessingDrawing" xmlns:r="http://schemas.openxmlformats.org/officeDocument/2006/relationships" xmlns:w14="http://schemas.microsoft.com/office/word/2010/wordml">
+              <w:rPr>
+                <w:rFonts w:ascii="Arial" w:hAnsi="Arial" w:eastAsia="Arial" w:cs="Arial"/>
+                <w:i w:val="false"/>
+                <w:b w:val="false"/>
+                <w:u w:val="none"/>
+                <w:strike w:val="false"/>
+                <w:sz w:val="22"/>
+                <w:szCs w:val="22"/>
+                <w:color w:val="000000"/>
+              </w:rPr>
+              <w:t xml:space="preserve">135.3981</w:t>
+            </w:r>
+          </w:p>
+        </w:tc>
+        <w:tc>
+          <w:tcPr>
+            <w:tcBorders>
+              <w:bottom w:val="single" w:sz="12" w:space="0" w:color="666666"/>
+              <w:top w:val="single" w:sz="6" w:space="0" w:color="666666"/>
+              <w:left w:val="none" w:sz="0" w:space="0" w:color="000000"/>
+              <w:right w:val="none" w:sz="0" w:space="0" w:color="000000"/>
+            </w:tcBorders>
+            <w:shd w:val="clear" w:color="auto" w:fill="FFFFFF"/>
+            <w:tcMar>
+              <w:top w:w="0" w:type="dxa"/>
+              <w:bottom w:w="0" w:type="dxa"/>
+              <w:left w:w="0" w:type="dxa"/>
+              <w:right w:w="0" w:type="dxa"/>
+            </w:tcMar>
+            <w:vAlign w:val="center"/>
+          </w:tcPr>
+          <w:p>
+            <w:pPr>
+              <w:jc w:val="right"/>
+              <w:pBdr>
+                <w:bottom w:val="none" w:sz="0" w:space="0" w:color="000000"/>
+                <w:top w:val="none" w:sz="0" w:space="0" w:color="000000"/>
+                <w:left w:val="none" w:sz="0" w:space="0" w:color="000000"/>
+                <w:right w:val="none" w:sz="0" w:space="0" w:color="000000"/>
+              </w:pBdr>
+              <w:spacing w:after="100" w:before="100" w:line="240"/>
+              <w:ind w:left="100" w:right="100" w:firstLine="0" w:firstLineChars="0"/>
+              <w:rPr>
+                <w:rFonts w:ascii="Arial" w:hAnsi="Arial" w:eastAsia="Arial" w:cs="Arial"/>
+                <w:i w:val="false"/>
+                <w:b w:val="false"/>
+                <w:u w:val="none"/>
+                <w:strike w:val="false"/>
+                <w:sz w:val="22"/>
+                <w:szCs w:val="22"/>
+                <w:color w:val="000000"/>
+              </w:rPr>
+            </w:pPr>
+            <w:r xmlns:w="http://schemas.openxmlformats.org/wordprocessingml/2006/main" xmlns:wp="http://schemas.openxmlformats.org/drawingml/2006/wordprocessingDrawing" xmlns:r="http://schemas.openxmlformats.org/officeDocument/2006/relationships" xmlns:w14="http://schemas.microsoft.com/office/word/2010/wordml">
+              <w:rPr>
+                <w:rFonts w:ascii="Arial" w:hAnsi="Arial" w:eastAsia="Arial" w:cs="Arial"/>
+                <w:i w:val="false"/>
+                <w:b w:val="false"/>
+                <w:u w:val="none"/>
+                <w:strike w:val="false"/>
+                <w:sz w:val="22"/>
+                <w:szCs w:val="22"/>
+                <w:color w:val="000000"/>
+              </w:rPr>
+              <w:t xml:space="preserve">39,743.96</w:t>
+            </w:r>
+          </w:p>
+        </w:tc>
+        <w:tc>
+          <w:tcPr>
+            <w:tcBorders>
+              <w:bottom w:val="single" w:sz="12" w:space="0" w:color="666666"/>
+              <w:top w:val="single" w:sz="6" w:space="0" w:color="666666"/>
+              <w:left w:val="none" w:sz="0" w:space="0" w:color="000000"/>
+              <w:right w:val="none" w:sz="0" w:space="0" w:color="000000"/>
+            </w:tcBorders>
+            <w:shd w:val="clear" w:color="auto" w:fill="FFFFFF"/>
+            <w:tcMar>
+              <w:top w:w="0" w:type="dxa"/>
+              <w:bottom w:w="0" w:type="dxa"/>
+              <w:left w:w="0" w:type="dxa"/>
+              <w:right w:w="0" w:type="dxa"/>
+            </w:tcMar>
+            <w:vAlign w:val="center"/>
+          </w:tcPr>
+          <w:p>
+            <w:pPr>
+              <w:jc w:val="right"/>
+              <w:pBdr>
+                <w:bottom w:val="none" w:sz="0" w:space="0" w:color="000000"/>
+                <w:top w:val="none" w:sz="0" w:space="0" w:color="000000"/>
+                <w:left w:val="none" w:sz="0" w:space="0" w:color="000000"/>
+                <w:right w:val="none" w:sz="0" w:space="0" w:color="000000"/>
+              </w:pBdr>
+              <w:spacing w:after="100" w:before="100" w:line="240"/>
+              <w:ind w:left="100" w:right="100" w:firstLine="0" w:firstLineChars="0"/>
+              <w:rPr>
+                <w:rFonts w:ascii="Arial" w:hAnsi="Arial" w:eastAsia="Arial" w:cs="Arial"/>
+                <w:i w:val="false"/>
+                <w:b w:val="false"/>
+                <w:u w:val="none"/>
+                <w:strike w:val="false"/>
+                <w:sz w:val="22"/>
+                <w:szCs w:val="22"/>
+                <w:color w:val="000000"/>
+              </w:rPr>
+            </w:pPr>
+            <w:r xmlns:w="http://schemas.openxmlformats.org/wordprocessingml/2006/main" xmlns:wp="http://schemas.openxmlformats.org/drawingml/2006/wordprocessingDrawing" xmlns:r="http://schemas.openxmlformats.org/officeDocument/2006/relationships" xmlns:w14="http://schemas.microsoft.com/office/word/2010/wordml">
+              <w:rPr>
+                <w:rFonts w:ascii="Arial" w:hAnsi="Arial" w:eastAsia="Arial" w:cs="Arial"/>
+                <w:i w:val="false"/>
+                <w:b w:val="false"/>
+                <w:u w:val="none"/>
+                <w:strike w:val="false"/>
+                <w:sz w:val="22"/>
+                <w:szCs w:val="22"/>
+                <w:color w:val="000000"/>
+              </w:rPr>
+              <w:t xml:space="preserve">169</w:t>
+            </w:r>
+          </w:p>
+        </w:tc>
+      </w:tr>
+    </w:tbl>
+    <w:p>
+      <w:pPr>
+        <w:pStyle w:val="BodyText"/>
+      </w:pPr>
+      <w:r>
+        <w:t xml:space="preserve">Consumer genererar mest total försäljning (170338), medan Small Business spenderar mest per köp (346). Corporate bidrar minst både i antal ordrar (169) och total försäljning (39744).</w:t>
+      </w:r>
+    </w:p>
+    <w:tbl xmlns:w="http://schemas.openxmlformats.org/wordprocessingml/2006/main" xmlns:r="http://schemas.openxmlformats.org/officeDocument/2006/relationships" xmlns:w14="http://schemas.microsoft.com/office/word/2010/wordml" xmlns:wp="http://schemas.openxmlformats.org/drawingml/2006/wordprocessingDrawing" xmlns:a="http://schemas.openxmlformats.org/drawingml/2006/main" xmlns:pic="http://schemas.openxmlformats.org/drawingml/2006/picture">
+      <w:tblPr>
+        <w:tblLayout w:type="fixed"/>
+        <w:jc w:val="center"/>
+        <w:tblLook w:firstRow="1" w:lastRow="0" w:firstColumn="0" w:lastColumn="0" w:noHBand="0" w:noVBand="1"/>
+      </w:tblPr>
+      <w:tblGrid>
+        <w:gridCol w:w="1022"/>
+        <w:gridCol w:w="1512"/>
+        <w:gridCol w:w="1401"/>
+        <w:gridCol w:w="1034"/>
+        <w:gridCol w:w="1780"/>
+      </w:tblGrid>
+      <w:tr>
+        <w:trPr>
+          <w:trHeight w:val="614" w:hRule="auto"/>
+          <w:tblHeader/>
+        </w:trPr>
+        <w:tc>
+          <w:tcPr>
+            <w:tcBorders>
+              <w:bottom w:val="single" w:sz="12" w:space="0" w:color="666666"/>
+              <w:top w:val="single" w:sz="12" w:space="0" w:color="666666"/>
+              <w:left w:val="none" w:sz="0" w:space="0" w:color="000000"/>
+              <w:right w:val="none" w:sz="0" w:space="0" w:color="000000"/>
+            </w:tcBorders>
+            <w:shd w:val="clear" w:color="auto" w:fill="FFFFFF"/>
+            <w:tcMar>
+              <w:top w:w="0" w:type="dxa"/>
+              <w:bottom w:w="0" w:type="dxa"/>
+              <w:left w:w="0" w:type="dxa"/>
+              <w:right w:w="0" w:type="dxa"/>
+            </w:tcMar>
+            <w:vAlign w:val="center"/>
+          </w:tcPr>
+          <w:p>
+            <w:pPr>
+              <w:jc w:val="left"/>
+              <w:pBdr>
+                <w:bottom w:val="none" w:sz="0" w:space="0" w:color="000000"/>
+                <w:top w:val="none" w:sz="0" w:space="0" w:color="000000"/>
+                <w:left w:val="none" w:sz="0" w:space="0" w:color="000000"/>
+                <w:right w:val="none" w:sz="0" w:space="0" w:color="000000"/>
+              </w:pBdr>
+              <w:spacing w:after="100" w:before="100" w:line="240"/>
+              <w:ind w:left="100" w:right="100" w:firstLine="0" w:firstLineChars="0"/>
+              <w:rPr>
+                <w:rFonts w:ascii="Arial" w:hAnsi="Arial" w:eastAsia="Arial" w:cs="Arial"/>
+                <w:i w:val="false"/>
+                <w:b w:val="true"/>
+                <w:u w:val="none"/>
+                <w:strike w:val="false"/>
+                <w:sz w:val="22"/>
+                <w:szCs w:val="22"/>
+                <w:color w:val="000000"/>
+              </w:rPr>
+            </w:pPr>
+            <w:r xmlns:w="http://schemas.openxmlformats.org/wordprocessingml/2006/main" xmlns:wp="http://schemas.openxmlformats.org/drawingml/2006/wordprocessingDrawing" xmlns:r="http://schemas.openxmlformats.org/officeDocument/2006/relationships" xmlns:w14="http://schemas.microsoft.com/office/word/2010/wordml">
+              <w:rPr>
+                <w:rFonts w:ascii="Arial" w:hAnsi="Arial" w:eastAsia="Arial" w:cs="Arial"/>
+                <w:i w:val="false"/>
+                <w:b w:val="true"/>
+                <w:u w:val="none"/>
+                <w:strike w:val="false"/>
+                <w:sz w:val="22"/>
+                <w:szCs w:val="22"/>
+                <w:color w:val="000000"/>
+              </w:rPr>
+              <w:t xml:space="preserve">region</w:t>
+            </w:r>
+          </w:p>
+        </w:tc>
+        <w:tc>
+          <w:tcPr>
+            <w:tcBorders>
+              <w:bottom w:val="single" w:sz="12" w:space="0" w:color="666666"/>
+              <w:top w:val="single" w:sz="12" w:space="0" w:color="666666"/>
+              <w:left w:val="none" w:sz="0" w:space="0" w:color="000000"/>
+              <w:right w:val="none" w:sz="0" w:space="0" w:color="000000"/>
+            </w:tcBorders>
+            <w:shd w:val="clear" w:color="auto" w:fill="FFFFFF"/>
+            <w:tcMar>
+              <w:top w:w="0" w:type="dxa"/>
+              <w:bottom w:w="0" w:type="dxa"/>
+              <w:left w:w="0" w:type="dxa"/>
+              <w:right w:w="0" w:type="dxa"/>
+            </w:tcMar>
+            <w:vAlign w:val="center"/>
+          </w:tcPr>
+          <w:p>
+            <w:pPr>
+              <w:jc w:val="right"/>
+              <w:pBdr>
+                <w:bottom w:val="none" w:sz="0" w:space="0" w:color="000000"/>
+                <w:top w:val="none" w:sz="0" w:space="0" w:color="000000"/>
+                <w:left w:val="none" w:sz="0" w:space="0" w:color="000000"/>
+                <w:right w:val="none" w:sz="0" w:space="0" w:color="000000"/>
+              </w:pBdr>
+              <w:spacing w:after="100" w:before="100" w:line="240"/>
+              <w:ind w:left="100" w:right="100" w:firstLine="0" w:firstLineChars="0"/>
+              <w:rPr>
+                <w:rFonts w:ascii="Arial" w:hAnsi="Arial" w:eastAsia="Arial" w:cs="Arial"/>
+                <w:i w:val="false"/>
+                <w:b w:val="true"/>
+                <w:u w:val="none"/>
+                <w:strike w:val="false"/>
+                <w:sz w:val="22"/>
+                <w:szCs w:val="22"/>
+                <w:color w:val="000000"/>
+              </w:rPr>
+            </w:pPr>
+            <w:r xmlns:w="http://schemas.openxmlformats.org/wordprocessingml/2006/main" xmlns:wp="http://schemas.openxmlformats.org/drawingml/2006/wordprocessingDrawing" xmlns:r="http://schemas.openxmlformats.org/officeDocument/2006/relationships" xmlns:w14="http://schemas.microsoft.com/office/word/2010/wordml">
+              <w:rPr>
+                <w:rFonts w:ascii="Arial" w:hAnsi="Arial" w:eastAsia="Arial" w:cs="Arial"/>
+                <w:i w:val="false"/>
+                <w:b w:val="true"/>
+                <w:u w:val="none"/>
+                <w:strike w:val="false"/>
+                <w:sz w:val="22"/>
+                <w:szCs w:val="22"/>
+                <w:color w:val="000000"/>
+              </w:rPr>
+              <w:t xml:space="preserve">total_sales</w:t>
+            </w:r>
+          </w:p>
+        </w:tc>
+        <w:tc>
+          <w:tcPr>
+            <w:tcBorders>
+              <w:bottom w:val="single" w:sz="12" w:space="0" w:color="666666"/>
+              <w:top w:val="single" w:sz="12" w:space="0" w:color="666666"/>
+              <w:left w:val="none" w:sz="0" w:space="0" w:color="000000"/>
+              <w:right w:val="none" w:sz="0" w:space="0" w:color="000000"/>
+            </w:tcBorders>
+            <w:shd w:val="clear" w:color="auto" w:fill="FFFFFF"/>
+            <w:tcMar>
+              <w:top w:w="0" w:type="dxa"/>
+              <w:bottom w:w="0" w:type="dxa"/>
+              <w:left w:w="0" w:type="dxa"/>
+              <w:right w:w="0" w:type="dxa"/>
+            </w:tcMar>
+            <w:vAlign w:val="center"/>
+          </w:tcPr>
+          <w:p>
+            <w:pPr>
+              <w:jc w:val="right"/>
+              <w:pBdr>
+                <w:bottom w:val="none" w:sz="0" w:space="0" w:color="000000"/>
+                <w:top w:val="none" w:sz="0" w:space="0" w:color="000000"/>
+                <w:left w:val="none" w:sz="0" w:space="0" w:color="000000"/>
+                <w:right w:val="none" w:sz="0" w:space="0" w:color="000000"/>
+              </w:pBdr>
+              <w:spacing w:after="100" w:before="100" w:line="240"/>
+              <w:ind w:left="100" w:right="100" w:firstLine="0" w:firstLineChars="0"/>
+              <w:rPr>
+                <w:rFonts w:ascii="Arial" w:hAnsi="Arial" w:eastAsia="Arial" w:cs="Arial"/>
+                <w:i w:val="false"/>
+                <w:b w:val="true"/>
+                <w:u w:val="none"/>
+                <w:strike w:val="false"/>
+                <w:sz w:val="22"/>
+                <w:szCs w:val="22"/>
+                <w:color w:val="000000"/>
+              </w:rPr>
+            </w:pPr>
+            <w:r xmlns:w="http://schemas.openxmlformats.org/wordprocessingml/2006/main" xmlns:wp="http://schemas.openxmlformats.org/drawingml/2006/wordprocessingDrawing" xmlns:r="http://schemas.openxmlformats.org/officeDocument/2006/relationships" xmlns:w14="http://schemas.microsoft.com/office/word/2010/wordml">
+              <w:rPr>
+                <w:rFonts w:ascii="Arial" w:hAnsi="Arial" w:eastAsia="Arial" w:cs="Arial"/>
+                <w:i w:val="false"/>
+                <w:b w:val="true"/>
+                <w:u w:val="none"/>
+                <w:strike w:val="false"/>
+                <w:sz w:val="22"/>
+                <w:szCs w:val="22"/>
+                <w:color w:val="000000"/>
+              </w:rPr>
+              <w:t xml:space="preserve">avg_order</w:t>
+            </w:r>
+          </w:p>
+        </w:tc>
+        <w:tc>
+          <w:tcPr>
+            <w:tcBorders>
+              <w:bottom w:val="single" w:sz="12" w:space="0" w:color="666666"/>
+              <w:top w:val="single" w:sz="12" w:space="0" w:color="666666"/>
+              <w:left w:val="none" w:sz="0" w:space="0" w:color="000000"/>
+              <w:right w:val="none" w:sz="0" w:space="0" w:color="000000"/>
+            </w:tcBorders>
+            <w:shd w:val="clear" w:color="auto" w:fill="FFFFFF"/>
+            <w:tcMar>
+              <w:top w:w="0" w:type="dxa"/>
+              <w:bottom w:w="0" w:type="dxa"/>
+              <w:left w:w="0" w:type="dxa"/>
+              <w:right w:w="0" w:type="dxa"/>
+            </w:tcMar>
+            <w:vAlign w:val="center"/>
+          </w:tcPr>
+          <w:p>
+            <w:pPr>
+              <w:jc w:val="right"/>
+              <w:pBdr>
+                <w:bottom w:val="none" w:sz="0" w:space="0" w:color="000000"/>
+                <w:top w:val="none" w:sz="0" w:space="0" w:color="000000"/>
+                <w:left w:val="none" w:sz="0" w:space="0" w:color="000000"/>
+                <w:right w:val="none" w:sz="0" w:space="0" w:color="000000"/>
+              </w:pBdr>
+              <w:spacing w:after="100" w:before="100" w:line="240"/>
+              <w:ind w:left="100" w:right="100" w:firstLine="0" w:firstLineChars="0"/>
+              <w:rPr>
+                <w:rFonts w:ascii="Arial" w:hAnsi="Arial" w:eastAsia="Arial" w:cs="Arial"/>
+                <w:i w:val="false"/>
+                <w:b w:val="true"/>
+                <w:u w:val="none"/>
+                <w:strike w:val="false"/>
+                <w:sz w:val="22"/>
+                <w:szCs w:val="22"/>
+                <w:color w:val="000000"/>
+              </w:rPr>
+            </w:pPr>
+            <w:r xmlns:w="http://schemas.openxmlformats.org/wordprocessingml/2006/main" xmlns:wp="http://schemas.openxmlformats.org/drawingml/2006/wordprocessingDrawing" xmlns:r="http://schemas.openxmlformats.org/officeDocument/2006/relationships" xmlns:w14="http://schemas.microsoft.com/office/word/2010/wordml">
+              <w:rPr>
+                <w:rFonts w:ascii="Arial" w:hAnsi="Arial" w:eastAsia="Arial" w:cs="Arial"/>
+                <w:i w:val="false"/>
+                <w:b w:val="true"/>
+                <w:u w:val="none"/>
+                <w:strike w:val="false"/>
+                <w:sz w:val="22"/>
+                <w:szCs w:val="22"/>
+                <w:color w:val="000000"/>
+              </w:rPr>
+              <w:t xml:space="preserve">orders</w:t>
+            </w:r>
+          </w:p>
+        </w:tc>
+        <w:tc>
+          <w:tcPr>
+            <w:tcBorders>
+              <w:bottom w:val="single" w:sz="12" w:space="0" w:color="666666"/>
+              <w:top w:val="single" w:sz="12" w:space="0" w:color="666666"/>
+              <w:left w:val="none" w:sz="0" w:space="0" w:color="000000"/>
+              <w:right w:val="none" w:sz="0" w:space="0" w:color="000000"/>
+            </w:tcBorders>
+            <w:shd w:val="clear" w:color="auto" w:fill="FFFFFF"/>
+            <w:tcMar>
+              <w:top w:w="0" w:type="dxa"/>
+              <w:bottom w:w="0" w:type="dxa"/>
+              <w:left w:w="0" w:type="dxa"/>
+              <w:right w:w="0" w:type="dxa"/>
+            </w:tcMar>
+            <w:vAlign w:val="center"/>
+          </w:tcPr>
+          <w:p>
+            <w:pPr>
+              <w:jc w:val="right"/>
+              <w:pBdr>
+                <w:bottom w:val="none" w:sz="0" w:space="0" w:color="000000"/>
+                <w:top w:val="none" w:sz="0" w:space="0" w:color="000000"/>
+                <w:left w:val="none" w:sz="0" w:space="0" w:color="000000"/>
+                <w:right w:val="none" w:sz="0" w:space="0" w:color="000000"/>
+              </w:pBdr>
+              <w:spacing w:after="100" w:before="100" w:line="240"/>
+              <w:ind w:left="100" w:right="100" w:firstLine="0" w:firstLineChars="0"/>
+              <w:rPr>
+                <w:rFonts w:ascii="Arial" w:hAnsi="Arial" w:eastAsia="Arial" w:cs="Arial"/>
+                <w:i w:val="false"/>
+                <w:b w:val="true"/>
+                <w:u w:val="none"/>
+                <w:strike w:val="false"/>
+                <w:sz w:val="22"/>
+                <w:szCs w:val="22"/>
+                <w:color w:val="000000"/>
+              </w:rPr>
+            </w:pPr>
+            <w:r xmlns:w="http://schemas.openxmlformats.org/wordprocessingml/2006/main" xmlns:wp="http://schemas.openxmlformats.org/drawingml/2006/wordprocessingDrawing" xmlns:r="http://schemas.openxmlformats.org/officeDocument/2006/relationships" xmlns:w14="http://schemas.microsoft.com/office/word/2010/wordml">
+              <w:rPr>
+                <w:rFonts w:ascii="Arial" w:hAnsi="Arial" w:eastAsia="Arial" w:cs="Arial"/>
+                <w:i w:val="false"/>
+                <w:b w:val="true"/>
+                <w:u w:val="none"/>
+                <w:strike w:val="false"/>
+                <w:sz w:val="22"/>
+                <w:szCs w:val="22"/>
+                <w:color w:val="000000"/>
+              </w:rPr>
+              <w:t xml:space="preserve">sales_percent</w:t>
+            </w:r>
+          </w:p>
+        </w:tc>
+      </w:tr>
+      <w:tr>
+        <w:trPr>
+          <w:trHeight w:val="600" w:hRule="auto"/>
+        </w:trPr>
+        <w:tc>
+          <w:tcPr>
+            <w:tcBorders>
+              <w:bottom w:val="single" w:sz="6" w:space="0" w:color="666666"/>
+              <w:top w:val="single" w:sz="12" w:space="0" w:color="666666"/>
+              <w:left w:val="none" w:sz="0" w:space="0" w:color="000000"/>
+              <w:right w:val="none" w:sz="0" w:space="0" w:color="000000"/>
+            </w:tcBorders>
+            <w:shd w:val="clear" w:color="auto" w:fill="FFFFFF"/>
+            <w:tcMar>
+              <w:top w:w="0" w:type="dxa"/>
+              <w:bottom w:w="0" w:type="dxa"/>
+              <w:left w:w="0" w:type="dxa"/>
+              <w:right w:w="0" w:type="dxa"/>
+            </w:tcMar>
+            <w:vAlign w:val="center"/>
+          </w:tcPr>
+          <w:p>
+            <w:pPr>
+              <w:jc w:val="left"/>
+              <w:pBdr>
+                <w:bottom w:val="none" w:sz="0" w:space="0" w:color="000000"/>
+                <w:top w:val="none" w:sz="0" w:space="0" w:color="000000"/>
+                <w:left w:val="none" w:sz="0" w:space="0" w:color="000000"/>
+                <w:right w:val="none" w:sz="0" w:space="0" w:color="000000"/>
+              </w:pBdr>
+              <w:spacing w:after="100" w:before="100" w:line="240"/>
+              <w:ind w:left="100" w:right="100" w:firstLine="0" w:firstLineChars="0"/>
+              <w:rPr>
+                <w:rFonts w:ascii="Arial" w:hAnsi="Arial" w:eastAsia="Arial" w:cs="Arial"/>
+                <w:i w:val="false"/>
+                <w:b w:val="false"/>
+                <w:u w:val="none"/>
+                <w:strike w:val="false"/>
+                <w:sz w:val="22"/>
+                <w:szCs w:val="22"/>
+                <w:color w:val="000000"/>
+              </w:rPr>
+            </w:pPr>
+            <w:r xmlns:w="http://schemas.openxmlformats.org/wordprocessingml/2006/main" xmlns:wp="http://schemas.openxmlformats.org/drawingml/2006/wordprocessingDrawing" xmlns:r="http://schemas.openxmlformats.org/officeDocument/2006/relationships" xmlns:w14="http://schemas.microsoft.com/office/word/2010/wordml">
+              <w:rPr>
+                <w:rFonts w:ascii="Arial" w:hAnsi="Arial" w:eastAsia="Arial" w:cs="Arial"/>
+                <w:i w:val="false"/>
+                <w:b w:val="false"/>
+                <w:u w:val="none"/>
+                <w:strike w:val="false"/>
+                <w:sz w:val="22"/>
+                <w:szCs w:val="22"/>
+                <w:color w:val="000000"/>
+              </w:rPr>
+              <w:t xml:space="preserve">North</w:t>
+            </w:r>
+          </w:p>
+        </w:tc>
+        <w:tc>
+          <w:tcPr>
+            <w:tcBorders>
+              <w:bottom w:val="single" w:sz="6" w:space="0" w:color="666666"/>
+              <w:top w:val="single" w:sz="12" w:space="0" w:color="666666"/>
+              <w:left w:val="none" w:sz="0" w:space="0" w:color="000000"/>
+              <w:right w:val="none" w:sz="0" w:space="0" w:color="000000"/>
+            </w:tcBorders>
+            <w:shd w:val="clear" w:color="auto" w:fill="FFFFFF"/>
+            <w:tcMar>
+              <w:top w:w="0" w:type="dxa"/>
+              <w:bottom w:w="0" w:type="dxa"/>
+              <w:left w:w="0" w:type="dxa"/>
+              <w:right w:w="0" w:type="dxa"/>
+            </w:tcMar>
+            <w:vAlign w:val="center"/>
+          </w:tcPr>
+          <w:p>
+            <w:pPr>
+              <w:jc w:val="right"/>
+              <w:pBdr>
+                <w:bottom w:val="none" w:sz="0" w:space="0" w:color="000000"/>
+                <w:top w:val="none" w:sz="0" w:space="0" w:color="000000"/>
+                <w:left w:val="none" w:sz="0" w:space="0" w:color="000000"/>
+                <w:right w:val="none" w:sz="0" w:space="0" w:color="000000"/>
+              </w:pBdr>
+              <w:spacing w:after="100" w:before="100" w:line="240"/>
+              <w:ind w:left="100" w:right="100" w:firstLine="0" w:firstLineChars="0"/>
+              <w:rPr>
+                <w:rFonts w:ascii="Arial" w:hAnsi="Arial" w:eastAsia="Arial" w:cs="Arial"/>
+                <w:i w:val="false"/>
+                <w:b w:val="false"/>
+                <w:u w:val="none"/>
+                <w:strike w:val="false"/>
+                <w:sz w:val="22"/>
+                <w:szCs w:val="22"/>
+                <w:color w:val="000000"/>
+              </w:rPr>
+            </w:pPr>
+            <w:r xmlns:w="http://schemas.openxmlformats.org/wordprocessingml/2006/main" xmlns:wp="http://schemas.openxmlformats.org/drawingml/2006/wordprocessingDrawing" xmlns:r="http://schemas.openxmlformats.org/officeDocument/2006/relationships" xmlns:w14="http://schemas.microsoft.com/office/word/2010/wordml">
+              <w:rPr>
+                <w:rFonts w:ascii="Arial" w:hAnsi="Arial" w:eastAsia="Arial" w:cs="Arial"/>
+                <w:i w:val="false"/>
+                <w:b w:val="false"/>
+                <w:u w:val="none"/>
+                <w:strike w:val="false"/>
+                <w:sz w:val="22"/>
+                <w:szCs w:val="22"/>
+                <w:color w:val="000000"/>
+              </w:rPr>
+              <w:t xml:space="preserve">116,544.40</w:t>
+            </w:r>
+          </w:p>
+        </w:tc>
+        <w:tc>
+          <w:tcPr>
+            <w:tcBorders>
+              <w:bottom w:val="single" w:sz="6" w:space="0" w:color="666666"/>
+              <w:top w:val="single" w:sz="12" w:space="0" w:color="666666"/>
+              <w:left w:val="none" w:sz="0" w:space="0" w:color="000000"/>
+              <w:right w:val="none" w:sz="0" w:space="0" w:color="000000"/>
+            </w:tcBorders>
+            <w:shd w:val="clear" w:color="auto" w:fill="FFFFFF"/>
+            <w:tcMar>
+              <w:top w:w="0" w:type="dxa"/>
+              <w:bottom w:w="0" w:type="dxa"/>
+              <w:left w:w="0" w:type="dxa"/>
+              <w:right w:w="0" w:type="dxa"/>
+            </w:tcMar>
+            <w:vAlign w:val="center"/>
+          </w:tcPr>
+          <w:p>
+            <w:pPr>
+              <w:jc w:val="right"/>
+              <w:pBdr>
+                <w:bottom w:val="none" w:sz="0" w:space="0" w:color="000000"/>
+                <w:top w:val="none" w:sz="0" w:space="0" w:color="000000"/>
+                <w:left w:val="none" w:sz="0" w:space="0" w:color="000000"/>
+                <w:right w:val="none" w:sz="0" w:space="0" w:color="000000"/>
+              </w:pBdr>
+              <w:spacing w:after="100" w:before="100" w:line="240"/>
+              <w:ind w:left="100" w:right="100" w:firstLine="0" w:firstLineChars="0"/>
+              <w:rPr>
+                <w:rFonts w:ascii="Arial" w:hAnsi="Arial" w:eastAsia="Arial" w:cs="Arial"/>
+                <w:i w:val="false"/>
+                <w:b w:val="false"/>
+                <w:u w:val="none"/>
+                <w:strike w:val="false"/>
+                <w:sz w:val="22"/>
+                <w:szCs w:val="22"/>
+                <w:color w:val="000000"/>
+              </w:rPr>
+            </w:pPr>
+            <w:r xmlns:w="http://schemas.openxmlformats.org/wordprocessingml/2006/main" xmlns:wp="http://schemas.openxmlformats.org/drawingml/2006/wordprocessingDrawing" xmlns:r="http://schemas.openxmlformats.org/officeDocument/2006/relationships" xmlns:w14="http://schemas.microsoft.com/office/word/2010/wordml">
+              <w:rPr>
+                <w:rFonts w:ascii="Arial" w:hAnsi="Arial" w:eastAsia="Arial" w:cs="Arial"/>
+                <w:i w:val="false"/>
+                <w:b w:val="false"/>
+                <w:u w:val="none"/>
+                <w:strike w:val="false"/>
+                <w:sz w:val="22"/>
+                <w:szCs w:val="22"/>
+                <w:color w:val="000000"/>
+              </w:rPr>
+              <w:t xml:space="preserve">329.2215</w:t>
+            </w:r>
+          </w:p>
+        </w:tc>
+        <w:tc>
+          <w:tcPr>
+            <w:tcBorders>
+              <w:bottom w:val="single" w:sz="6" w:space="0" w:color="666666"/>
+              <w:top w:val="single" w:sz="12" w:space="0" w:color="666666"/>
+              <w:left w:val="none" w:sz="0" w:space="0" w:color="000000"/>
+              <w:right w:val="none" w:sz="0" w:space="0" w:color="000000"/>
+            </w:tcBorders>
+            <w:shd w:val="clear" w:color="auto" w:fill="FFFFFF"/>
+            <w:tcMar>
+              <w:top w:w="0" w:type="dxa"/>
+              <w:bottom w:w="0" w:type="dxa"/>
+              <w:left w:w="0" w:type="dxa"/>
+              <w:right w:w="0" w:type="dxa"/>
+            </w:tcMar>
+            <w:vAlign w:val="center"/>
+          </w:tcPr>
+          <w:p>
+            <w:pPr>
+              <w:jc w:val="right"/>
+              <w:pBdr>
+                <w:bottom w:val="none" w:sz="0" w:space="0" w:color="000000"/>
+                <w:top w:val="none" w:sz="0" w:space="0" w:color="000000"/>
+                <w:left w:val="none" w:sz="0" w:space="0" w:color="000000"/>
+                <w:right w:val="none" w:sz="0" w:space="0" w:color="000000"/>
+              </w:pBdr>
+              <w:spacing w:after="100" w:before="100" w:line="240"/>
+              <w:ind w:left="100" w:right="100" w:firstLine="0" w:firstLineChars="0"/>
+              <w:rPr>
+                <w:rFonts w:ascii="Arial" w:hAnsi="Arial" w:eastAsia="Arial" w:cs="Arial"/>
+                <w:i w:val="false"/>
+                <w:b w:val="false"/>
+                <w:u w:val="none"/>
+                <w:strike w:val="false"/>
+                <w:sz w:val="22"/>
+                <w:szCs w:val="22"/>
+                <w:color w:val="000000"/>
+              </w:rPr>
+            </w:pPr>
+            <w:r xmlns:w="http://schemas.openxmlformats.org/wordprocessingml/2006/main" xmlns:wp="http://schemas.openxmlformats.org/drawingml/2006/wordprocessingDrawing" xmlns:r="http://schemas.openxmlformats.org/officeDocument/2006/relationships" xmlns:w14="http://schemas.microsoft.com/office/word/2010/wordml">
+              <w:rPr>
+                <w:rFonts w:ascii="Arial" w:hAnsi="Arial" w:eastAsia="Arial" w:cs="Arial"/>
+                <w:i w:val="false"/>
+                <w:b w:val="false"/>
+                <w:u w:val="none"/>
+                <w:strike w:val="false"/>
+                <w:sz w:val="22"/>
+                <w:szCs w:val="22"/>
+                <w:color w:val="000000"/>
+              </w:rPr>
+              <w:t xml:space="preserve">354</w:t>
+            </w:r>
+          </w:p>
+        </w:tc>
+        <w:tc>
+          <w:tcPr>
+            <w:tcBorders>
+              <w:bottom w:val="single" w:sz="6" w:space="0" w:color="666666"/>
+              <w:top w:val="single" w:sz="12" w:space="0" w:color="666666"/>
+              <w:left w:val="none" w:sz="0" w:space="0" w:color="000000"/>
+              <w:right w:val="none" w:sz="0" w:space="0" w:color="000000"/>
+            </w:tcBorders>
+            <w:shd w:val="clear" w:color="auto" w:fill="FFFFFF"/>
+            <w:tcMar>
+              <w:top w:w="0" w:type="dxa"/>
+              <w:bottom w:w="0" w:type="dxa"/>
+              <w:left w:w="0" w:type="dxa"/>
+              <w:right w:w="0" w:type="dxa"/>
+            </w:tcMar>
+            <w:vAlign w:val="center"/>
+          </w:tcPr>
+          <w:p>
+            <w:pPr>
+              <w:jc w:val="right"/>
+              <w:pBdr>
+                <w:bottom w:val="none" w:sz="0" w:space="0" w:color="000000"/>
+                <w:top w:val="none" w:sz="0" w:space="0" w:color="000000"/>
+                <w:left w:val="none" w:sz="0" w:space="0" w:color="000000"/>
+                <w:right w:val="none" w:sz="0" w:space="0" w:color="000000"/>
+              </w:pBdr>
+              <w:spacing w:after="100" w:before="100" w:line="240"/>
+              <w:ind w:left="100" w:right="100" w:firstLine="0" w:firstLineChars="0"/>
+              <w:rPr>
+                <w:rFonts w:ascii="Arial" w:hAnsi="Arial" w:eastAsia="Arial" w:cs="Arial"/>
+                <w:i w:val="false"/>
+                <w:b w:val="false"/>
+                <w:u w:val="none"/>
+                <w:strike w:val="false"/>
+                <w:sz w:val="22"/>
+                <w:szCs w:val="22"/>
+                <w:color w:val="000000"/>
+              </w:rPr>
+            </w:pPr>
+            <w:r xmlns:w="http://schemas.openxmlformats.org/wordprocessingml/2006/main" xmlns:wp="http://schemas.openxmlformats.org/drawingml/2006/wordprocessingDrawing" xmlns:r="http://schemas.openxmlformats.org/officeDocument/2006/relationships" xmlns:w14="http://schemas.microsoft.com/office/word/2010/wordml">
+              <w:rPr>
+                <w:rFonts w:ascii="Arial" w:hAnsi="Arial" w:eastAsia="Arial" w:cs="Arial"/>
+                <w:i w:val="false"/>
+                <w:b w:val="false"/>
+                <w:u w:val="none"/>
+                <w:strike w:val="false"/>
+                <w:sz w:val="22"/>
+                <w:szCs w:val="22"/>
+                <w:color w:val="000000"/>
+              </w:rPr>
+              <w:t xml:space="preserve">37.06443</w:t>
+            </w:r>
+          </w:p>
+        </w:tc>
+      </w:tr>
+      <w:tr>
+        <w:trPr>
+          <w:trHeight w:val="600" w:hRule="auto"/>
+        </w:trPr>
+        <w:tc>
+          <w:tcPr>
+            <w:tcBorders>
+              <w:bottom w:val="single" w:sz="6" w:space="0" w:color="666666"/>
+              <w:top w:val="single" w:sz="6" w:space="0" w:color="666666"/>
+              <w:left w:val="none" w:sz="0" w:space="0" w:color="000000"/>
+              <w:right w:val="none" w:sz="0" w:space="0" w:color="000000"/>
+            </w:tcBorders>
+            <w:shd w:val="clear" w:color="auto" w:fill="FFFFFF"/>
+            <w:tcMar>
+              <w:top w:w="0" w:type="dxa"/>
+              <w:bottom w:w="0" w:type="dxa"/>
+              <w:left w:w="0" w:type="dxa"/>
+              <w:right w:w="0" w:type="dxa"/>
+            </w:tcMar>
+            <w:vAlign w:val="center"/>
+          </w:tcPr>
+          <w:p>
+            <w:pPr>
+              <w:jc w:val="left"/>
+              <w:pBdr>
+                <w:bottom w:val="none" w:sz="0" w:space="0" w:color="000000"/>
+                <w:top w:val="none" w:sz="0" w:space="0" w:color="000000"/>
+                <w:left w:val="none" w:sz="0" w:space="0" w:color="000000"/>
+                <w:right w:val="none" w:sz="0" w:space="0" w:color="000000"/>
+              </w:pBdr>
+              <w:spacing w:after="100" w:before="100" w:line="240"/>
+              <w:ind w:left="100" w:right="100" w:firstLine="0" w:firstLineChars="0"/>
+              <w:rPr>
+                <w:rFonts w:ascii="Arial" w:hAnsi="Arial" w:eastAsia="Arial" w:cs="Arial"/>
+                <w:i w:val="false"/>
+                <w:b w:val="false"/>
+                <w:u w:val="none"/>
+                <w:strike w:val="false"/>
+                <w:sz w:val="22"/>
+                <w:szCs w:val="22"/>
+                <w:color w:val="000000"/>
+              </w:rPr>
+            </w:pPr>
+            <w:r xmlns:w="http://schemas.openxmlformats.org/wordprocessingml/2006/main" xmlns:wp="http://schemas.openxmlformats.org/drawingml/2006/wordprocessingDrawing" xmlns:r="http://schemas.openxmlformats.org/officeDocument/2006/relationships" xmlns:w14="http://schemas.microsoft.com/office/word/2010/wordml">
+              <w:rPr>
+                <w:rFonts w:ascii="Arial" w:hAnsi="Arial" w:eastAsia="Arial" w:cs="Arial"/>
+                <w:i w:val="false"/>
+                <w:b w:val="false"/>
+                <w:u w:val="none"/>
+                <w:strike w:val="false"/>
+                <w:sz w:val="22"/>
+                <w:szCs w:val="22"/>
+                <w:color w:val="000000"/>
+              </w:rPr>
+              <w:t xml:space="preserve">West</w:t>
+            </w:r>
+          </w:p>
+        </w:tc>
+        <w:tc>
+          <w:tcPr>
+            <w:tcBorders>
+              <w:bottom w:val="single" w:sz="6" w:space="0" w:color="666666"/>
+              <w:top w:val="single" w:sz="6" w:space="0" w:color="666666"/>
+              <w:left w:val="none" w:sz="0" w:space="0" w:color="000000"/>
+              <w:right w:val="none" w:sz="0" w:space="0" w:color="000000"/>
+            </w:tcBorders>
+            <w:shd w:val="clear" w:color="auto" w:fill="FFFFFF"/>
+            <w:tcMar>
+              <w:top w:w="0" w:type="dxa"/>
+              <w:bottom w:w="0" w:type="dxa"/>
+              <w:left w:w="0" w:type="dxa"/>
+              <w:right w:w="0" w:type="dxa"/>
+            </w:tcMar>
+            <w:vAlign w:val="center"/>
+          </w:tcPr>
+          <w:p>
+            <w:pPr>
+              <w:jc w:val="right"/>
+              <w:pBdr>
+                <w:bottom w:val="none" w:sz="0" w:space="0" w:color="000000"/>
+                <w:top w:val="none" w:sz="0" w:space="0" w:color="000000"/>
+                <w:left w:val="none" w:sz="0" w:space="0" w:color="000000"/>
+                <w:right w:val="none" w:sz="0" w:space="0" w:color="000000"/>
+              </w:pBdr>
+              <w:spacing w:after="100" w:before="100" w:line="240"/>
+              <w:ind w:left="100" w:right="100" w:firstLine="0" w:firstLineChars="0"/>
+              <w:rPr>
+                <w:rFonts w:ascii="Arial" w:hAnsi="Arial" w:eastAsia="Arial" w:cs="Arial"/>
+                <w:i w:val="false"/>
+                <w:b w:val="false"/>
+                <w:u w:val="none"/>
+                <w:strike w:val="false"/>
+                <w:sz w:val="22"/>
+                <w:szCs w:val="22"/>
+                <w:color w:val="000000"/>
+              </w:rPr>
+            </w:pPr>
+            <w:r xmlns:w="http://schemas.openxmlformats.org/wordprocessingml/2006/main" xmlns:wp="http://schemas.openxmlformats.org/drawingml/2006/wordprocessingDrawing" xmlns:r="http://schemas.openxmlformats.org/officeDocument/2006/relationships" xmlns:w14="http://schemas.microsoft.com/office/word/2010/wordml">
+              <w:rPr>
+                <w:rFonts w:ascii="Arial" w:hAnsi="Arial" w:eastAsia="Arial" w:cs="Arial"/>
+                <w:i w:val="false"/>
+                <w:b w:val="false"/>
+                <w:u w:val="none"/>
+                <w:strike w:val="false"/>
+                <w:sz w:val="22"/>
+                <w:szCs w:val="22"/>
+                <w:color w:val="000000"/>
+              </w:rPr>
+              <w:t xml:space="preserve">79,603.38</w:t>
+            </w:r>
+          </w:p>
+        </w:tc>
+        <w:tc>
+          <w:tcPr>
+            <w:tcBorders>
+              <w:bottom w:val="single" w:sz="6" w:space="0" w:color="666666"/>
+              <w:top w:val="single" w:sz="6" w:space="0" w:color="666666"/>
+              <w:left w:val="none" w:sz="0" w:space="0" w:color="000000"/>
+              <w:right w:val="none" w:sz="0" w:space="0" w:color="000000"/>
+            </w:tcBorders>
+            <w:shd w:val="clear" w:color="auto" w:fill="FFFFFF"/>
+            <w:tcMar>
+              <w:top w:w="0" w:type="dxa"/>
+              <w:bottom w:w="0" w:type="dxa"/>
+              <w:left w:w="0" w:type="dxa"/>
+              <w:right w:w="0" w:type="dxa"/>
+            </w:tcMar>
+            <w:vAlign w:val="center"/>
+          </w:tcPr>
+          <w:p>
+            <w:pPr>
+              <w:jc w:val="right"/>
+              <w:pBdr>
+                <w:bottom w:val="none" w:sz="0" w:space="0" w:color="000000"/>
+                <w:top w:val="none" w:sz="0" w:space="0" w:color="000000"/>
+                <w:left w:val="none" w:sz="0" w:space="0" w:color="000000"/>
+                <w:right w:val="none" w:sz="0" w:space="0" w:color="000000"/>
+              </w:pBdr>
+              <w:spacing w:after="100" w:before="100" w:line="240"/>
+              <w:ind w:left="100" w:right="100" w:firstLine="0" w:firstLineChars="0"/>
+              <w:rPr>
+                <w:rFonts w:ascii="Arial" w:hAnsi="Arial" w:eastAsia="Arial" w:cs="Arial"/>
+                <w:i w:val="false"/>
+                <w:b w:val="false"/>
+                <w:u w:val="none"/>
+                <w:strike w:val="false"/>
+                <w:sz w:val="22"/>
+                <w:szCs w:val="22"/>
+                <w:color w:val="000000"/>
+              </w:rPr>
+            </w:pPr>
+            <w:r xmlns:w="http://schemas.openxmlformats.org/wordprocessingml/2006/main" xmlns:wp="http://schemas.openxmlformats.org/drawingml/2006/wordprocessingDrawing" xmlns:r="http://schemas.openxmlformats.org/officeDocument/2006/relationships" xmlns:w14="http://schemas.microsoft.com/office/word/2010/wordml">
+              <w:rPr>
+                <w:rFonts w:ascii="Arial" w:hAnsi="Arial" w:eastAsia="Arial" w:cs="Arial"/>
+                <w:i w:val="false"/>
+                <w:b w:val="false"/>
+                <w:u w:val="none"/>
+                <w:strike w:val="false"/>
+                <w:sz w:val="22"/>
+                <w:szCs w:val="22"/>
+                <w:color w:val="000000"/>
+              </w:rPr>
+              <w:t xml:space="preserve">304.9938</w:t>
+            </w:r>
+          </w:p>
+        </w:tc>
+        <w:tc>
+          <w:tcPr>
+            <w:tcBorders>
+              <w:bottom w:val="single" w:sz="6" w:space="0" w:color="666666"/>
+              <w:top w:val="single" w:sz="6" w:space="0" w:color="666666"/>
+              <w:left w:val="none" w:sz="0" w:space="0" w:color="000000"/>
+              <w:right w:val="none" w:sz="0" w:space="0" w:color="000000"/>
+            </w:tcBorders>
+            <w:shd w:val="clear" w:color="auto" w:fill="FFFFFF"/>
+            <w:tcMar>
+              <w:top w:w="0" w:type="dxa"/>
+              <w:bottom w:w="0" w:type="dxa"/>
+              <w:left w:w="0" w:type="dxa"/>
+              <w:right w:w="0" w:type="dxa"/>
+            </w:tcMar>
+            <w:vAlign w:val="center"/>
+          </w:tcPr>
+          <w:p>
+            <w:pPr>
+              <w:jc w:val="right"/>
+              <w:pBdr>
+                <w:bottom w:val="none" w:sz="0" w:space="0" w:color="000000"/>
+                <w:top w:val="none" w:sz="0" w:space="0" w:color="000000"/>
+                <w:left w:val="none" w:sz="0" w:space="0" w:color="000000"/>
+                <w:right w:val="none" w:sz="0" w:space="0" w:color="000000"/>
+              </w:pBdr>
+              <w:spacing w:after="100" w:before="100" w:line="240"/>
+              <w:ind w:left="100" w:right="100" w:firstLine="0" w:firstLineChars="0"/>
+              <w:rPr>
+                <w:rFonts w:ascii="Arial" w:hAnsi="Arial" w:eastAsia="Arial" w:cs="Arial"/>
+                <w:i w:val="false"/>
+                <w:b w:val="false"/>
+                <w:u w:val="none"/>
+                <w:strike w:val="false"/>
+                <w:sz w:val="22"/>
+                <w:szCs w:val="22"/>
+                <w:color w:val="000000"/>
+              </w:rPr>
+            </w:pPr>
+            <w:r xmlns:w="http://schemas.openxmlformats.org/wordprocessingml/2006/main" xmlns:wp="http://schemas.openxmlformats.org/drawingml/2006/wordprocessingDrawing" xmlns:r="http://schemas.openxmlformats.org/officeDocument/2006/relationships" xmlns:w14="http://schemas.microsoft.com/office/word/2010/wordml">
+              <w:rPr>
+                <w:rFonts w:ascii="Arial" w:hAnsi="Arial" w:eastAsia="Arial" w:cs="Arial"/>
+                <w:i w:val="false"/>
+                <w:b w:val="false"/>
+                <w:u w:val="none"/>
+                <w:strike w:val="false"/>
+                <w:sz w:val="22"/>
+                <w:szCs w:val="22"/>
+                <w:color w:val="000000"/>
+              </w:rPr>
+              <w:t xml:space="preserve">261</w:t>
+            </w:r>
+          </w:p>
+        </w:tc>
+        <w:tc>
+          <w:tcPr>
+            <w:tcBorders>
+              <w:bottom w:val="single" w:sz="6" w:space="0" w:color="666666"/>
+              <w:top w:val="single" w:sz="6" w:space="0" w:color="666666"/>
+              <w:left w:val="none" w:sz="0" w:space="0" w:color="000000"/>
+              <w:right w:val="none" w:sz="0" w:space="0" w:color="000000"/>
+            </w:tcBorders>
+            <w:shd w:val="clear" w:color="auto" w:fill="FFFFFF"/>
+            <w:tcMar>
+              <w:top w:w="0" w:type="dxa"/>
+              <w:bottom w:w="0" w:type="dxa"/>
+              <w:left w:w="0" w:type="dxa"/>
+              <w:right w:w="0" w:type="dxa"/>
+            </w:tcMar>
+            <w:vAlign w:val="center"/>
+          </w:tcPr>
+          <w:p>
+            <w:pPr>
+              <w:jc w:val="right"/>
+              <w:pBdr>
+                <w:bottom w:val="none" w:sz="0" w:space="0" w:color="000000"/>
+                <w:top w:val="none" w:sz="0" w:space="0" w:color="000000"/>
+                <w:left w:val="none" w:sz="0" w:space="0" w:color="000000"/>
+                <w:right w:val="none" w:sz="0" w:space="0" w:color="000000"/>
+              </w:pBdr>
+              <w:spacing w:after="100" w:before="100" w:line="240"/>
+              <w:ind w:left="100" w:right="100" w:firstLine="0" w:firstLineChars="0"/>
+              <w:rPr>
+                <w:rFonts w:ascii="Arial" w:hAnsi="Arial" w:eastAsia="Arial" w:cs="Arial"/>
+                <w:i w:val="false"/>
+                <w:b w:val="false"/>
+                <w:u w:val="none"/>
+                <w:strike w:val="false"/>
+                <w:sz w:val="22"/>
+                <w:szCs w:val="22"/>
+                <w:color w:val="000000"/>
+              </w:rPr>
+            </w:pPr>
+            <w:r xmlns:w="http://schemas.openxmlformats.org/wordprocessingml/2006/main" xmlns:wp="http://schemas.openxmlformats.org/drawingml/2006/wordprocessingDrawing" xmlns:r="http://schemas.openxmlformats.org/officeDocument/2006/relationships" xmlns:w14="http://schemas.microsoft.com/office/word/2010/wordml">
+              <w:rPr>
+                <w:rFonts w:ascii="Arial" w:hAnsi="Arial" w:eastAsia="Arial" w:cs="Arial"/>
+                <w:i w:val="false"/>
+                <w:b w:val="false"/>
+                <w:u w:val="none"/>
+                <w:strike w:val="false"/>
+                <w:sz w:val="22"/>
+                <w:szCs w:val="22"/>
+                <w:color w:val="000000"/>
+              </w:rPr>
+              <w:t xml:space="preserve">25.31614</w:t>
+            </w:r>
+          </w:p>
+        </w:tc>
+      </w:tr>
+      <w:tr>
+        <w:trPr>
+          <w:trHeight w:val="600" w:hRule="auto"/>
+        </w:trPr>
+        <w:tc>
+          <w:tcPr>
+            <w:tcBorders>
+              <w:bottom w:val="single" w:sz="6" w:space="0" w:color="666666"/>
+              <w:top w:val="single" w:sz="6" w:space="0" w:color="666666"/>
+              <w:left w:val="none" w:sz="0" w:space="0" w:color="000000"/>
+              <w:right w:val="none" w:sz="0" w:space="0" w:color="000000"/>
+            </w:tcBorders>
+            <w:shd w:val="clear" w:color="auto" w:fill="FFFFFF"/>
+            <w:tcMar>
+              <w:top w:w="0" w:type="dxa"/>
+              <w:bottom w:w="0" w:type="dxa"/>
+              <w:left w:w="0" w:type="dxa"/>
+              <w:right w:w="0" w:type="dxa"/>
+            </w:tcMar>
+            <w:vAlign w:val="center"/>
+          </w:tcPr>
+          <w:p>
+            <w:pPr>
+              <w:jc w:val="left"/>
+              <w:pBdr>
+                <w:bottom w:val="none" w:sz="0" w:space="0" w:color="000000"/>
+                <w:top w:val="none" w:sz="0" w:space="0" w:color="000000"/>
+                <w:left w:val="none" w:sz="0" w:space="0" w:color="000000"/>
+                <w:right w:val="none" w:sz="0" w:space="0" w:color="000000"/>
+              </w:pBdr>
+              <w:spacing w:after="100" w:before="100" w:line="240"/>
+              <w:ind w:left="100" w:right="100" w:firstLine="0" w:firstLineChars="0"/>
+              <w:rPr>
+                <w:rFonts w:ascii="Arial" w:hAnsi="Arial" w:eastAsia="Arial" w:cs="Arial"/>
+                <w:i w:val="false"/>
+                <w:b w:val="false"/>
+                <w:u w:val="none"/>
+                <w:strike w:val="false"/>
+                <w:sz w:val="22"/>
+                <w:szCs w:val="22"/>
+                <w:color w:val="000000"/>
+              </w:rPr>
+            </w:pPr>
+            <w:r xmlns:w="http://schemas.openxmlformats.org/wordprocessingml/2006/main" xmlns:wp="http://schemas.openxmlformats.org/drawingml/2006/wordprocessingDrawing" xmlns:r="http://schemas.openxmlformats.org/officeDocument/2006/relationships" xmlns:w14="http://schemas.microsoft.com/office/word/2010/wordml">
+              <w:rPr>
+                <w:rFonts w:ascii="Arial" w:hAnsi="Arial" w:eastAsia="Arial" w:cs="Arial"/>
+                <w:i w:val="false"/>
+                <w:b w:val="false"/>
+                <w:u w:val="none"/>
+                <w:strike w:val="false"/>
+                <w:sz w:val="22"/>
+                <w:szCs w:val="22"/>
+                <w:color w:val="000000"/>
+              </w:rPr>
+              <w:t xml:space="preserve">East</w:t>
+            </w:r>
+          </w:p>
+        </w:tc>
+        <w:tc>
+          <w:tcPr>
+            <w:tcBorders>
+              <w:bottom w:val="single" w:sz="6" w:space="0" w:color="666666"/>
+              <w:top w:val="single" w:sz="6" w:space="0" w:color="666666"/>
+              <w:left w:val="none" w:sz="0" w:space="0" w:color="000000"/>
+              <w:right w:val="none" w:sz="0" w:space="0" w:color="000000"/>
+            </w:tcBorders>
+            <w:shd w:val="clear" w:color="auto" w:fill="FFFFFF"/>
+            <w:tcMar>
+              <w:top w:w="0" w:type="dxa"/>
+              <w:bottom w:w="0" w:type="dxa"/>
+              <w:left w:w="0" w:type="dxa"/>
+              <w:right w:w="0" w:type="dxa"/>
+            </w:tcMar>
+            <w:vAlign w:val="center"/>
+          </w:tcPr>
+          <w:p>
+            <w:pPr>
+              <w:jc w:val="right"/>
+              <w:pBdr>
+                <w:bottom w:val="none" w:sz="0" w:space="0" w:color="000000"/>
+                <w:top w:val="none" w:sz="0" w:space="0" w:color="000000"/>
+                <w:left w:val="none" w:sz="0" w:space="0" w:color="000000"/>
+                <w:right w:val="none" w:sz="0" w:space="0" w:color="000000"/>
+              </w:pBdr>
+              <w:spacing w:after="100" w:before="100" w:line="240"/>
+              <w:ind w:left="100" w:right="100" w:firstLine="0" w:firstLineChars="0"/>
+              <w:rPr>
+                <w:rFonts w:ascii="Arial" w:hAnsi="Arial" w:eastAsia="Arial" w:cs="Arial"/>
+                <w:i w:val="false"/>
+                <w:b w:val="false"/>
+                <w:u w:val="none"/>
+                <w:strike w:val="false"/>
+                <w:sz w:val="22"/>
+                <w:szCs w:val="22"/>
+                <w:color w:val="000000"/>
+              </w:rPr>
+            </w:pPr>
+            <w:r xmlns:w="http://schemas.openxmlformats.org/wordprocessingml/2006/main" xmlns:wp="http://schemas.openxmlformats.org/drawingml/2006/wordprocessingDrawing" xmlns:r="http://schemas.openxmlformats.org/officeDocument/2006/relationships" xmlns:w14="http://schemas.microsoft.com/office/word/2010/wordml">
+              <w:rPr>
+                <w:rFonts w:ascii="Arial" w:hAnsi="Arial" w:eastAsia="Arial" w:cs="Arial"/>
+                <w:i w:val="false"/>
+                <w:b w:val="false"/>
+                <w:u w:val="none"/>
+                <w:strike w:val="false"/>
+                <w:sz w:val="22"/>
+                <w:szCs w:val="22"/>
+                <w:color w:val="000000"/>
+              </w:rPr>
+              <w:t xml:space="preserve">65,119.44</w:t>
+            </w:r>
+          </w:p>
+        </w:tc>
+        <w:tc>
+          <w:tcPr>
+            <w:tcBorders>
+              <w:bottom w:val="single" w:sz="6" w:space="0" w:color="666666"/>
+              <w:top w:val="single" w:sz="6" w:space="0" w:color="666666"/>
+              <w:left w:val="none" w:sz="0" w:space="0" w:color="000000"/>
+              <w:right w:val="none" w:sz="0" w:space="0" w:color="000000"/>
+            </w:tcBorders>
+            <w:shd w:val="clear" w:color="auto" w:fill="FFFFFF"/>
+            <w:tcMar>
+              <w:top w:w="0" w:type="dxa"/>
+              <w:bottom w:w="0" w:type="dxa"/>
+              <w:left w:w="0" w:type="dxa"/>
+              <w:right w:w="0" w:type="dxa"/>
+            </w:tcMar>
+            <w:vAlign w:val="center"/>
+          </w:tcPr>
+          <w:p>
+            <w:pPr>
+              <w:jc w:val="right"/>
+              <w:pBdr>
+                <w:bottom w:val="none" w:sz="0" w:space="0" w:color="000000"/>
+                <w:top w:val="none" w:sz="0" w:space="0" w:color="000000"/>
+                <w:left w:val="none" w:sz="0" w:space="0" w:color="000000"/>
+                <w:right w:val="none" w:sz="0" w:space="0" w:color="000000"/>
+              </w:pBdr>
+              <w:spacing w:after="100" w:before="100" w:line="240"/>
+              <w:ind w:left="100" w:right="100" w:firstLine="0" w:firstLineChars="0"/>
+              <w:rPr>
+                <w:rFonts w:ascii="Arial" w:hAnsi="Arial" w:eastAsia="Arial" w:cs="Arial"/>
+                <w:i w:val="false"/>
+                <w:b w:val="false"/>
+                <w:u w:val="none"/>
+                <w:strike w:val="false"/>
+                <w:sz w:val="22"/>
+                <w:szCs w:val="22"/>
+                <w:color w:val="000000"/>
+              </w:rPr>
+            </w:pPr>
+            <w:r xmlns:w="http://schemas.openxmlformats.org/wordprocessingml/2006/main" xmlns:wp="http://schemas.openxmlformats.org/drawingml/2006/wordprocessingDrawing" xmlns:r="http://schemas.openxmlformats.org/officeDocument/2006/relationships" xmlns:w14="http://schemas.microsoft.com/office/word/2010/wordml">
+              <w:rPr>
+                <w:rFonts w:ascii="Arial" w:hAnsi="Arial" w:eastAsia="Arial" w:cs="Arial"/>
+                <w:i w:val="false"/>
+                <w:b w:val="false"/>
+                <w:u w:val="none"/>
+                <w:strike w:val="false"/>
+                <w:sz w:val="22"/>
+                <w:szCs w:val="22"/>
+                <w:color w:val="000000"/>
+              </w:rPr>
+              <w:t xml:space="preserve">337.4064</w:t>
+            </w:r>
+          </w:p>
+        </w:tc>
+        <w:tc>
+          <w:tcPr>
+            <w:tcBorders>
+              <w:bottom w:val="single" w:sz="6" w:space="0" w:color="666666"/>
+              <w:top w:val="single" w:sz="6" w:space="0" w:color="666666"/>
+              <w:left w:val="none" w:sz="0" w:space="0" w:color="000000"/>
+              <w:right w:val="none" w:sz="0" w:space="0" w:color="000000"/>
+            </w:tcBorders>
+            <w:shd w:val="clear" w:color="auto" w:fill="FFFFFF"/>
+            <w:tcMar>
+              <w:top w:w="0" w:type="dxa"/>
+              <w:bottom w:w="0" w:type="dxa"/>
+              <w:left w:w="0" w:type="dxa"/>
+              <w:right w:w="0" w:type="dxa"/>
+            </w:tcMar>
+            <w:vAlign w:val="center"/>
+          </w:tcPr>
+          <w:p>
+            <w:pPr>
+              <w:jc w:val="right"/>
+              <w:pBdr>
+                <w:bottom w:val="none" w:sz="0" w:space="0" w:color="000000"/>
+                <w:top w:val="none" w:sz="0" w:space="0" w:color="000000"/>
+                <w:left w:val="none" w:sz="0" w:space="0" w:color="000000"/>
+                <w:right w:val="none" w:sz="0" w:space="0" w:color="000000"/>
+              </w:pBdr>
+              <w:spacing w:after="100" w:before="100" w:line="240"/>
+              <w:ind w:left="100" w:right="100" w:firstLine="0" w:firstLineChars="0"/>
+              <w:rPr>
+                <w:rFonts w:ascii="Arial" w:hAnsi="Arial" w:eastAsia="Arial" w:cs="Arial"/>
+                <w:i w:val="false"/>
+                <w:b w:val="false"/>
+                <w:u w:val="none"/>
+                <w:strike w:val="false"/>
+                <w:sz w:val="22"/>
+                <w:szCs w:val="22"/>
+                <w:color w:val="000000"/>
+              </w:rPr>
+            </w:pPr>
+            <w:r xmlns:w="http://schemas.openxmlformats.org/wordprocessingml/2006/main" xmlns:wp="http://schemas.openxmlformats.org/drawingml/2006/wordprocessingDrawing" xmlns:r="http://schemas.openxmlformats.org/officeDocument/2006/relationships" xmlns:w14="http://schemas.microsoft.com/office/word/2010/wordml">
+              <w:rPr>
+                <w:rFonts w:ascii="Arial" w:hAnsi="Arial" w:eastAsia="Arial" w:cs="Arial"/>
+                <w:i w:val="false"/>
+                <w:b w:val="false"/>
+                <w:u w:val="none"/>
+                <w:strike w:val="false"/>
+                <w:sz w:val="22"/>
+                <w:szCs w:val="22"/>
+                <w:color w:val="000000"/>
+              </w:rPr>
+              <w:t xml:space="preserve">193</w:t>
+            </w:r>
+          </w:p>
+        </w:tc>
+        <w:tc>
+          <w:tcPr>
+            <w:tcBorders>
+              <w:bottom w:val="single" w:sz="6" w:space="0" w:color="666666"/>
+              <w:top w:val="single" w:sz="6" w:space="0" w:color="666666"/>
+              <w:left w:val="none" w:sz="0" w:space="0" w:color="000000"/>
+              <w:right w:val="none" w:sz="0" w:space="0" w:color="000000"/>
+            </w:tcBorders>
+            <w:shd w:val="clear" w:color="auto" w:fill="FFFFFF"/>
+            <w:tcMar>
+              <w:top w:w="0" w:type="dxa"/>
+              <w:bottom w:w="0" w:type="dxa"/>
+              <w:left w:w="0" w:type="dxa"/>
+              <w:right w:w="0" w:type="dxa"/>
+            </w:tcMar>
+            <w:vAlign w:val="center"/>
+          </w:tcPr>
+          <w:p>
+            <w:pPr>
+              <w:jc w:val="right"/>
+              <w:pBdr>
+                <w:bottom w:val="none" w:sz="0" w:space="0" w:color="000000"/>
+                <w:top w:val="none" w:sz="0" w:space="0" w:color="000000"/>
+                <w:left w:val="none" w:sz="0" w:space="0" w:color="000000"/>
+                <w:right w:val="none" w:sz="0" w:space="0" w:color="000000"/>
+              </w:pBdr>
+              <w:spacing w:after="100" w:before="100" w:line="240"/>
+              <w:ind w:left="100" w:right="100" w:firstLine="0" w:firstLineChars="0"/>
+              <w:rPr>
+                <w:rFonts w:ascii="Arial" w:hAnsi="Arial" w:eastAsia="Arial" w:cs="Arial"/>
+                <w:i w:val="false"/>
+                <w:b w:val="false"/>
+                <w:u w:val="none"/>
+                <w:strike w:val="false"/>
+                <w:sz w:val="22"/>
+                <w:szCs w:val="22"/>
+                <w:color w:val="000000"/>
+              </w:rPr>
+            </w:pPr>
+            <w:r xmlns:w="http://schemas.openxmlformats.org/wordprocessingml/2006/main" xmlns:wp="http://schemas.openxmlformats.org/drawingml/2006/wordprocessingDrawing" xmlns:r="http://schemas.openxmlformats.org/officeDocument/2006/relationships" xmlns:w14="http://schemas.microsoft.com/office/word/2010/wordml">
+              <w:rPr>
+                <w:rFonts w:ascii="Arial" w:hAnsi="Arial" w:eastAsia="Arial" w:cs="Arial"/>
+                <w:i w:val="false"/>
+                <w:b w:val="false"/>
+                <w:u w:val="none"/>
+                <w:strike w:val="false"/>
+                <w:sz w:val="22"/>
+                <w:szCs w:val="22"/>
+                <w:color w:val="000000"/>
+              </w:rPr>
+              <w:t xml:space="preserve">20.70983</w:t>
+            </w:r>
+          </w:p>
+        </w:tc>
+      </w:tr>
+      <w:tr>
+        <w:trPr>
+          <w:trHeight w:val="600" w:hRule="auto"/>
+        </w:trPr>
+        <w:tc>
+          <w:tcPr>
+            <w:tcBorders>
+              <w:bottom w:val="single" w:sz="12" w:space="0" w:color="666666"/>
+              <w:top w:val="single" w:sz="6" w:space="0" w:color="666666"/>
+              <w:left w:val="none" w:sz="0" w:space="0" w:color="000000"/>
+              <w:right w:val="none" w:sz="0" w:space="0" w:color="000000"/>
+            </w:tcBorders>
+            <w:shd w:val="clear" w:color="auto" w:fill="FFFFFF"/>
+            <w:tcMar>
+              <w:top w:w="0" w:type="dxa"/>
+              <w:bottom w:w="0" w:type="dxa"/>
+              <w:left w:w="0" w:type="dxa"/>
+              <w:right w:w="0" w:type="dxa"/>
+            </w:tcMar>
+            <w:vAlign w:val="center"/>
+          </w:tcPr>
+          <w:p>
+            <w:pPr>
+              <w:jc w:val="left"/>
+              <w:pBdr>
+                <w:bottom w:val="none" w:sz="0" w:space="0" w:color="000000"/>
+                <w:top w:val="none" w:sz="0" w:space="0" w:color="000000"/>
+                <w:left w:val="none" w:sz="0" w:space="0" w:color="000000"/>
+                <w:right w:val="none" w:sz="0" w:space="0" w:color="000000"/>
+              </w:pBdr>
+              <w:spacing w:after="100" w:before="100" w:line="240"/>
+              <w:ind w:left="100" w:right="100" w:firstLine="0" w:firstLineChars="0"/>
+              <w:rPr>
+                <w:rFonts w:ascii="Arial" w:hAnsi="Arial" w:eastAsia="Arial" w:cs="Arial"/>
+                <w:i w:val="false"/>
+                <w:b w:val="false"/>
+                <w:u w:val="none"/>
+                <w:strike w:val="false"/>
+                <w:sz w:val="22"/>
+                <w:szCs w:val="22"/>
+                <w:color w:val="000000"/>
+              </w:rPr>
+            </w:pPr>
+            <w:r xmlns:w="http://schemas.openxmlformats.org/wordprocessingml/2006/main" xmlns:wp="http://schemas.openxmlformats.org/drawingml/2006/wordprocessingDrawing" xmlns:r="http://schemas.openxmlformats.org/officeDocument/2006/relationships" xmlns:w14="http://schemas.microsoft.com/office/word/2010/wordml">
+              <w:rPr>
+                <w:rFonts w:ascii="Arial" w:hAnsi="Arial" w:eastAsia="Arial" w:cs="Arial"/>
+                <w:i w:val="false"/>
+                <w:b w:val="false"/>
+                <w:u w:val="none"/>
+                <w:strike w:val="false"/>
+                <w:sz w:val="22"/>
+                <w:szCs w:val="22"/>
+                <w:color w:val="000000"/>
+              </w:rPr>
+              <w:t xml:space="preserve">South</w:t>
+            </w:r>
+          </w:p>
+        </w:tc>
+        <w:tc>
+          <w:tcPr>
+            <w:tcBorders>
+              <w:bottom w:val="single" w:sz="12" w:space="0" w:color="666666"/>
+              <w:top w:val="single" w:sz="6" w:space="0" w:color="666666"/>
+              <w:left w:val="none" w:sz="0" w:space="0" w:color="000000"/>
+              <w:right w:val="none" w:sz="0" w:space="0" w:color="000000"/>
+            </w:tcBorders>
+            <w:shd w:val="clear" w:color="auto" w:fill="FFFFFF"/>
+            <w:tcMar>
+              <w:top w:w="0" w:type="dxa"/>
+              <w:bottom w:w="0" w:type="dxa"/>
+              <w:left w:w="0" w:type="dxa"/>
+              <w:right w:w="0" w:type="dxa"/>
+            </w:tcMar>
+            <w:vAlign w:val="center"/>
+          </w:tcPr>
+          <w:p>
+            <w:pPr>
+              <w:jc w:val="right"/>
+              <w:pBdr>
+                <w:bottom w:val="none" w:sz="0" w:space="0" w:color="000000"/>
+                <w:top w:val="none" w:sz="0" w:space="0" w:color="000000"/>
+                <w:left w:val="none" w:sz="0" w:space="0" w:color="000000"/>
+                <w:right w:val="none" w:sz="0" w:space="0" w:color="000000"/>
+              </w:pBdr>
+              <w:spacing w:after="100" w:before="100" w:line="240"/>
+              <w:ind w:left="100" w:right="100" w:firstLine="0" w:firstLineChars="0"/>
+              <w:rPr>
+                <w:rFonts w:ascii="Arial" w:hAnsi="Arial" w:eastAsia="Arial" w:cs="Arial"/>
+                <w:i w:val="false"/>
+                <w:b w:val="false"/>
+                <w:u w:val="none"/>
+                <w:strike w:val="false"/>
+                <w:sz w:val="22"/>
+                <w:szCs w:val="22"/>
+                <w:color w:val="000000"/>
+              </w:rPr>
+            </w:pPr>
+            <w:r xmlns:w="http://schemas.openxmlformats.org/wordprocessingml/2006/main" xmlns:wp="http://schemas.openxmlformats.org/drawingml/2006/wordprocessingDrawing" xmlns:r="http://schemas.openxmlformats.org/officeDocument/2006/relationships" xmlns:w14="http://schemas.microsoft.com/office/word/2010/wordml">
+              <w:rPr>
+                <w:rFonts w:ascii="Arial" w:hAnsi="Arial" w:eastAsia="Arial" w:cs="Arial"/>
+                <w:i w:val="false"/>
+                <w:b w:val="false"/>
+                <w:u w:val="none"/>
+                <w:strike w:val="false"/>
+                <w:sz w:val="22"/>
+                <w:szCs w:val="22"/>
+                <w:color w:val="000000"/>
+              </w:rPr>
+              <w:t xml:space="preserve">53,170.07</w:t>
+            </w:r>
+          </w:p>
+        </w:tc>
+        <w:tc>
+          <w:tcPr>
+            <w:tcBorders>
+              <w:bottom w:val="single" w:sz="12" w:space="0" w:color="666666"/>
+              <w:top w:val="single" w:sz="6" w:space="0" w:color="666666"/>
+              <w:left w:val="none" w:sz="0" w:space="0" w:color="000000"/>
+              <w:right w:val="none" w:sz="0" w:space="0" w:color="000000"/>
+            </w:tcBorders>
+            <w:shd w:val="clear" w:color="auto" w:fill="FFFFFF"/>
+            <w:tcMar>
+              <w:top w:w="0" w:type="dxa"/>
+              <w:bottom w:w="0" w:type="dxa"/>
+              <w:left w:w="0" w:type="dxa"/>
+              <w:right w:w="0" w:type="dxa"/>
+            </w:tcMar>
+            <w:vAlign w:val="center"/>
+          </w:tcPr>
+          <w:p>
+            <w:pPr>
+              <w:jc w:val="right"/>
+              <w:pBdr>
+                <w:bottom w:val="none" w:sz="0" w:space="0" w:color="000000"/>
+                <w:top w:val="none" w:sz="0" w:space="0" w:color="000000"/>
+                <w:left w:val="none" w:sz="0" w:space="0" w:color="000000"/>
+                <w:right w:val="none" w:sz="0" w:space="0" w:color="000000"/>
+              </w:pBdr>
+              <w:spacing w:after="100" w:before="100" w:line="240"/>
+              <w:ind w:left="100" w:right="100" w:firstLine="0" w:firstLineChars="0"/>
+              <w:rPr>
+                <w:rFonts w:ascii="Arial" w:hAnsi="Arial" w:eastAsia="Arial" w:cs="Arial"/>
+                <w:i w:val="false"/>
+                <w:b w:val="false"/>
+                <w:u w:val="none"/>
+                <w:strike w:val="false"/>
+                <w:sz w:val="22"/>
+                <w:szCs w:val="22"/>
+                <w:color w:val="000000"/>
+              </w:rPr>
+            </w:pPr>
+            <w:r xmlns:w="http://schemas.openxmlformats.org/wordprocessingml/2006/main" xmlns:wp="http://schemas.openxmlformats.org/drawingml/2006/wordprocessingDrawing" xmlns:r="http://schemas.openxmlformats.org/officeDocument/2006/relationships" xmlns:w14="http://schemas.microsoft.com/office/word/2010/wordml">
+              <w:rPr>
+                <w:rFonts w:ascii="Arial" w:hAnsi="Arial" w:eastAsia="Arial" w:cs="Arial"/>
+                <w:i w:val="false"/>
+                <w:b w:val="false"/>
+                <w:u w:val="none"/>
+                <w:strike w:val="false"/>
+                <w:sz w:val="22"/>
+                <w:szCs w:val="22"/>
+                <w:color w:val="000000"/>
+              </w:rPr>
+              <w:t xml:space="preserve">276.9275</w:t>
+            </w:r>
+          </w:p>
+        </w:tc>
+        <w:tc>
+          <w:tcPr>
+            <w:tcBorders>
+              <w:bottom w:val="single" w:sz="12" w:space="0" w:color="666666"/>
+              <w:top w:val="single" w:sz="6" w:space="0" w:color="666666"/>
+              <w:left w:val="none" w:sz="0" w:space="0" w:color="000000"/>
+              <w:right w:val="none" w:sz="0" w:space="0" w:color="000000"/>
+            </w:tcBorders>
+            <w:shd w:val="clear" w:color="auto" w:fill="FFFFFF"/>
+            <w:tcMar>
+              <w:top w:w="0" w:type="dxa"/>
+              <w:bottom w:w="0" w:type="dxa"/>
+              <w:left w:w="0" w:type="dxa"/>
+              <w:right w:w="0" w:type="dxa"/>
+            </w:tcMar>
+            <w:vAlign w:val="center"/>
+          </w:tcPr>
+          <w:p>
+            <w:pPr>
+              <w:jc w:val="right"/>
+              <w:pBdr>
+                <w:bottom w:val="none" w:sz="0" w:space="0" w:color="000000"/>
+                <w:top w:val="none" w:sz="0" w:space="0" w:color="000000"/>
+                <w:left w:val="none" w:sz="0" w:space="0" w:color="000000"/>
+                <w:right w:val="none" w:sz="0" w:space="0" w:color="000000"/>
+              </w:pBdr>
+              <w:spacing w:after="100" w:before="100" w:line="240"/>
+              <w:ind w:left="100" w:right="100" w:firstLine="0" w:firstLineChars="0"/>
+              <w:rPr>
+                <w:rFonts w:ascii="Arial" w:hAnsi="Arial" w:eastAsia="Arial" w:cs="Arial"/>
+                <w:i w:val="false"/>
+                <w:b w:val="false"/>
+                <w:u w:val="none"/>
+                <w:strike w:val="false"/>
+                <w:sz w:val="22"/>
+                <w:szCs w:val="22"/>
+                <w:color w:val="000000"/>
+              </w:rPr>
+            </w:pPr>
+            <w:r xmlns:w="http://schemas.openxmlformats.org/wordprocessingml/2006/main" xmlns:wp="http://schemas.openxmlformats.org/drawingml/2006/wordprocessingDrawing" xmlns:r="http://schemas.openxmlformats.org/officeDocument/2006/relationships" xmlns:w14="http://schemas.microsoft.com/office/word/2010/wordml">
+              <w:rPr>
+                <w:rFonts w:ascii="Arial" w:hAnsi="Arial" w:eastAsia="Arial" w:cs="Arial"/>
+                <w:i w:val="false"/>
+                <w:b w:val="false"/>
+                <w:u w:val="none"/>
+                <w:strike w:val="false"/>
+                <w:sz w:val="22"/>
+                <w:szCs w:val="22"/>
+                <w:color w:val="000000"/>
+              </w:rPr>
+              <w:t xml:space="preserve">192</w:t>
+            </w:r>
+          </w:p>
+        </w:tc>
+        <w:tc>
+          <w:tcPr>
+            <w:tcBorders>
+              <w:bottom w:val="single" w:sz="12" w:space="0" w:color="666666"/>
+              <w:top w:val="single" w:sz="6" w:space="0" w:color="666666"/>
+              <w:left w:val="none" w:sz="0" w:space="0" w:color="000000"/>
+              <w:right w:val="none" w:sz="0" w:space="0" w:color="000000"/>
+            </w:tcBorders>
+            <w:shd w:val="clear" w:color="auto" w:fill="FFFFFF"/>
+            <w:tcMar>
+              <w:top w:w="0" w:type="dxa"/>
+              <w:bottom w:w="0" w:type="dxa"/>
+              <w:left w:w="0" w:type="dxa"/>
+              <w:right w:w="0" w:type="dxa"/>
+            </w:tcMar>
+            <w:vAlign w:val="center"/>
+          </w:tcPr>
+          <w:p>
+            <w:pPr>
+              <w:jc w:val="right"/>
+              <w:pBdr>
+                <w:bottom w:val="none" w:sz="0" w:space="0" w:color="000000"/>
+                <w:top w:val="none" w:sz="0" w:space="0" w:color="000000"/>
+                <w:left w:val="none" w:sz="0" w:space="0" w:color="000000"/>
+                <w:right w:val="none" w:sz="0" w:space="0" w:color="000000"/>
+              </w:pBdr>
+              <w:spacing w:after="100" w:before="100" w:line="240"/>
+              <w:ind w:left="100" w:right="100" w:firstLine="0" w:firstLineChars="0"/>
+              <w:rPr>
+                <w:rFonts w:ascii="Arial" w:hAnsi="Arial" w:eastAsia="Arial" w:cs="Arial"/>
+                <w:i w:val="false"/>
+                <w:b w:val="false"/>
+                <w:u w:val="none"/>
+                <w:strike w:val="false"/>
+                <w:sz w:val="22"/>
+                <w:szCs w:val="22"/>
+                <w:color w:val="000000"/>
+              </w:rPr>
+            </w:pPr>
+            <w:r xmlns:w="http://schemas.openxmlformats.org/wordprocessingml/2006/main" xmlns:wp="http://schemas.openxmlformats.org/drawingml/2006/wordprocessingDrawing" xmlns:r="http://schemas.openxmlformats.org/officeDocument/2006/relationships" xmlns:w14="http://schemas.microsoft.com/office/word/2010/wordml">
+              <w:rPr>
+                <w:rFonts w:ascii="Arial" w:hAnsi="Arial" w:eastAsia="Arial" w:cs="Arial"/>
+                <w:i w:val="false"/>
+                <w:b w:val="false"/>
+                <w:u w:val="none"/>
+                <w:strike w:val="false"/>
+                <w:sz w:val="22"/>
+                <w:szCs w:val="22"/>
+                <w:color w:val="000000"/>
+              </w:rPr>
+              <w:t xml:space="preserve">16.90959</w:t>
+            </w:r>
+          </w:p>
+        </w:tc>
+      </w:tr>
+    </w:tbl>
+    <w:p>
+      <w:pPr>
+        <w:pStyle w:val="BodyText"/>
+      </w:pPr>
+      <w:r>
+        <w:t xml:space="preserve">North är den region som säljer mest totalt (116544) och har flest ordrar (354), medan East har högre värde per köp (337). South säljer minst (53170) och har också lägre värde (277) per köp än andra regioner.</w:t>
+      </w:r>
+    </w:p>
+    <w:tbl xmlns:w="http://schemas.openxmlformats.org/wordprocessingml/2006/main" xmlns:r="http://schemas.openxmlformats.org/officeDocument/2006/relationships" xmlns:w14="http://schemas.microsoft.com/office/word/2010/wordml" xmlns:wp="http://schemas.openxmlformats.org/drawingml/2006/wordprocessingDrawing" xmlns:a="http://schemas.openxmlformats.org/drawingml/2006/main" xmlns:pic="http://schemas.openxmlformats.org/drawingml/2006/picture">
+      <w:tblPr>
+        <w:tblLayout w:type="fixed"/>
+        <w:jc w:val="center"/>
+        <w:tblLook w:firstRow="1" w:lastRow="0" w:firstColumn="0" w:lastColumn="0" w:noHBand="0" w:noVBand="1"/>
+      </w:tblPr>
+      <w:tblGrid>
+        <w:gridCol w:w="1683"/>
+        <w:gridCol w:w="1683"/>
+        <w:gridCol w:w="1450"/>
+      </w:tblGrid>
+      <w:tr>
+        <w:trPr>
+          <w:trHeight w:val="614" w:hRule="auto"/>
+          <w:tblHeader/>
+        </w:trPr>
+        <w:tc>
+          <w:tcPr>
+            <w:tcBorders>
+              <w:bottom w:val="single" w:sz="12" w:space="0" w:color="666666"/>
+              <w:top w:val="single" w:sz="12" w:space="0" w:color="666666"/>
+              <w:left w:val="none" w:sz="0" w:space="0" w:color="000000"/>
+              <w:right w:val="none" w:sz="0" w:space="0" w:color="000000"/>
+            </w:tcBorders>
+            <w:shd w:val="clear" w:color="auto" w:fill="FFFFFF"/>
+            <w:tcMar>
+              <w:top w:w="0" w:type="dxa"/>
+              <w:bottom w:w="0" w:type="dxa"/>
+              <w:left w:w="0" w:type="dxa"/>
+              <w:right w:w="0" w:type="dxa"/>
+            </w:tcMar>
+            <w:vAlign w:val="center"/>
+          </w:tcPr>
+          <w:p>
+            <w:pPr>
+              <w:jc w:val="left"/>
+              <w:pBdr>
+                <w:bottom w:val="none" w:sz="0" w:space="0" w:color="000000"/>
+                <w:top w:val="none" w:sz="0" w:space="0" w:color="000000"/>
+                <w:left w:val="none" w:sz="0" w:space="0" w:color="000000"/>
+                <w:right w:val="none" w:sz="0" w:space="0" w:color="000000"/>
+              </w:pBdr>
+              <w:spacing w:after="100" w:before="100" w:line="240"/>
+              <w:ind w:left="100" w:right="100" w:firstLine="0" w:firstLineChars="0"/>
+              <w:rPr>
+                <w:rFonts w:ascii="Arial" w:hAnsi="Arial" w:eastAsia="Arial" w:cs="Arial"/>
+                <w:i w:val="false"/>
+                <w:b w:val="true"/>
+                <w:u w:val="none"/>
+                <w:strike w:val="false"/>
+                <w:sz w:val="22"/>
+                <w:szCs w:val="22"/>
+                <w:color w:val="000000"/>
+              </w:rPr>
+            </w:pPr>
+            <w:r xmlns:w="http://schemas.openxmlformats.org/wordprocessingml/2006/main" xmlns:wp="http://schemas.openxmlformats.org/drawingml/2006/wordprocessingDrawing" xmlns:r="http://schemas.openxmlformats.org/officeDocument/2006/relationships" xmlns:w14="http://schemas.microsoft.com/office/word/2010/wordml">
+              <w:rPr>
+                <w:rFonts w:ascii="Arial" w:hAnsi="Arial" w:eastAsia="Arial" w:cs="Arial"/>
+                <w:i w:val="false"/>
+                <w:b w:val="true"/>
+                <w:u w:val="none"/>
+                <w:strike w:val="false"/>
+                <w:sz w:val="22"/>
+                <w:szCs w:val="22"/>
+                <w:color w:val="000000"/>
+              </w:rPr>
+              <w:t xml:space="preserve">category_top</w:t>
+            </w:r>
+          </w:p>
+        </w:tc>
+        <w:tc>
+          <w:tcPr>
+            <w:tcBorders>
+              <w:bottom w:val="single" w:sz="12" w:space="0" w:color="666666"/>
+              <w:top w:val="single" w:sz="12" w:space="0" w:color="666666"/>
+              <w:left w:val="none" w:sz="0" w:space="0" w:color="000000"/>
+              <w:right w:val="none" w:sz="0" w:space="0" w:color="000000"/>
+            </w:tcBorders>
+            <w:shd w:val="clear" w:color="auto" w:fill="FFFFFF"/>
+            <w:tcMar>
+              <w:top w:w="0" w:type="dxa"/>
+              <w:bottom w:w="0" w:type="dxa"/>
+              <w:left w:w="0" w:type="dxa"/>
+              <w:right w:w="0" w:type="dxa"/>
+            </w:tcMar>
+            <w:vAlign w:val="center"/>
+          </w:tcPr>
+          <w:p>
+            <w:pPr>
+              <w:jc w:val="left"/>
+              <w:pBdr>
+                <w:bottom w:val="none" w:sz="0" w:space="0" w:color="000000"/>
+                <w:top w:val="none" w:sz="0" w:space="0" w:color="000000"/>
+                <w:left w:val="none" w:sz="0" w:space="0" w:color="000000"/>
+                <w:right w:val="none" w:sz="0" w:space="0" w:color="000000"/>
+              </w:pBdr>
+              <w:spacing w:after="100" w:before="100" w:line="240"/>
+              <w:ind w:left="100" w:right="100" w:firstLine="0" w:firstLineChars="0"/>
+              <w:rPr>
+                <w:rFonts w:ascii="Arial" w:hAnsi="Arial" w:eastAsia="Arial" w:cs="Arial"/>
+                <w:i w:val="false"/>
+                <w:b w:val="true"/>
+                <w:u w:val="none"/>
+                <w:strike w:val="false"/>
+                <w:sz w:val="22"/>
+                <w:szCs w:val="22"/>
+                <w:color w:val="000000"/>
+              </w:rPr>
+            </w:pPr>
+            <w:r xmlns:w="http://schemas.openxmlformats.org/wordprocessingml/2006/main" xmlns:wp="http://schemas.openxmlformats.org/drawingml/2006/wordprocessingDrawing" xmlns:r="http://schemas.openxmlformats.org/officeDocument/2006/relationships" xmlns:w14="http://schemas.microsoft.com/office/word/2010/wordml">
+              <w:rPr>
+                <w:rFonts w:ascii="Arial" w:hAnsi="Arial" w:eastAsia="Arial" w:cs="Arial"/>
+                <w:i w:val="false"/>
+                <w:b w:val="true"/>
+                <w:u w:val="none"/>
+                <w:strike w:val="false"/>
+                <w:sz w:val="22"/>
+                <w:szCs w:val="22"/>
+                <w:color w:val="000000"/>
+              </w:rPr>
+              <w:t xml:space="preserve">segment_top</w:t>
+            </w:r>
+          </w:p>
+        </w:tc>
+        <w:tc>
+          <w:tcPr>
+            <w:tcBorders>
+              <w:bottom w:val="single" w:sz="12" w:space="0" w:color="666666"/>
+              <w:top w:val="single" w:sz="12" w:space="0" w:color="666666"/>
+              <w:left w:val="none" w:sz="0" w:space="0" w:color="000000"/>
+              <w:right w:val="none" w:sz="0" w:space="0" w:color="000000"/>
+            </w:tcBorders>
+            <w:shd w:val="clear" w:color="auto" w:fill="FFFFFF"/>
+            <w:tcMar>
+              <w:top w:w="0" w:type="dxa"/>
+              <w:bottom w:w="0" w:type="dxa"/>
+              <w:left w:w="0" w:type="dxa"/>
+              <w:right w:w="0" w:type="dxa"/>
+            </w:tcMar>
+            <w:vAlign w:val="center"/>
+          </w:tcPr>
+          <w:p>
+            <w:pPr>
+              <w:jc w:val="left"/>
+              <w:pBdr>
+                <w:bottom w:val="none" w:sz="0" w:space="0" w:color="000000"/>
+                <w:top w:val="none" w:sz="0" w:space="0" w:color="000000"/>
+                <w:left w:val="none" w:sz="0" w:space="0" w:color="000000"/>
+                <w:right w:val="none" w:sz="0" w:space="0" w:color="000000"/>
+              </w:pBdr>
+              <w:spacing w:after="100" w:before="100" w:line="240"/>
+              <w:ind w:left="100" w:right="100" w:firstLine="0" w:firstLineChars="0"/>
+              <w:rPr>
+                <w:rFonts w:ascii="Arial" w:hAnsi="Arial" w:eastAsia="Arial" w:cs="Arial"/>
+                <w:i w:val="false"/>
+                <w:b w:val="true"/>
+                <w:u w:val="none"/>
+                <w:strike w:val="false"/>
+                <w:sz w:val="22"/>
+                <w:szCs w:val="22"/>
+                <w:color w:val="000000"/>
+              </w:rPr>
+            </w:pPr>
+            <w:r xmlns:w="http://schemas.openxmlformats.org/wordprocessingml/2006/main" xmlns:wp="http://schemas.openxmlformats.org/drawingml/2006/wordprocessingDrawing" xmlns:r="http://schemas.openxmlformats.org/officeDocument/2006/relationships" xmlns:w14="http://schemas.microsoft.com/office/word/2010/wordml">
+              <w:rPr>
+                <w:rFonts w:ascii="Arial" w:hAnsi="Arial" w:eastAsia="Arial" w:cs="Arial"/>
+                <w:i w:val="false"/>
+                <w:b w:val="true"/>
+                <w:u w:val="none"/>
+                <w:strike w:val="false"/>
+                <w:sz w:val="22"/>
+                <w:szCs w:val="22"/>
+                <w:color w:val="000000"/>
+              </w:rPr>
+              <w:t xml:space="preserve">region_top</w:t>
+            </w:r>
+          </w:p>
+        </w:tc>
+      </w:tr>
+      <w:tr>
+        <w:trPr>
+          <w:trHeight w:val="574" w:hRule="auto"/>
+        </w:trPr>
+        <w:tc>
+          <w:tcPr>
+            <w:tcBorders>
+              <w:bottom w:val="single" w:sz="12" w:space="0" w:color="666666"/>
+              <w:top w:val="single" w:sz="12" w:space="0" w:color="666666"/>
+              <w:left w:val="none" w:sz="0" w:space="0" w:color="000000"/>
+              <w:right w:val="none" w:sz="0" w:space="0" w:color="000000"/>
+            </w:tcBorders>
+            <w:shd w:val="clear" w:color="auto" w:fill="FFFFFF"/>
+            <w:tcMar>
+              <w:top w:w="0" w:type="dxa"/>
+              <w:bottom w:w="0" w:type="dxa"/>
+              <w:left w:w="0" w:type="dxa"/>
+              <w:right w:w="0" w:type="dxa"/>
+            </w:tcMar>
+            <w:vAlign w:val="center"/>
+          </w:tcPr>
+          <w:p>
+            <w:pPr>
+              <w:jc w:val="left"/>
+              <w:pBdr>
+                <w:bottom w:val="none" w:sz="0" w:space="0" w:color="000000"/>
+                <w:top w:val="none" w:sz="0" w:space="0" w:color="000000"/>
+                <w:left w:val="none" w:sz="0" w:space="0" w:color="000000"/>
+                <w:right w:val="none" w:sz="0" w:space="0" w:color="000000"/>
+              </w:pBdr>
+              <w:spacing w:after="100" w:before="100" w:line="240"/>
+              <w:ind w:left="100" w:right="100" w:firstLine="0" w:firstLineChars="0"/>
+              <w:rPr>
+                <w:rFonts w:ascii="Arial" w:hAnsi="Arial" w:eastAsia="Arial" w:cs="Arial"/>
+                <w:i w:val="false"/>
+                <w:b w:val="false"/>
+                <w:u w:val="none"/>
+                <w:strike w:val="false"/>
+                <w:sz w:val="22"/>
+                <w:szCs w:val="22"/>
+                <w:color w:val="000000"/>
+              </w:rPr>
+            </w:pPr>
+            <w:r xmlns:w="http://schemas.openxmlformats.org/wordprocessingml/2006/main" xmlns:wp="http://schemas.openxmlformats.org/drawingml/2006/wordprocessingDrawing" xmlns:r="http://schemas.openxmlformats.org/officeDocument/2006/relationships" xmlns:w14="http://schemas.microsoft.com/office/word/2010/wordml">
+              <w:rPr>
+                <w:rFonts w:ascii="Arial" w:hAnsi="Arial" w:eastAsia="Arial" w:cs="Arial"/>
+                <w:i w:val="false"/>
+                <w:b w:val="false"/>
+                <w:u w:val="none"/>
+                <w:strike w:val="false"/>
+                <w:sz w:val="22"/>
+                <w:szCs w:val="22"/>
+                <w:color w:val="000000"/>
+              </w:rPr>
+              <w:t xml:space="preserve">Electronics</w:t>
+            </w:r>
+          </w:p>
+        </w:tc>
+        <w:tc>
+          <w:tcPr>
+            <w:tcBorders>
+              <w:bottom w:val="single" w:sz="12" w:space="0" w:color="666666"/>
+              <w:top w:val="single" w:sz="12" w:space="0" w:color="666666"/>
+              <w:left w:val="none" w:sz="0" w:space="0" w:color="000000"/>
+              <w:right w:val="none" w:sz="0" w:space="0" w:color="000000"/>
+            </w:tcBorders>
+            <w:shd w:val="clear" w:color="auto" w:fill="FFFFFF"/>
+            <w:tcMar>
+              <w:top w:w="0" w:type="dxa"/>
+              <w:bottom w:w="0" w:type="dxa"/>
+              <w:left w:w="0" w:type="dxa"/>
+              <w:right w:w="0" w:type="dxa"/>
+            </w:tcMar>
+            <w:vAlign w:val="center"/>
+          </w:tcPr>
+          <w:p>
+            <w:pPr>
+              <w:jc w:val="left"/>
+              <w:pBdr>
+                <w:bottom w:val="none" w:sz="0" w:space="0" w:color="000000"/>
+                <w:top w:val="none" w:sz="0" w:space="0" w:color="000000"/>
+                <w:left w:val="none" w:sz="0" w:space="0" w:color="000000"/>
+                <w:right w:val="none" w:sz="0" w:space="0" w:color="000000"/>
+              </w:pBdr>
+              <w:spacing w:after="100" w:before="100" w:line="240"/>
+              <w:ind w:left="100" w:right="100" w:firstLine="0" w:firstLineChars="0"/>
+              <w:rPr>
+                <w:rFonts w:ascii="Arial" w:hAnsi="Arial" w:eastAsia="Arial" w:cs="Arial"/>
+                <w:i w:val="false"/>
+                <w:b w:val="false"/>
+                <w:u w:val="none"/>
+                <w:strike w:val="false"/>
+                <w:sz w:val="22"/>
+                <w:szCs w:val="22"/>
+                <w:color w:val="000000"/>
+              </w:rPr>
+            </w:pPr>
+            <w:r xmlns:w="http://schemas.openxmlformats.org/wordprocessingml/2006/main" xmlns:wp="http://schemas.openxmlformats.org/drawingml/2006/wordprocessingDrawing" xmlns:r="http://schemas.openxmlformats.org/officeDocument/2006/relationships" xmlns:w14="http://schemas.microsoft.com/office/word/2010/wordml">
+              <w:rPr>
+                <w:rFonts w:ascii="Arial" w:hAnsi="Arial" w:eastAsia="Arial" w:cs="Arial"/>
+                <w:i w:val="false"/>
+                <w:b w:val="false"/>
+                <w:u w:val="none"/>
+                <w:strike w:val="false"/>
+                <w:sz w:val="22"/>
+                <w:szCs w:val="22"/>
+                <w:color w:val="000000"/>
+              </w:rPr>
+              <w:t xml:space="preserve">Consumer</w:t>
+            </w:r>
+          </w:p>
+        </w:tc>
+        <w:tc>
+          <w:tcPr>
+            <w:tcBorders>
+              <w:bottom w:val="single" w:sz="12" w:space="0" w:color="666666"/>
+              <w:top w:val="single" w:sz="12" w:space="0" w:color="666666"/>
+              <w:left w:val="none" w:sz="0" w:space="0" w:color="000000"/>
+              <w:right w:val="none" w:sz="0" w:space="0" w:color="000000"/>
+            </w:tcBorders>
+            <w:shd w:val="clear" w:color="auto" w:fill="FFFFFF"/>
+            <w:tcMar>
+              <w:top w:w="0" w:type="dxa"/>
+              <w:bottom w:w="0" w:type="dxa"/>
+              <w:left w:w="0" w:type="dxa"/>
+              <w:right w:w="0" w:type="dxa"/>
+            </w:tcMar>
+            <w:vAlign w:val="center"/>
+          </w:tcPr>
+          <w:p>
+            <w:pPr>
+              <w:jc w:val="left"/>
+              <w:pBdr>
+                <w:bottom w:val="none" w:sz="0" w:space="0" w:color="000000"/>
+                <w:top w:val="none" w:sz="0" w:space="0" w:color="000000"/>
+                <w:left w:val="none" w:sz="0" w:space="0" w:color="000000"/>
+                <w:right w:val="none" w:sz="0" w:space="0" w:color="000000"/>
+              </w:pBdr>
+              <w:spacing w:after="100" w:before="100" w:line="240"/>
+              <w:ind w:left="100" w:right="100" w:firstLine="0" w:firstLineChars="0"/>
+              <w:rPr>
+                <w:rFonts w:ascii="Arial" w:hAnsi="Arial" w:eastAsia="Arial" w:cs="Arial"/>
+                <w:i w:val="false"/>
+                <w:b w:val="false"/>
+                <w:u w:val="none"/>
+                <w:strike w:val="false"/>
+                <w:sz w:val="22"/>
+                <w:szCs w:val="22"/>
+                <w:color w:val="000000"/>
+              </w:rPr>
+            </w:pPr>
+            <w:r xmlns:w="http://schemas.openxmlformats.org/wordprocessingml/2006/main" xmlns:wp="http://schemas.openxmlformats.org/drawingml/2006/wordprocessingDrawing" xmlns:r="http://schemas.openxmlformats.org/officeDocument/2006/relationships" xmlns:w14="http://schemas.microsoft.com/office/word/2010/wordml">
+              <w:rPr>
+                <w:rFonts w:ascii="Arial" w:hAnsi="Arial" w:eastAsia="Arial" w:cs="Arial"/>
+                <w:i w:val="false"/>
+                <w:b w:val="false"/>
+                <w:u w:val="none"/>
+                <w:strike w:val="false"/>
+                <w:sz w:val="22"/>
+                <w:szCs w:val="22"/>
+                <w:color w:val="000000"/>
+              </w:rPr>
+              <w:t xml:space="preserve">North</w:t>
+            </w:r>
+          </w:p>
+        </w:tc>
+      </w:tr>
+    </w:tbl>
+    <w:bookmarkEnd w:id="21"/>
+    <w:bookmarkStart w:id="23" w:name="Xb485c79db7f185b20b5fe7b01df2e954d00ea7e"/>
+    <w:p>
+      <w:pPr>
+        <w:pStyle w:val="Heading1"/>
+      </w:pPr>
+      <w:r>
+        <w:t xml:space="preserve">Vilka resultat som verkar mest användbara</w:t>
+      </w:r>
+    </w:p>
+    <w:bookmarkStart w:id="22" w:name="sammanfattning"/>
+    <w:p>
+      <w:pPr>
+        <w:pStyle w:val="Heading2"/>
+      </w:pPr>
+      <w:r>
+        <w:t xml:space="preserve">Sammanfattning</w:t>
+      </w:r>
+    </w:p>
+    <w:p>
+      <w:pPr>
+        <w:pStyle w:val="FirstParagraph"/>
+      </w:pPr>
+      <w:r>
+        <w:t xml:space="preserve">Vi har beräknat statistiska sammanfattningar för att jämföra försäljning.</w:t>
+      </w:r>
+      <w:r>
+        <w:t xml:space="preserve"> </w:t>
+      </w:r>
+      <w:r>
+        <w:t xml:space="preserve">- mellan produktkategorier, kundsegment och regioner.</w:t>
+      </w:r>
+      <w:r>
+        <w:t xml:space="preserve"> </w:t>
+      </w:r>
+      <w:r>
+        <w:t xml:space="preserve">- Electronics och Consumer står för den största delen av försäljningen.</w:t>
+      </w:r>
+      <w:r>
+        <w:t xml:space="preserve"> </w:t>
+      </w:r>
+      <w:r>
+        <w:t xml:space="preserve">- Small Business spenderar mest per köp.</w:t>
+      </w:r>
+      <w:r>
+        <w:t xml:space="preserve"> </w:t>
+      </w:r>
+      <w:r>
+        <w:t xml:space="preserve">- North är den starkaste regionen, medan South säljer minst.</w:t>
+      </w:r>
+    </w:p>
+    <w:bookmarkEnd w:id="22"/>
+    <w:bookmarkEnd w:id="23"/>
+    <w:bookmarkStart w:id="24" w:name="X178458c35c85ca60ab42bd5b4f304416bae9e5c"/>
+    <w:p>
+      <w:pPr>
+        <w:pStyle w:val="Heading1"/>
+      </w:pPr>
+      <w:r>
+        <w:t xml:space="preserve">Vilka begränsningar som finns i datan eller analysen</w:t>
+      </w:r>
+    </w:p>
+    <w:bookmarkEnd w:id="24"/>
     <w:sectPr>
       <w:footnotePr>
         <w:numRestart w:val="eachSect"/>

</xml_diff>